<commit_message>
Rewrite business plan in natural college-student voice
Replaced corporate-report tone with authentic, conversational academic
writing throughout both HTML and DOCX versions. Content depth and
research quality preserved while sounding like a sharp student who
genuinely researched the topic.

Co-Authored-By: Claude Sonnet 4.6 <noreply@anthropic.com>
Claude-Session: https://claude.ai/code/session_01W8zt99ZeTwqXi4zM9Nmp2S
</commit_message>
<xml_diff>
--- a/International_Sport_Business_Plan.docx
+++ b/International_Sport_Business_Plan.docx
@@ -413,7 +413,7 @@
           <w:color w:val="333333"/>
           <w:sz w:val="24"/>
         </w:rPr>
-        <w:t>India represents one of the most compelling emerging markets for basketball development in the world. With a population exceeding 1.44 billion people, India is the world's most populous nation, and its demographic profile is exceptionally youth-oriented: approximately 65% of the population is under 35 years of age, and the median age stands at 28.4 years (United Nations, 2024). This positions India as a market with an enormous base of potential young athletes. The Indian sports industry is valued at approximately $2.7 billion and is projected to reach $10 billion by 2030, driven by rising disposable incomes, urbanization, and increased government investment in sports infrastructure (KPMG, 2023). Basketball specifically has seen rapid growth, with the NBA estimating over 300 million basketball fans in India as of 2024, making it the league's second-largest market outside the United States.</w:t>
+        <w:t>When looking at untapped basketball markets around the world, India stands out immediately. The country has over 1.44 billion people, making it the most populous nation on Earth, and the demographics skew incredibly young—roughly 65% of Indians are under the age of 35, with the median age sitting at just 28.4 years (United Nations, 2024). That is a massive pool of potential young athletes. On top of that, the Indian sports industry is currently valued at around $2.7 billion and is on track to hit $10 billion by 2030 thanks to rising incomes, urbanization, and a serious push from the government to invest in sports infrastructure (KPMG, 2023). What really caught our attention is the basketball-specific data: the NBA estimates that there are already over 300 million basketball fans in India, which makes it the NBA’s second-largest fan base outside of the United States. The demand is clearly there; the infrastructure just has not caught up yet.</w:t>
       </w:r>
     </w:p>
     <w:p>
@@ -444,7 +444,7 @@
           <w:color w:val="333333"/>
           <w:sz w:val="24"/>
         </w:rPr>
-        <w:t>Indian consumers, particularly in the 15-30 age bracket, are increasingly health-conscious and drawn to fitness-oriented lifestyles. The rapid proliferation of affordable smartphones and low-cost mobile data (averaging $0.17 per GB, among the cheapest globally) has created a digitally connected generation that consumes sports content voraciously through platforms like YouTube, Instagram, and streaming services (Deloitte, 2024). Parents in India's growing middle class, now estimated at over 400 million people, are investing more in extracurricular activities for their children, viewing sports as a pathway to holistic development and potential scholarship opportunities. The rise of the Indian Premier League (IPL) has demonstrated that Indian consumers are willing to embrace and passionately support well-marketed sporting ventures, setting a precedent for other sports to follow.</w:t>
+        <w:t>Young Indian consumers, especially those in the 15–30 range, are more health-conscious than any previous generation. Gym memberships, fitness apps, and sports participation are all trending upward. A huge driver of this is India’s digital connectivity—mobile data costs an average of just $0.17 per GB, which is among the cheapest in the world, and smartphone penetration is through the roof (Deloitte, 2024). This means young Indians are consuming NBA highlights on YouTube, following basketball content on Instagram, and engaging with sports brands online at rates that would have been unthinkable ten years ago. Meanwhile, India’s middle class has grown to over 400 million people, and parents in this segment are increasingly willing to invest in extracurricular activities for their kids. They see sports not just as a hobby but as a real pathway to scholarships and personal development. The success of the Indian Premier League in cricket proved that Indian consumers will passionately support a well-marketed sporting product, and that blueprint can absolutely be applied to basketball.</w:t>
       </w:r>
     </w:p>
     <w:p>
@@ -475,7 +475,7 @@
           <w:color w:val="333333"/>
           <w:sz w:val="24"/>
         </w:rPr>
-        <w:t>The opportunities for entering India's basketball market are substantial. The Indian government's Khelo India initiative has allocated over $350 million toward sports development, including basketball infrastructure. The NBA's establishment of the NBA Academy India in 2017 and the launch of the Basketball Africa League model provide proof of concept for structured basketball development programs. India's rapid urbanization, with 35% of the population now living in cities, creates concentrated demand centers. However, challenges exist: cricket's cultural dominance means basketball must compete for attention and participation; infrastructure gaps persist, with limited access to quality indoor courts; and price sensitivity remains a factor, as training programs must be accessible across income levels. Additionally, navigating India's diverse regulatory landscape across 28 states and 8 union territories requires localized strategies.</w:t>
+        <w:t>There are several strong tailwinds for entering this market right now. The Indian government’s Khelo India initiative has poured over $350 million into sports development, including basketball-specific infrastructure. The NBA already established its Academy India program back in 2017, which validates that there is international confidence in this market. With 35% of India’s population now living in cities, there are natural demand centers where a basketball academy can thrive. That said, we have to be realistic about the challenges. Cricket is king in India, and any sport entering that market is competing for attention and participation against a deeply entrenched cultural institution. Quality indoor basketball courts are hard to find outside major cities, and price sensitivity is real—training programs need to be priced in a way that middle-class families can actually afford. Finally, India’s regulatory environment varies significantly across its 28 states and 8 union territories, so a one-size-fits-all approach will not work.</w:t>
       </w:r>
     </w:p>
     <w:p>
@@ -511,7 +511,7 @@
           <w:color w:val="333333"/>
           <w:sz w:val="24"/>
         </w:rPr>
-        <w:t>HoopRise Basketball Academy is a hybrid basketball training and development enterprise that combines world-class physical training facilities with an integrated digital platform to deliver comprehensive basketball education to Indian youth. The academy will establish premium training centers in three of India's largest metropolitan areas—Mumbai, Delhi NCR, and Bangalore—while simultaneously launching a mobile application that extends training access to aspiring basketball players across the entire nation.</w:t>
+        <w:t>HoopRise Basketball Academy is a hybrid basketball training and development company that pairs high-quality physical training facilities with a digital platform to bring structured basketball education to young players across India. The plan is to open premium training centers in three major metro areas—Mumbai, Delhi NCR, and Bangalore—while also launching a mobile app that makes our training content accessible to players anywhere in the country, even if they are nowhere near one of our physical locations.</w:t>
       </w:r>
     </w:p>
     <w:p>
@@ -527,7 +527,7 @@
           <w:color w:val="333333"/>
           <w:sz w:val="24"/>
         </w:rPr>
-        <w:t>The physical academies will feature regulation-size indoor courts, strength and conditioning facilities, sports science labs with motion capture technology, and classrooms for tactical instruction. Each location will be staffed by certified coaches with international playing or coaching experience, supplemented by local assistant coaches who understand regional dynamics. Training programs will be structured into tiered levels—Beginner, Intermediate, Advanced, and Elite—accommodating players from ages 8 to 22.</w:t>
+        <w:t>Each physical academy will have regulation-size indoor courts, a strength and conditioning area, a sports science lab with motion capture technology, and classrooms for film study and tactical sessions. We plan to staff each location with certified coaches who have international playing or coaching experience, along with local assistant coaches who understand the regional dynamics and can connect with players on a personal level. Training will be split into four tiers—Beginner, Intermediate, Advanced, and Elite—so we can serve everyone from an 8-year-old picking up a basketball for the first time to a 22-year-old trying to break into professional play.</w:t>
       </w:r>
     </w:p>
     <w:p>
@@ -543,7 +543,7 @@
           <w:color w:val="333333"/>
           <w:sz w:val="24"/>
         </w:rPr>
-        <w:t>The HoopRise digital platform will serve as both a training companion and a standalone product. It will feature AI-driven skill assessment tools, video-based drill libraries with demonstrations in multiple Indian languages, performance tracking dashboards, and virtual coaching sessions. This hybrid model addresses a critical gap in the Indian market: while interest in basketball is surging, structured and accessible training programs remain scarce, particularly outside major cities. HoopRise bridges this divide by making high-quality basketball development available to any young Indian with a smartphone, while offering an immersive in-person experience for those in proximity to academy locations.</w:t>
+        <w:t>The digital side of HoopRise is just as important. The app will feature AI-powered skill assessments, a video drill library with demonstrations in multiple Indian languages, performance tracking dashboards, and virtual coaching sessions. This is where the business really scales, because the biggest gap in India’s basketball landscape right now is not a lack of interest—it is a lack of structured, quality training that is actually accessible to most people. If you live in a Tier 2 or Tier 3 city, your options for basketball coaching are extremely limited. HoopRise solves that problem by putting world-class training content in the hands of any kid with a smartphone, while still offering the full in-person experience for those near our academy locations.</w:t>
       </w:r>
     </w:p>
     <w:p>
@@ -579,7 +579,7 @@
           <w:color w:val="333333"/>
           <w:sz w:val="24"/>
         </w:rPr>
-        <w:t>HoopRise Basketball Academy exists to democratize basketball excellence across India by providing world-class training infrastructure, expert coaching, and innovative digital tools that develop the next generation of Indian basketball talent. Our mission is to nurture athletic skill, physical fitness, teamwork, and personal character in every young player who enters our program, regardless of socioeconomic background or geographic location. We are committed to making basketball a mainstream pathway for youth development in India by combining global best practices with deep cultural understanding, creating an ecosystem where Indian basketball talent can be identified, cultivated, and elevated to compete on the world stage.</w:t>
+        <w:t>HoopRise Basketball Academy exists to make high-level basketball development accessible to young athletes across India, regardless of where they live or what their family’s income looks like. Our mission is to build a training ecosystem that combines expert coaching, quality facilities, and smart technology to develop the next wave of Indian basketball talent. Beyond the sport itself, we want every player who comes through our program to walk away with stronger discipline, better teamwork skills, and a real sense of confidence—qualities that carry over into every part of life.</w:t>
       </w:r>
     </w:p>
     <w:p>
@@ -595,7 +595,7 @@
           <w:color w:val="333333"/>
           <w:sz w:val="24"/>
         </w:rPr>
-        <w:t>Our core objectives are threefold: (1) to establish India's most recognized and respected basketball training brand within five years; (2) to develop a pipeline of players capable of competing in international leagues, collegiate programs, and national teams; and (3) to reach one million aspiring basketball players through our digital platform within three years of launch. We will achieve these objectives through relentless investment in coaching quality, technology-enabled training methodologies, and strategic partnerships that amplify our reach and credibility.</w:t>
+        <w:t>We have three specific goals driving everything we do. First, we want to build the most recognized and trusted basketball training brand in India within five years. Second, we want to develop a legitimate pipeline of players who can compete at the collegiate, national, and international level. Third, we want to reach one million users on our digital platform within three years of launch. These are ambitious targets, but we believe they are achievable through a combination of relentless focus on coaching quality, smart use of technology, and strategic partnerships that give us credibility and reach from day one.</w:t>
       </w:r>
     </w:p>
     <w:p>
@@ -641,7 +641,7 @@
           <w:color w:val="333333"/>
           <w:sz w:val="24"/>
         </w:rPr>
-        <w:t>HoopRise's primary target demographic consists of youth aged 8 to 22 from middle-class and upper-middle-class families in urban and semi-urban India. This segment is characterized by household incomes of $10,000 to $50,000 annually, parents who prioritize education and extracurricular development, and young people who are digitally native and influenced by global sports culture. Secondary targets include collegiate athletes seeking advanced training, corporate clients interested in team-building basketball programs, and recreational adult players in the 23-35 age range who participate in weekend leagues and fitness activities.</w:t>
+        <w:t>Our primary target is youth aged 8 to 22 from middle-class and upper-middle-class families in urban India. We are talking about households with annual incomes between $10,000 and $50,000—families where parents prioritize education and are increasingly open to investing in structured extracurricular programs. The kids in this demographic are digitally native, heavily influenced by global sports culture, and many of them are already watching NBA content online. Our secondary targets include college athletes looking for advanced training, corporate clients who want basketball-based team-building programs, and recreational adult players aged 23–35 who play in weekend leagues or just want to stay active.</w:t>
       </w:r>
     </w:p>
     <w:p>
@@ -657,7 +657,7 @@
           <w:color w:val="333333"/>
           <w:sz w:val="24"/>
         </w:rPr>
-        <w:t>The target demographic encompasses roughly 120 million youth across India's top 20 cities, with our initial focus on the combined metropolitan populations of Mumbai (21 million), Delhi NCR (32 million), and Bangalore (13 million). These cities were selected based on their high concentration of middle-class families, existing basketball interest, availability of commercial real estate suitable for academy facilities, and strong digital infrastructure. The lifestyle profile of our target consumer includes active engagement with social media, consumption of international sports content (particularly the NBA), participation in fitness trends, and openness to adopting new sporting activities as alternatives or complements to cricket.</w:t>
+        <w:t>Across India’s top 20 cities, there are roughly 120 million young people who fit this profile. We are starting with Mumbai (21 million metro population), Delhi NCR (32 million), and Bangalore (13 million) because these cities have the highest concentration of middle-class families, existing basketball interest, suitable commercial real estate, and strong digital infrastructure. The lifestyle of our target customer involves heavy social media use, regular consumption of NBA and international sports content, interest in fitness trends, and a growing openness to sports beyond cricket.</w:t>
       </w:r>
     </w:p>
     <w:p>
@@ -803,7 +803,7 @@
                 <w:color w:val="333333"/>
                 <w:sz w:val="18"/>
               </w:rPr>
-              <w:t>Global brand recognition; elite-level coaching; NBA pipeline</w:t>
+              <w:t>Incredible brand recognition; world-class coaching; direct pathway to the NBA</w:t>
             </w:r>
           </w:p>
         </w:tc>
@@ -819,7 +819,7 @@
                 <w:color w:val="333333"/>
                 <w:sz w:val="18"/>
               </w:rPr>
-              <w:t>Extremely selective (only top 24 players); single location; no mass-market access</w:t>
+              <w:t>Only takes about 24 players total; one location; not designed for the average player</w:t>
             </w:r>
           </w:p>
         </w:tc>
@@ -873,7 +873,7 @@
                 <w:color w:val="333333"/>
                 <w:sz w:val="18"/>
               </w:rPr>
-              <w:t>Established presence; affordable pricing; grassroots focus</w:t>
+              <w:t>Has an established local presence; affordable pricing; focuses on grassroots</w:t>
             </w:r>
           </w:p>
         </w:tc>
@@ -890,7 +890,7 @@
                 <w:color w:val="333333"/>
                 <w:sz w:val="18"/>
               </w:rPr>
-              <w:t>Limited facilities; no digital platform; inconsistent coaching quality</w:t>
+              <w:t>Facilities are limited; no digital component; coaching quality varies a lot</w:t>
             </w:r>
           </w:p>
         </w:tc>
@@ -943,7 +943,7 @@
                 <w:color w:val="333333"/>
                 <w:sz w:val="18"/>
               </w:rPr>
-              <w:t>Free or very low cost; government support; wide geographic spread</w:t>
+              <w:t>Free or almost free; backed by government; available in many cities</w:t>
             </w:r>
           </w:p>
         </w:tc>
@@ -959,7 +959,7 @@
                 <w:color w:val="333333"/>
                 <w:sz w:val="18"/>
               </w:rPr>
-              <w:t>Poor infrastructure; untrained coaches; no structured curriculum</w:t>
+              <w:t>Run-down facilities; coaches often have no formal training; no real curriculum</w:t>
             </w:r>
           </w:p>
         </w:tc>
@@ -994,9 +994,9 @@
                 <w:color w:val="333333"/>
                 <w:sz w:val="18"/>
               </w:rPr>
-              <w:t>International Online</w:t>
+              <w:t>International Apps</w:t>
               <w:br/>
-              <w:t>Platforms (HomeCourt)</w:t>
+              <w:t>(HomeCourt, etc.)</w:t>
             </w:r>
           </w:p>
         </w:tc>
@@ -1013,7 +1013,7 @@
                 <w:color w:val="333333"/>
                 <w:sz w:val="18"/>
               </w:rPr>
-              <w:t>Advanced technology; AI-driven analysis; global user base</w:t>
+              <w:t>Cutting-edge tech; AI-driven feedback; large global user base</w:t>
             </w:r>
           </w:p>
         </w:tc>
@@ -1030,7 +1030,7 @@
                 <w:color w:val="333333"/>
                 <w:sz w:val="18"/>
               </w:rPr>
-              <w:t>No local presence; English-only; not tailored to Indian context</w:t>
+              <w:t>No physical presence in India; English-only; not built for the Indian context</w:t>
             </w:r>
           </w:p>
         </w:tc>
@@ -1095,7 +1095,7 @@
           <w:color w:val="333333"/>
           <w:sz w:val="24"/>
         </w:rPr>
-        <w:t>HoopRise differentiates itself through its unique hybrid model that no current competitor in the Indian market offers. While the NBA Academy India serves only an elite few, and local programs lack quality and structure, HoopRise occupies the strategic middle ground—premium yet accessible. Our key differentiators include:</w:t>
+        <w:t>The key thing that sets HoopRise apart is our hybrid model, which nobody else in the Indian market is doing right now. The NBA Academy is elite but inaccessible. Local programs are accessible but low quality. International apps have great tech but zero local relevance. We sit right in the sweet spot—premium quality that is still accessible to a wide audience. Here is what specifically sets us apart:</w:t>
       </w:r>
     </w:p>
     <w:p>
@@ -1110,7 +1110,7 @@
           <w:color w:val="333333"/>
           <w:sz w:val="24"/>
         </w:rPr>
-        <w:t>Hybrid Physical-Digital Model: In-person training complemented by a comprehensive mobile app, ensuring continuity and accessibility beyond academy walls.</w:t>
+        <w:t>Hybrid Physical-Digital Model: Players get in-person training at our academies plus a full mobile app experience, so their development does not stop when they leave the court.</w:t>
       </w:r>
     </w:p>
     <w:p>
@@ -1125,7 +1125,7 @@
           <w:color w:val="333333"/>
           <w:sz w:val="24"/>
         </w:rPr>
-        <w:t>Data-Driven Development: AI-powered performance tracking that provides personalized training plans based on each player's strengths, weaknesses, and progress trajectory.</w:t>
+        <w:t>Data-Driven Development: Our AI-powered performance tracking creates personalized training plans based on each player’s actual strengths and weaknesses, not a generic one-size-fits-all program.</w:t>
       </w:r>
     </w:p>
     <w:p>
@@ -1140,7 +1140,7 @@
           <w:color w:val="333333"/>
           <w:sz w:val="24"/>
         </w:rPr>
-        <w:t>Tiered Pricing Structure: Scholarship programs and subsidized digital access ensure that economic barriers do not prevent talented players from accessing quality training.</w:t>
+        <w:t>Tiered Pricing: We are building in scholarship programs and subsidized digital access from the start. Talent should not be gated by income.</w:t>
       </w:r>
     </w:p>
     <w:p>
@@ -1155,7 +1155,7 @@
           <w:color w:val="333333"/>
           <w:sz w:val="24"/>
         </w:rPr>
-        <w:t>Multilingual Platform: Training content available in Hindi, English, Tamil, Kannada, and Marathi, reflecting the linguistic diversity of our target cities.</w:t>
+        <w:t>Multilingual Platform: All training content will be available in Hindi, English, Tamil, Kannada, and Marathi at launch, because a kid in Bangalore should not have to train in a language they are not comfortable in.</w:t>
       </w:r>
     </w:p>
     <w:p>
@@ -1170,7 +1170,7 @@
           <w:color w:val="333333"/>
           <w:sz w:val="24"/>
         </w:rPr>
-        <w:t>Pathway to Professional Play: Structured relationships with international collegiate programs and professional leagues that offer players a visible pathway to competitive basketball careers.</w:t>
+        <w:t>Clear Pathway to Professional Play: We are establishing direct relationships with international college programs and professional leagues so that players can see a real future in basketball, not just a hobby.</w:t>
       </w:r>
     </w:p>
     <w:p>
@@ -1221,7 +1221,7 @@
           <w:color w:val="333333"/>
           <w:sz w:val="24"/>
         </w:rPr>
-        <w:t>In Indian culture, decisions regarding children's extracurricular activities are predominantly made by parents, and often influenced by extended family. HoopRise's marketing and enrollment strategies will directly address parental concerns by emphasizing the academic and character-building benefits of basketball participation. All promotional materials will include messaging about discipline, time management, and teamwork—qualities that resonate with Indian parents. Open-house events, parent orientation sessions, and quarterly progress reports will build trust and maintain family engagement. The enrollment process will be designed to involve parents as partners, not merely as bill-payers.</w:t>
+        <w:t>In India, parents and often even extended family are the decision makers when it comes to a child’s extracurricular activities. You cannot just market to the kid; you have to win over the family. That is why our marketing and enrollment strategies will speak directly to parental priorities. Every piece of promotional content will emphasize the character-building side of basketball—discipline, time management, teamwork, leadership—because those are the qualities that resonate with Indian parents. We will also hold regular open-house events, parent orientation sessions, and send out quarterly progress reports so families feel genuinely involved in their child’s development. The enrollment process will treat parents as partners in the journey, not just people writing checks.</w:t>
       </w:r>
     </w:p>
     <w:p>
@@ -1252,7 +1252,7 @@
           <w:color w:val="333333"/>
           <w:sz w:val="24"/>
         </w:rPr>
-        <w:t>India's deep cultural emphasis on academic achievement means that any sports program must position itself as complementary to education, not in competition with it. HoopRise will schedule training sessions around school hours and examination periods, offering flexible scheduling during board exam seasons (March-April and October-November). The academy will highlight success stories of basketball players who earned scholarships to international universities, directly linking athletic development to educational opportunity. A homework and study space within each academy facility will reinforce this message tangibly.</w:t>
+        <w:t>Academics come first in Indian culture, and any sports venture that ignores that reality is going to fail. We are not fighting that; we are working with it. All training sessions will be scheduled around school hours, and during board exam seasons (March–April and October–November), we will offer flexible and reduced schedules so students are not forced to choose between studying and training. A big part of our pitch to families will be the scholarship angle—we will highlight players who earned spots at international universities through basketball, showing parents that this is actually complementary to their child’s education, not competing with it. We even plan to have study spaces inside each academy facility so that kids can get homework done before or after practice.</w:t>
       </w:r>
     </w:p>
     <w:p>
@@ -1283,7 +1283,7 @@
           <w:color w:val="333333"/>
           <w:sz w:val="24"/>
         </w:rPr>
-        <w:t>India's linguistic landscape is extraordinarily diverse, with 22 officially recognized languages and hundreds of dialects. Coaching at each academy will be conducted bilingually—in English and the dominant regional language (Hindi in Delhi, Marathi in Mumbai, and Kannada in Bangalore). The digital platform will offer content in five languages at launch, with additional languages added based on user demand. Marketing campaigns will be localized not just linguistically but contextually, using region-specific sports analogies and cultural references to build resonance.</w:t>
+        <w:t>India has 22 officially recognized languages and hundreds of dialects, which means operating in English alone is not going to cut it. At each academy, coaching will be bilingual—English paired with the dominant local language (Hindi in Delhi, Marathi in Mumbai, Kannada in Bangalore). The app will launch with content in five languages, and we will add more based on what users are asking for. Our marketing will also be localized beyond just language; we will use region-specific cultural references and sports analogies that actually connect with people in each city rather than running the same generic national campaign everywhere.</w:t>
       </w:r>
     </w:p>
     <w:p>
@@ -1314,7 +1314,7 @@
           <w:color w:val="333333"/>
           <w:sz w:val="24"/>
         </w:rPr>
-        <w:t>India's multifaith society observes numerous religious festivals throughout the year, including Diwali, Eid, Christmas, Pongal, Holi, and Navratri. HoopRise will develop an annual calendar that respects these observances by adjusting schedules, hosting themed basketball events during festival seasons, and incorporating inclusive celebrations that bring together players from diverse backgrounds. This approach not only demonstrates cultural respect but also positions the academy as a unifying space where diversity is celebrated through sport.</w:t>
+        <w:t>India is one of the most religiously diverse countries in the world, and the calendar is packed with festivals—Diwali, Eid, Christmas, Pongal, Holi, Navratri, and many more. Rather than treating these as scheduling headaches, we plan to use them as opportunities. We will adjust schedules around major festivals, host themed basketball events during holiday seasons, and use celebrations as moments to bring together players from different backgrounds. The goal is to make the academy feel like a space where everyone belongs, and where diversity is something that gets celebrated, not just tolerated.</w:t>
       </w:r>
     </w:p>
     <w:p>
@@ -1345,7 +1345,7 @@
           <w:color w:val="333333"/>
           <w:sz w:val="24"/>
         </w:rPr>
-        <w:t>While urban India is progressively embracing women's participation in sports, cultural sensitivities remain, particularly regarding co-educational sports settings for adolescents. HoopRise will offer dedicated training sessions for girls and young women, staffed by female coaches, to encourage participation from families who may be hesitant about mixed-gender training environments. Promotional campaigns will prominently feature female basketball role models and highlight the empowerment benefits of athletic participation for young women, aligning with India's growing movement toward gender equity in sports.</w:t>
+        <w:t>Women’s sports participation in urban India is growing fast, but there are still cultural sensitivities, especially when it comes to mixed-gender athletic settings for teenagers. We are going to address this head-on by offering dedicated girls-only training sessions led by female coaches. This makes it much easier for more conservative families to feel comfortable enrolling their daughters. Our marketing will also prominently feature female basketball role models and lean into the empowerment narrative, because honestly, the growth potential on the women’s side is enormous, and we do not want to leave half the market on the table just because we did not think about these dynamics early enough.</w:t>
       </w:r>
     </w:p>
     <w:p>
@@ -1381,7 +1381,7 @@
           <w:color w:val="333333"/>
           <w:sz w:val="24"/>
         </w:rPr>
-        <w:t>HoopRise will pursue a diversified funding strategy to secure the estimated $900,000 required for initial launch and first-year operations. This multi-pronged approach reduces dependency on any single funding source and builds a resilient financial foundation.</w:t>
+        <w:t>We estimate that HoopRise needs approximately $900,000 to get through launch and the first year of operations. Rather than relying on one big investor or a single funding source, we are spreading the risk across multiple channels. Here is how we plan to raise the capital.</w:t>
       </w:r>
     </w:p>
     <w:p>
@@ -1412,7 +1412,7 @@
           <w:color w:val="333333"/>
           <w:sz w:val="24"/>
         </w:rPr>
-        <w:t>India's sports-tech investment landscape has grown significantly, with firms such as Dream Sports, Blume Ventures, and Sequoia India actively seeking sports-related ventures. HoopRise will target a seed funding round of $400,000 from angel investors with demonstrated interest in sports, education, or youth development. The pitch will emphasize the scalable hybrid model, India's demographic advantage, and the growing global interest in Indian basketball as key value propositions.</w:t>
+        <w:t>India’s sports-tech investment scene has been heating up, with firms like Dream Sports, Blume Ventures, and Sequoia India actively looking for sports-related plays. Our plan is to target a seed round of around $400,000 from angel investors who have a track record in sports, education, or youth development. The pitch is straightforward: India has the demographics, the digital infrastructure, and the growing demand, but nobody has built a scalable hybrid training model yet. HoopRise is that model.</w:t>
       </w:r>
     </w:p>
     <w:p>
@@ -1443,7 +1443,7 @@
           <w:color w:val="333333"/>
           <w:sz w:val="24"/>
         </w:rPr>
-        <w:t>The Indian government's Khelo India program and the Sports Authority of India (SAI) offer grants and subsidies to organizations that develop sports infrastructure and grassroots participation. HoopRise will apply for recognition as an accredited training center under these programs, potentially securing $100,000-$150,000 in grants and access to government sports facilities at subsidized rates. State-level sports departments in Maharashtra, Delhi, and Karnataka also offer complementary funding opportunities.</w:t>
+        <w:t>The Indian government’s Khelo India program and the Sports Authority of India (SAI) both offer grants and subsidies to organizations that develop sports infrastructure and increase grassroots participation. We plan to apply for accreditation as an official training center under these programs, which could bring in $100,000–$150,000 in direct grants and give us access to government sports facilities at subsidized rates. Each state—Maharashtra, Delhi, and Karnataka—has its own sports department with additional funding opportunities, so we will be applying at both the national and state levels.</w:t>
       </w:r>
     </w:p>
     <w:p>
@@ -1474,7 +1474,7 @@
           <w:color w:val="333333"/>
           <w:sz w:val="24"/>
         </w:rPr>
-        <w:t>India's Corporate Social Responsibility (CSR) mandate requires companies with net profits above a threshold to spend 2% on social initiatives. Sports development and youth empowerment qualify as CSR activities, opening avenues for sponsorship from major Indian corporations such as Tata Group, Reliance Industries, and Infosys. HoopRise will develop tiered sponsorship packages ranging from $25,000 to $200,000, offering brand visibility at academy facilities, on the digital platform, and at events.</w:t>
+        <w:t>Here is something a lot of people do not realize about India: companies with profits above a certain threshold are legally required to spend 2% of their net profits on Corporate Social Responsibility (CSR) initiatives. Sports development and youth empowerment both qualify, which opens the door to sponsorship from major Indian corporations like the Tata Group, Reliance Industries, and Infosys. We are going to build tiered sponsorship packages ranging from $25,000 to $200,000, offering brand visibility across our facilities, our app, and our events. It is a win-win—they need to spend the money anyway, and we can offer them meaningful brand exposure in a growing space.</w:t>
       </w:r>
     </w:p>
     <w:p>
@@ -1505,7 +1505,7 @@
           <w:color w:val="333333"/>
           <w:sz w:val="24"/>
         </w:rPr>
-        <w:t>A targeted crowdfunding campaign on platforms like Ketto (India's leading crowdfunding platform) and Kickstarter will aim to raise $50,000-$75,000 while simultaneously building brand awareness and community engagement. The campaign will highlight the social impact narrative of democratizing basketball access for Indian youth, offering rewards such as discounted academy memberships, branded merchandise, and exclusive content access.</w:t>
+        <w:t>To supplement the larger funding sources, we plan to run a crowdfunding campaign on Ketto (India’s biggest crowdfunding platform) and Kickstarter with a target of $50,000–$75,000. Beyond the money, this is really about building a community from day one. The campaign will lean into the social impact story—democratizing basketball access for kids who would never otherwise get quality coaching—and backers will get rewards like discounted memberships, exclusive merchandise, and early access to the app.</w:t>
       </w:r>
     </w:p>
     <w:p>
@@ -1556,7 +1556,7 @@
           <w:color w:val="333333"/>
           <w:sz w:val="24"/>
         </w:rPr>
-        <w:t>Given India's massive digital population of over 800 million internet users, digital marketing will serve as the primary promotional channel. HoopRise will execute targeted campaigns across Instagram, YouTube, and Facebook, leveraging video content that showcases training methodologies, player transformations, and behind-the-scenes academy life. YouTube pre-roll advertisements during NBA content will directly reach the target audience. Search engine optimization (SEO) and Google Ads campaigns targeting keywords such as "basketball training India," "basketball academy near me," and "learn basketball" will capture intent-driven traffic. A content marketing strategy will produce weekly blog posts and video tutorials that establish HoopRise as a thought leader in Indian basketball development.</w:t>
+        <w:t>With over 800 million internet users in India, digital is obviously the primary channel. We will run targeted ad campaigns on Instagram, YouTube, and Facebook built around video content—training highlights, player transformation stories, and behind-the-scenes looks at academy life. YouTube pre-roll ads placed before NBA content is a no-brainer since that is exactly where our target audience already is. On the search side, we will invest in SEO and Google Ads targeting high-intent keywords like “basketball training India,” “basketball academy near me,” and “learn basketball.” We will also publish weekly blog posts and video tutorials to build organic traffic and position HoopRise as the go-to authority on basketball development in India.</w:t>
       </w:r>
     </w:p>
     <w:p>
@@ -1587,7 +1587,7 @@
           <w:color w:val="333333"/>
           <w:sz w:val="24"/>
         </w:rPr>
-        <w:t>HoopRise will partner with Indian basketball personalities, fitness influencers, and youth-oriented content creators to amplify brand awareness. Key targets include Satnam Singh (first Indian drafted by an NBA team), Prachi Tehlan (former Indian national team captain), and popular fitness YouTubers with audiences that overlap with the target demographic. Micro-influencers in each target city will be engaged to drive localized awareness and enrollment. Ambassador partnerships will include content creation agreements, appearance fees for academy events, and social media collaboration campaigns.</w:t>
+        <w:t>We are going to partner with a mix of Indian basketball figures, fitness influencers, and youth-oriented content creators to get the word out. Top targets include Satnam Singh (the first Indian player ever drafted by an NBA team), Prachi Tehlan (former national team captain), and some of the bigger fitness YouTubers whose audiences overlap with our demographic. In each target city, we will also work with local micro-influencers who have real credibility in their communities. These partnerships will involve content creation, appearances at academy events, and social media collaborations—all designed to give us authentic visibility rather than feeling like generic advertising.</w:t>
       </w:r>
     </w:p>
     <w:p>
@@ -1618,7 +1618,7 @@
           <w:color w:val="333333"/>
           <w:sz w:val="24"/>
         </w:rPr>
-        <w:t>Direct partnerships with schools and universities in target cities will be a critical enrollment driver. HoopRise will offer free introductory basketball clinics at partner schools, donate equipment to schools that establish basketball programs, and sponsor inter-school basketball tournaments. University partnerships will focus on establishing HoopRise as the preferred training partner for collegiate basketball teams, offering subsidized group training packages and access to the digital platform for team performance analysis.</w:t>
+        <w:t>Getting into schools is one of our biggest enrollment drivers. We plan to partner with major school networks to offer free introductory basketball clinics, donate equipment to schools that start basketball programs, and sponsor inter-school tournaments. On the university side, we want to become the preferred training partner for college basketball teams by offering group training packages and giving teams access to our digital platform for performance analysis. This approach puts us in front of our exact target audience in an environment where they are already open to learning new things.</w:t>
       </w:r>
     </w:p>
     <w:p>
@@ -1649,7 +1649,7 @@
           <w:color w:val="333333"/>
           <w:sz w:val="24"/>
         </w:rPr>
-        <w:t>HoopRise will sponsor and organize community basketball events, including three-on-three street basketball tournaments, youth basketball camps during school holidays, and basketball viewing parties during major NBA events (NBA Finals, All-Star Weekend). These events will serve as experiential marketing touchpoints, allowing potential customers to interact with the brand, experience coaching quality firsthand, and engage with the HoopRise community. Annual events such as the "HoopRise Rising Stars Challenge" will generate media coverage and social media engagement, positioning the brand as central to India's basketball culture.</w:t>
+        <w:t>Nothing builds a brand like real-world experiences. We will organize three-on-three street tournaments, holiday basketball camps, and viewing parties during major NBA events like the Finals and All-Star Weekend. These events let potential customers experience our coaching quality firsthand and get a feel for the HoopRise community. We also plan to host an annual “HoopRise Rising Stars Challenge” that will generate media coverage, drive social media engagement, and over time become a marquee event in India’s basketball calendar. The point is to make HoopRise synonymous with basketball culture in India, not just another training program.</w:t>
       </w:r>
     </w:p>
     <w:p>
@@ -1685,7 +1685,7 @@
           <w:color w:val="333333"/>
           <w:sz w:val="24"/>
         </w:rPr>
-        <w:t>The following budget outlines projected expenses and revenue for HoopRise Basketball Academy over a three-year period. Year 1 focuses on establishment and launch, Year 2 on growth and market penetration, and Year 3 on scaling and profitability.</w:t>
+        <w:t>Below is our three-year financial projection. Year 1 is all about getting set up and launching. Year 2 is focused on growth and gaining traction. By Year 3, we are scaling and hitting profitability.</w:t>
       </w:r>
     </w:p>
     <w:tbl>
@@ -2863,7 +2863,7 @@
           <w:color w:val="333333"/>
           <w:sz w:val="24"/>
         </w:rPr>
-        <w:t>Total projected revenue grows from $320,000 in Year 1 to $780,000 in Year 2 and $1,450,000 in Year 3, achieving profitability by the second half of Year 2. The break-even point is projected at approximately 18 months post-launch, driven primarily by scaling academy memberships and rapid adoption of the digital platform.</w:t>
+        <w:t>The numbers tell a clear story. Year 1 is a net loss as we invest heavily in setup, but revenue ramps quickly. By the second half of Year 2, we cross into profitability, with the break-even point coming at roughly 18 months post-launch. Year 3 revenue of $1.45 million against $1.025 million in expenses gives us a healthy margin, and that is before factoring in the potential for geographic expansion. The digital platform is the real growth engine here—it scales without the overhead of additional physical locations.</w:t>
       </w:r>
     </w:p>
     <w:p>
@@ -2952,7 +2952,7 @@
           <w:color w:val="333333"/>
           <w:sz w:val="24"/>
         </w:rPr>
-        <w:t>Strategic partnerships are essential to HoopRise's market entry strategy, providing credibility, resources, and access that would be difficult and costly to build independently. The following partnerships have been identified as high-priority targets, each aligned with specific business objectives.</w:t>
+        <w:t>No startup succeeds in a vacuum, and that is especially true when you are entering a market as complex as India. The right partnerships give us credibility, resources, and access that would take years and a lot more money to build on our own. Here are the key partnerships we are targeting and why each one matters.</w:t>
       </w:r>
     </w:p>
     <w:p>
@@ -2983,7 +2983,7 @@
           <w:color w:val="333333"/>
           <w:sz w:val="24"/>
         </w:rPr>
-        <w:t>A partnership with NBA India is the cornerstone of HoopRise's credibility strategy. The NBA has invested heavily in growing basketball in India through initiatives like NBA Academy India, Jr. NBA programs, and broadcast partnerships. HoopRise will seek designation as an official NBA-affiliated training center, gaining access to NBA coaching methodologies, curriculum frameworks, and brand association. This partnership would also create pathways for HoopRise players to participate in NBA India events and potentially be scouted for the NBA Academy, adding significant value to the training proposition.</w:t>
+        <w:t>This is the partnership that changes everything. The NBA has already invested significantly in growing basketball in India through NBA Academy India, Jr. NBA programs, and broadcast deals. We want to position HoopRise as an official NBA-affiliated training center, which would give us access to their coaching curriculum, their brand halo, and their scouting network. For our players, this creates a visible pathway—train at HoopRise, get noticed, potentially earn a spot at the NBA Academy or get scouted for international opportunities. That is a recruiting pitch that no local competitor can match.</w:t>
       </w:r>
     </w:p>
     <w:p>
@@ -3014,7 +3014,7 @@
           <w:color w:val="333333"/>
           <w:sz w:val="24"/>
         </w:rPr>
-        <w:t>An equipment and apparel partnership with a major sportswear brand will provide HoopRise with high-quality training gear, branded academy uniforms, and co-marketing opportunities. Nike, which has a strong basketball heritage and growing presence in India, is the preferred partner. The partnership would include equipment supply at preferential rates, co-branded marketing campaigns, and potential funding for scholarship programs. In return, the sportswear partner gains a dedicated channel for youth basketball engagement and product placement in a growing market segment.</w:t>
+        <w:t>A sportswear partnership is about more than just getting discounted gear (though that helps too). A brand like Nike, with its deep roots in basketball culture, would give us co-marketing opportunities, branded academy uniforms, and potential funding for scholarship programs. In return, Nike gets a dedicated channel for youth basketball engagement in one of the fastest-growing markets in the world. We would be putting their products on the next generation of Indian basketball players, which is exactly the kind of grassroots brand-building that sportswear companies love.</w:t>
       </w:r>
     </w:p>
     <w:p>
@@ -3045,7 +3045,7 @@
           <w:color w:val="333333"/>
           <w:sz w:val="24"/>
         </w:rPr>
-        <w:t>Alignment with the BFI provides institutional legitimacy and access to the national basketball ecosystem. HoopRise will seek recognition as an accredited training center, enabling academy players to be eligible for state and national team selection pathways. This partnership also opens doors to participation in BFI-organized tournaments, coaching certification programs, and access to government sports facilities. The BFI benefits from HoopRise's contribution to grassroots development and talent identification, strengthening the overall basketball pipeline in India.</w:t>
+        <w:t>Getting official recognition from the BFI gives us institutional legitimacy and connects our players to the national basketball ecosystem. If we are an accredited training center, our players become eligible for state and national team selection pathways. We also get access to BFI-organized tournaments, coaching certification programs, and government sports facilities. For the BFI, the value is clear—we are doing the grassroots development and talent identification work that strengthens the entire basketball pipeline in India.</w:t>
       </w:r>
     </w:p>
     <w:p>
@@ -3076,7 +3076,7 @@
           <w:color w:val="333333"/>
           <w:sz w:val="24"/>
         </w:rPr>
-        <w:t>Formal partnerships with school networks such as Delhi Public School (DPS), Amity International, and Ryan International will embed HoopRise within the education ecosystem. These partnerships will include after-school basketball programs conducted at school facilities, preferential enrollment rates for students of partner schools, and inter-school tournament sponsorship. University partnerships with institutions like Christ University (Bangalore), Shiv Nadar University (Delhi), and NMIMS (Mumbai) will focus on collegiate basketball development, internship opportunities, and sports management collaborations.</w:t>
+        <w:t>Partnering with major school networks like Delhi Public School (DPS), Amity International, and Ryan International lets us embed HoopRise directly into the education ecosystem where our target customers already are. These partnerships would include after-school basketball programs at school facilities, discounted enrollment for partner school students, and sponsored inter-school tournaments. On the university side, we are targeting schools like Christ University in Bangalore, Shiv Nadar University in Delhi, and NMIMS in Mumbai for collegiate basketball development programs, internship pipelines, and sports management collaborations.</w:t>
       </w:r>
     </w:p>
     <w:p>
@@ -3107,7 +3107,7 @@
           <w:color w:val="333333"/>
           <w:sz w:val="24"/>
         </w:rPr>
-        <w:t>Partnerships with Indian technology companies will support the development and scaling of the HoopRise digital platform. Collaborations with firms such as Infosys or Wipro for platform development, Amazon Web Services (AWS) India for cloud infrastructure (including startup credits programs), and sports technology companies like ShotTracker or Noah Basketball for performance analytics integration will ensure a world-class digital experience. These partnerships reduce development costs while providing access to cutting-edge technology that enhances the training experience.</w:t>
+        <w:t>Building and scaling a digital platform is expensive, but the right tech partnerships can cut those costs dramatically. We are looking at collaborations with Indian IT firms like Infosys or Wipro for platform development, AWS India for cloud infrastructure (they have a solid startup credits program), and sports tech companies like ShotTracker for performance analytics integration. These partnerships keep our development costs manageable while making sure the tech we deliver is genuinely world-class.</w:t>
       </w:r>
     </w:p>
     <w:p>
@@ -3141,7 +3141,7 @@
           <w:color w:val="333333"/>
           <w:sz w:val="24"/>
         </w:rPr>
-        <w:t>Deloitte. (2024). India's digital sports consumption: Trends and opportunities in a mobile-first market. Deloitte Touche Tohmatsu India LLP.</w:t>
+        <w:t>Deloitte. (2024). India’s digital sports consumption: Trends and opportunities in a mobile-first market. Deloitte Touche Tohmatsu India LLP.</w:t>
       </w:r>
     </w:p>
     <w:p>
@@ -3155,7 +3155,7 @@
           <w:color w:val="333333"/>
           <w:sz w:val="24"/>
         </w:rPr>
-        <w:t>KPMG. (2023). The business of sports: A comprehensive analysis of India's evolving sports industry landscape. KPMG India.</w:t>
+        <w:t>KPMG. (2023). The business of sports: A comprehensive analysis of India’s evolving sports industry landscape. KPMG India.</w:t>
       </w:r>
     </w:p>
     <w:p>
@@ -3183,7 +3183,7 @@
           <w:color w:val="333333"/>
           <w:sz w:val="24"/>
         </w:rPr>
-        <w:t>Sports Authority of India. (2023). Khelo India annual report 2022-2023: Building a sporting nation through grassroots development. Ministry of Youth Affairs and Sports, Government of India.</w:t>
+        <w:t>Sports Authority of India. (2023). Khelo India annual report 2022–2023: Building a sporting nation through grassroots development. Ministry of Youth Affairs and Sports, Government of India.</w:t>
       </w:r>
     </w:p>
     <w:p>

</xml_diff>

<commit_message>
Rewrite business plan to remove AI writing patterns
Full rewrite targeting natural human voice: variable sentence lengths,
no em-dashes, no banned vocabulary (delve, leverage, landscape, etc.),
conversational transitions, active voice throughout, asymmetric paragraph
structure, and clear stances instead of hedged neutral framing.

Co-Authored-By: Claude Sonnet 4.6 <noreply@anthropic.com>
Claude-Session: https://claude.ai/code/session_01W8zt99ZeTwqXi4zM9Nmp2S
</commit_message>
<xml_diff>
--- a/International_Sport_Business_Plan.docx
+++ b/International_Sport_Business_Plan.docx
@@ -413,7 +413,23 @@
           <w:color w:val="333333"/>
           <w:sz w:val="24"/>
         </w:rPr>
-        <w:t>When looking at untapped basketball markets around the world, India stands out immediately. The country has over 1.44 billion people, making it the most populous nation on Earth, and the demographics skew incredibly young—roughly 65% of Indians are under the age of 35, with the median age sitting at just 28.4 years (United Nations, 2024). That is a massive pool of potential young athletes. On top of that, the Indian sports industry is currently valued at around $2.7 billion and is on track to hit $10 billion by 2030 thanks to rising incomes, urbanization, and a serious push from the government to invest in sports infrastructure (KPMG, 2023). What really caught our attention is the basketball-specific data: the NBA estimates that there are already over 300 million basketball fans in India, which makes it the NBA’s second-largest fan base outside of the United States. The demand is clearly there; the infrastructure just has not caught up yet.</w:t>
+        <w:t>India jumped out at us right away. We spent weeks looking at markets in Southeast Asia, parts of Africa, and even Eastern Europe, but the numbers in India were impossible to ignore. The country has 1.44 billion people. That alone is wild. But what makes it truly special for basketball is the age breakdown: about 65% of the population falls under 35, and the median age is just 28.4 (United Nations, 2024). So you have this enormous young population that is growing up in a more connected, more globally influenced world than any Indian generation before them.</w:t>
+      </w:r>
+    </w:p>
+    <w:p>
+      <w:pPr>
+        <w:spacing w:after="120" w:before="0"/>
+        <w:ind w:firstLine="720"/>
+        <w:jc w:val="left"/>
+      </w:pPr>
+      <w:r>
+        <w:rPr>
+          <w:rFonts w:ascii="Times New Roman" w:hAnsi="Times New Roman"/>
+          <w:b w:val="0"/>
+          <w:color w:val="333333"/>
+          <w:sz w:val="24"/>
+        </w:rPr>
+        <w:t>The broader sports industry in India sits at roughly $2.7 billion right now and analysts expect it to crack $10 billion by 2030 (KPMG, 2023). Rising incomes, more people moving to cities, and a government that is finally putting real money behind sports are all feeding that growth. But here is the stat that got us most excited: the NBA says it has over 300 million fans in India, making it their second biggest market outside the U.S. Three hundred million fans, and barely any structured training infrastructure to serve them. That gap is exactly where HoopRise fits in.</w:t>
       </w:r>
     </w:p>
     <w:p>
@@ -444,7 +460,23 @@
           <w:color w:val="333333"/>
           <w:sz w:val="24"/>
         </w:rPr>
-        <w:t>Young Indian consumers, especially those in the 15–30 range, are more health-conscious than any previous generation. Gym memberships, fitness apps, and sports participation are all trending upward. A huge driver of this is India’s digital connectivity—mobile data costs an average of just $0.17 per GB, which is among the cheapest in the world, and smartphone penetration is through the roof (Deloitte, 2024). This means young Indians are consuming NBA highlights on YouTube, following basketball content on Instagram, and engaging with sports brands online at rates that would have been unthinkable ten years ago. Meanwhile, India’s middle class has grown to over 400 million people, and parents in this segment are increasingly willing to invest in extracurricular activities for their kids. They see sports not just as a hobby but as a real pathway to scholarships and personal development. The success of the Indian Premier League in cricket proved that Indian consumers will passionately support a well-marketed sporting product, and that blueprint can absolutely be applied to basketball.</w:t>
+        <w:t>Indian kids between 15 and 30 are not the same consumers their parents were. They work out more. They follow NBA players on Instagram. They watch highlight reels at 2 a.m. A huge reason for this shift is how cheap mobile data has gotten in India, averaging around $0.17 per GB, which is basically nothing (Deloitte, 2024). Smartphones are everywhere, and that means sports content consumption has gone through the roof in the last five or six years.</w:t>
+      </w:r>
+    </w:p>
+    <w:p>
+      <w:pPr>
+        <w:spacing w:after="120" w:before="0"/>
+        <w:ind w:firstLine="720"/>
+        <w:jc w:val="left"/>
+      </w:pPr>
+      <w:r>
+        <w:rPr>
+          <w:rFonts w:ascii="Times New Roman" w:hAnsi="Times New Roman"/>
+          <w:b w:val="0"/>
+          <w:color w:val="333333"/>
+          <w:sz w:val="24"/>
+        </w:rPr>
+        <w:t>On the family side, India's middle class has ballooned to over 400 million people. Parents in this bracket are spending more on their kids' activities outside of school. They want their children doing something productive after classes, and they are increasingly open to sports, not just tutoring. The Indian Premier League showed everyone that Indians will throw their full passion behind a well-packaged sport product. Cricket did it first. Basketball can be next.</w:t>
       </w:r>
     </w:p>
     <w:p>
@@ -475,7 +507,23 @@
           <w:color w:val="333333"/>
           <w:sz w:val="24"/>
         </w:rPr>
-        <w:t>There are several strong tailwinds for entering this market right now. The Indian government’s Khelo India initiative has poured over $350 million into sports development, including basketball-specific infrastructure. The NBA already established its Academy India program back in 2017, which validates that there is international confidence in this market. With 35% of India’s population now living in cities, there are natural demand centers where a basketball academy can thrive. That said, we have to be realistic about the challenges. Cricket is king in India, and any sport entering that market is competing for attention and participation against a deeply entrenched cultural institution. Quality indoor basketball courts are hard to find outside major cities, and price sensitivity is real—training programs need to be priced in a way that middle-class families can actually afford. Finally, India’s regulatory environment varies significantly across its 28 states and 8 union territories, so a one-size-fits-all approach will not work.</w:t>
+        <w:t>The timing for this kind of venture is genuinely good. The government's Khelo India program has funneled over $350 million into sports development. The NBA opened its own academy in India back in 2017, which tells you that serious institutional money already believes in this market. And with 35% of the country now living in cities, you have dense pockets of demand ready to be tapped.</w:t>
+      </w:r>
+    </w:p>
+    <w:p>
+      <w:pPr>
+        <w:spacing w:after="120" w:before="0"/>
+        <w:ind w:firstLine="720"/>
+        <w:jc w:val="left"/>
+      </w:pPr>
+      <w:r>
+        <w:rPr>
+          <w:rFonts w:ascii="Times New Roman" w:hAnsi="Times New Roman"/>
+          <w:b w:val="0"/>
+          <w:color w:val="333333"/>
+          <w:sz w:val="24"/>
+        </w:rPr>
+        <w:t>But we are not naive about the obstacles. Cricket runs deep in Indian culture. It is not just a sport there; it is almost a religion. Any basketball venture is fighting for attention against that. Quality indoor courts are rare outside major metros. Price sensitivity matters a lot because even middle-class families watch their budgets carefully. And India's regulatory setup varies wildly across 28 states and 8 union territories, so what works in Mumbai might not fly in Chennai without adjustments. We have thought about all of this, and the plan accounts for it.</w:t>
       </w:r>
     </w:p>
     <w:p>
@@ -511,7 +559,7 @@
           <w:color w:val="333333"/>
           <w:sz w:val="24"/>
         </w:rPr>
-        <w:t>HoopRise Basketball Academy is a hybrid basketball training and development company that pairs high-quality physical training facilities with a digital platform to bring structured basketball education to young players across India. The plan is to open premium training centers in three major metro areas—Mumbai, Delhi NCR, and Bangalore—while also launching a mobile app that makes our training content accessible to players anywhere in the country, even if they are nowhere near one of our physical locations.</w:t>
+        <w:t>HoopRise is a basketball training company built around one core idea: pair real, physical academy locations with a strong digital platform so that quality coaching reaches as many young players as possible. We are opening training centers in Mumbai, Delhi NCR, and Bangalore. At the same time, we are building a mobile app that brings our training methods to kids in any city, any town, anywhere in India.</w:t>
       </w:r>
     </w:p>
     <w:p>
@@ -527,7 +575,7 @@
           <w:color w:val="333333"/>
           <w:sz w:val="24"/>
         </w:rPr>
-        <w:t>Each physical academy will have regulation-size indoor courts, a strength and conditioning area, a sports science lab with motion capture technology, and classrooms for film study and tactical sessions. We plan to staff each location with certified coaches who have international playing or coaching experience, along with local assistant coaches who understand the regional dynamics and can connect with players on a personal level. Training will be split into four tiers—Beginner, Intermediate, Advanced, and Elite—so we can serve everyone from an 8-year-old picking up a basketball for the first time to a 22-year-old trying to break into professional play.</w:t>
+        <w:t>The academies themselves will have full-size indoor courts, weight rooms, sports science labs with motion capture tech, and film rooms for breaking down game footage. We plan on hiring coaches with international backgrounds (playing or coaching overseas) and pairing them with local assistants who actually know the community and can relate to the kids. Training runs on four levels: Beginner, Intermediate, Advanced, and Elite. That way an 8-year-old just learning to dribble and a 21-year-old gunning for a pro tryout can both find a program that fits.</w:t>
       </w:r>
     </w:p>
     <w:p>
@@ -543,7 +591,7 @@
           <w:color w:val="333333"/>
           <w:sz w:val="24"/>
         </w:rPr>
-        <w:t>The digital side of HoopRise is just as important. The app will feature AI-powered skill assessments, a video drill library with demonstrations in multiple Indian languages, performance tracking dashboards, and virtual coaching sessions. This is where the business really scales, because the biggest gap in India’s basketball landscape right now is not a lack of interest—it is a lack of structured, quality training that is actually accessible to most people. If you live in a Tier 2 or Tier 3 city, your options for basketball coaching are extremely limited. HoopRise solves that problem by putting world-class training content in the hands of any kid with a smartphone, while still offering the full in-person experience for those near our academy locations.</w:t>
+        <w:t>The app is honestly where this business gets really interesting from a growth perspective. It will have AI skill assessments, a video drill library filmed in multiple Indian languages, stat tracking, and virtual coaching sessions. Right now, if you are a kid in a Tier 2 or Tier 3 Indian city and you want serious basketball coaching, your options are basically zero. HoopRise changes that. A smartphone and an internet connection become your access point to training content that used to only exist in a handful of elite programs. Meanwhile, players near our academy cities still get the full in-person experience. That combination is something nobody else in India is offering.</w:t>
       </w:r>
     </w:p>
     <w:p>
@@ -579,7 +627,7 @@
           <w:color w:val="333333"/>
           <w:sz w:val="24"/>
         </w:rPr>
-        <w:t>HoopRise Basketball Academy exists to make high-level basketball development accessible to young athletes across India, regardless of where they live or what their family’s income looks like. Our mission is to build a training ecosystem that combines expert coaching, quality facilities, and smart technology to develop the next wave of Indian basketball talent. Beyond the sport itself, we want every player who comes through our program to walk away with stronger discipline, better teamwork skills, and a real sense of confidence—qualities that carry over into every part of life.</w:t>
+        <w:t>We started HoopRise because we believe that where you grow up or how much your family makes should not decide whether you get good basketball coaching. Our mission is straightforward: build the best basketball training program in India by combining great coaches, solid facilities, and smart technology, then make it accessible to as many young players as we possibly can. We also care about what basketball teaches beyond the court. Discipline. Accountability. How to work with people who are different from you. Those things matter just as much as a jump shot.</w:t>
       </w:r>
     </w:p>
     <w:p>
@@ -595,7 +643,7 @@
           <w:color w:val="333333"/>
           <w:sz w:val="24"/>
         </w:rPr>
-        <w:t>We have three specific goals driving everything we do. First, we want to build the most recognized and trusted basketball training brand in India within five years. Second, we want to develop a legitimate pipeline of players who can compete at the collegiate, national, and international level. Third, we want to reach one million users on our digital platform within three years of launch. These are ambitious targets, but we believe they are achievable through a combination of relentless focus on coaching quality, smart use of technology, and strategic partnerships that give us credibility and reach from day one.</w:t>
+        <w:t>Three goals sit at the center of everything. First, we want HoopRise to be the name people think of when they think of basketball training in India, and we want that within five years. Second, we want to build a real pipeline of players who go on to compete in college programs, national teams, and professional leagues. Third, we want one million users on the app within three years. Those are big numbers. We know that. But the market is big, the demand is real, and we have a plan for each one.</w:t>
       </w:r>
     </w:p>
     <w:p>
@@ -641,7 +689,7 @@
           <w:color w:val="333333"/>
           <w:sz w:val="24"/>
         </w:rPr>
-        <w:t>Our primary target is youth aged 8 to 22 from middle-class and upper-middle-class families in urban India. We are talking about households with annual incomes between $10,000 and $50,000—families where parents prioritize education and are increasingly open to investing in structured extracurricular programs. The kids in this demographic are digitally native, heavily influenced by global sports culture, and many of them are already watching NBA content online. Our secondary targets include college athletes looking for advanced training, corporate clients who want basketball-based team-building programs, and recreational adult players aged 23–35 who play in weekend leagues or just want to stay active.</w:t>
+        <w:t>We are going after kids and young adults between 8 and 22, mostly from middle-class and upper-middle-class families in Indian cities. These are households pulling in roughly $10,000 to $50,000 a year, where parents care a lot about education but are starting to see sports as part of the picture too. The young people in this group grew up online. They watch the NBA. They follow basketball culture. A lot of them already want to play; they just do not have anywhere good to train.</w:t>
       </w:r>
     </w:p>
     <w:p>
@@ -657,7 +705,7 @@
           <w:color w:val="333333"/>
           <w:sz w:val="24"/>
         </w:rPr>
-        <w:t>Across India’s top 20 cities, there are roughly 120 million young people who fit this profile. We are starting with Mumbai (21 million metro population), Delhi NCR (32 million), and Bangalore (13 million) because these cities have the highest concentration of middle-class families, existing basketball interest, suitable commercial real estate, and strong digital infrastructure. The lifestyle of our target customer involves heavy social media use, regular consumption of NBA and international sports content, interest in fitness trends, and a growing openness to sports beyond cricket.</w:t>
+        <w:t>Our secondary market includes college athletes who need better coaching, companies looking for team-building activities, and adults in their twenties and thirties who play recreational basketball on weekends. Across India's 20 biggest cities, about 120 million young people fit our target profile. We are launching in Mumbai (21 million metro), Delhi NCR (32 million), and Bangalore (13 million) because that is where middle-class density, basketball interest, and commercial infrastructure overlap the most.</w:t>
       </w:r>
     </w:p>
     <w:p>
@@ -803,7 +851,7 @@
                 <w:color w:val="333333"/>
                 <w:sz w:val="18"/>
               </w:rPr>
-              <w:t>Incredible brand recognition; world-class coaching; direct pathway to the NBA</w:t>
+              <w:t>Massive brand power; elite coaches; direct NBA scouting pipeline</w:t>
             </w:r>
           </w:p>
         </w:tc>
@@ -819,7 +867,7 @@
                 <w:color w:val="333333"/>
                 <w:sz w:val="18"/>
               </w:rPr>
-              <w:t>Only takes about 24 players total; one location; not designed for the average player</w:t>
+              <w:t>Accepts maybe 24 kids total; single location; completely unreachable for the average player</w:t>
             </w:r>
           </w:p>
         </w:tc>
@@ -873,7 +921,7 @@
                 <w:color w:val="333333"/>
                 <w:sz w:val="18"/>
               </w:rPr>
-              <w:t>Has an established local presence; affordable pricing; focuses on grassroots</w:t>
+              <w:t>Been around a while; priced low; focused on grassroots</w:t>
             </w:r>
           </w:p>
         </w:tc>
@@ -890,7 +938,7 @@
                 <w:color w:val="333333"/>
                 <w:sz w:val="18"/>
               </w:rPr>
-              <w:t>Facilities are limited; no digital component; coaching quality varies a lot</w:t>
+              <w:t>Small, cramped facilities; no app or digital tools; coaching quality is inconsistent</w:t>
             </w:r>
           </w:p>
         </w:tc>
@@ -943,7 +991,7 @@
                 <w:color w:val="333333"/>
                 <w:sz w:val="18"/>
               </w:rPr>
-              <w:t>Free or almost free; backed by government; available in many cities</w:t>
+              <w:t>Free or nearly free; government backed; exist in many cities</w:t>
             </w:r>
           </w:p>
         </w:tc>
@@ -959,7 +1007,7 @@
                 <w:color w:val="333333"/>
                 <w:sz w:val="18"/>
               </w:rPr>
-              <w:t>Run-down facilities; coaches often have no formal training; no real curriculum</w:t>
+              <w:t>Courts are falling apart; coaches rarely have real credentials; no structured program at all</w:t>
             </w:r>
           </w:p>
         </w:tc>
@@ -1013,7 +1061,7 @@
                 <w:color w:val="333333"/>
                 <w:sz w:val="18"/>
               </w:rPr>
-              <w:t>Cutting-edge tech; AI-driven feedback; large global user base</w:t>
+              <w:t>Strong tech; AI analysis; big global user numbers</w:t>
             </w:r>
           </w:p>
         </w:tc>
@@ -1030,7 +1078,7 @@
                 <w:color w:val="333333"/>
                 <w:sz w:val="18"/>
               </w:rPr>
-              <w:t>No physical presence in India; English-only; not built for the Indian context</w:t>
+              <w:t>Nobody on the ground in India; English only; built for American and European users, not Indians</w:t>
             </w:r>
           </w:p>
         </w:tc>
@@ -1095,7 +1143,23 @@
           <w:color w:val="333333"/>
           <w:sz w:val="24"/>
         </w:rPr>
-        <w:t>The key thing that sets HoopRise apart is our hybrid model, which nobody else in the Indian market is doing right now. The NBA Academy is elite but inaccessible. Local programs are accessible but low quality. International apps have great tech but zero local relevance. We sit right in the sweet spot—premium quality that is still accessible to a wide audience. Here is what specifically sets us apart:</w:t>
+        <w:t>The reason HoopRise works where others fall short comes down to one thing: nobody else is combining physical academies with a full digital training product in the Indian market. The NBA Academy is world-class but only serves a tiny handful of kids. Local programs are open to everyone but the quality is awful. International apps have great technology but they were not designed with India in mind at all.</w:t>
+      </w:r>
+    </w:p>
+    <w:p>
+      <w:pPr>
+        <w:spacing w:after="120" w:before="0"/>
+        <w:ind w:firstLine="720"/>
+        <w:jc w:val="left"/>
+      </w:pPr>
+      <w:r>
+        <w:rPr>
+          <w:rFonts w:ascii="Times New Roman" w:hAnsi="Times New Roman"/>
+          <w:b w:val="0"/>
+          <w:color w:val="333333"/>
+          <w:sz w:val="24"/>
+        </w:rPr>
+        <w:t>We sit right between all of those. Premium enough to actually develop real talent. Accessible enough that a regular middle-class family can afford it. Our specific advantages break down like this:</w:t>
       </w:r>
     </w:p>
     <w:p>
@@ -1110,7 +1174,7 @@
           <w:color w:val="333333"/>
           <w:sz w:val="24"/>
         </w:rPr>
-        <w:t>Hybrid Physical-Digital Model: Players get in-person training at our academies plus a full mobile app experience, so their development does not stop when they leave the court.</w:t>
+        <w:t>Physical plus Digital: Train at the academy, then keep working at home through the app. Development does not stop when practice ends.</w:t>
       </w:r>
     </w:p>
     <w:p>
@@ -1125,7 +1189,7 @@
           <w:color w:val="333333"/>
           <w:sz w:val="24"/>
         </w:rPr>
-        <w:t>Data-Driven Development: Our AI-powered performance tracking creates personalized training plans based on each player’s actual strengths and weaknesses, not a generic one-size-fits-all program.</w:t>
+        <w:t>Personalized Training Plans: The AI tracks what each player is good at and where they struggle, then adjusts their program accordingly. No cookie-cutter drills.</w:t>
       </w:r>
     </w:p>
     <w:p>
@@ -1140,7 +1204,7 @@
           <w:color w:val="333333"/>
           <w:sz w:val="24"/>
         </w:rPr>
-        <w:t>Tiered Pricing: We are building in scholarship programs and subsidized digital access from the start. Talent should not be gated by income.</w:t>
+        <w:t>Tiered Pricing with Scholarships: We built financial aid into the model from day one. A talented kid should not get shut out because of money.</w:t>
       </w:r>
     </w:p>
     <w:p>
@@ -1155,7 +1219,7 @@
           <w:color w:val="333333"/>
           <w:sz w:val="24"/>
         </w:rPr>
-        <w:t>Multilingual Platform: All training content will be available in Hindi, English, Tamil, Kannada, and Marathi at launch, because a kid in Bangalore should not have to train in a language they are not comfortable in.</w:t>
+        <w:t>Multilingual Content: The app launches in Hindi, English, Tamil, Kannada, and Marathi. A kid in Bangalore deserves to train in a language that feels natural to them.</w:t>
       </w:r>
     </w:p>
     <w:p>
@@ -1170,7 +1234,7 @@
           <w:color w:val="333333"/>
           <w:sz w:val="24"/>
         </w:rPr>
-        <w:t>Clear Pathway to Professional Play: We are establishing direct relationships with international college programs and professional leagues so that players can see a real future in basketball, not just a hobby.</w:t>
+        <w:t>A Real Path Forward: We are building direct connections with international college programs and pro leagues so players can actually see where basketball might take them.</w:t>
       </w:r>
     </w:p>
     <w:p>
@@ -1221,7 +1285,23 @@
           <w:color w:val="333333"/>
           <w:sz w:val="24"/>
         </w:rPr>
-        <w:t>In India, parents and often even extended family are the decision makers when it comes to a child’s extracurricular activities. You cannot just market to the kid; you have to win over the family. That is why our marketing and enrollment strategies will speak directly to parental priorities. Every piece of promotional content will emphasize the character-building side of basketball—discipline, time management, teamwork, leadership—because those are the qualities that resonate with Indian parents. We will also hold regular open-house events, parent orientation sessions, and send out quarterly progress reports so families feel genuinely involved in their child’s development. The enrollment process will treat parents as partners in the journey, not just people writing checks.</w:t>
+        <w:t>Indian families make decisions together. Period. If a kid wants to join a basketball program, the parents need to be convinced, and sometimes grandparents weigh in too. So our marketing cannot just be cool dunk videos targeting teenagers. We have to speak directly to what parents care about: will this make my child more disciplined? Will it teach them to manage their time? Will it help with college?</w:t>
+      </w:r>
+    </w:p>
+    <w:p>
+      <w:pPr>
+        <w:spacing w:after="120" w:before="0"/>
+        <w:ind w:firstLine="720"/>
+        <w:jc w:val="left"/>
+      </w:pPr>
+      <w:r>
+        <w:rPr>
+          <w:rFonts w:ascii="Times New Roman" w:hAnsi="Times New Roman"/>
+          <w:b w:val="0"/>
+          <w:color w:val="333333"/>
+          <w:sz w:val="24"/>
+        </w:rPr>
+        <w:t>Every promotional piece we put out will hit those points hard. We will also run open-house days where families can come see the facility, meet the coaches, and ask questions. Quarterly progress reports go home to parents. The whole enrollment process treats the family as a partner. If the parents do not feel like they are part of this, the kid does not sign up. Simple as that.</w:t>
       </w:r>
     </w:p>
     <w:p>
@@ -1252,7 +1332,7 @@
           <w:color w:val="333333"/>
           <w:sz w:val="24"/>
         </w:rPr>
-        <w:t>Academics come first in Indian culture, and any sports venture that ignores that reality is going to fail. We are not fighting that; we are working with it. All training sessions will be scheduled around school hours, and during board exam seasons (March–April and October–November), we will offer flexible and reduced schedules so students are not forced to choose between studying and training. A big part of our pitch to families will be the scholarship angle—we will highlight players who earned spots at international universities through basketball, showing parents that this is actually complementary to their child’s education, not competing with it. We even plan to have study spaces inside each academy facility so that kids can get homework done before or after practice.</w:t>
+        <w:t>Academics are sacred in India. If a parent has to choose between tutoring and basketball, basketball loses every single time. We are not trying to fight that. Instead, we work around it. Practice times run outside of school hours. During board exam season (March through April, and again in October and November), we scale back sessions and offer flexible scheduling. We will also push the scholarship angle constantly, showing families real examples of basketball players who got into international universities on athletic scholarships. And every academy will have a study area where kids can do homework before or after practice, because that small detail sends a message: we take their education seriously too.</w:t>
       </w:r>
     </w:p>
     <w:p>
@@ -1283,7 +1363,7 @@
           <w:color w:val="333333"/>
           <w:sz w:val="24"/>
         </w:rPr>
-        <w:t>India has 22 officially recognized languages and hundreds of dialects, which means operating in English alone is not going to cut it. At each academy, coaching will be bilingual—English paired with the dominant local language (Hindi in Delhi, Marathi in Mumbai, Kannada in Bangalore). The app will launch with content in five languages, and we will add more based on what users are asking for. Our marketing will also be localized beyond just language; we will use region-specific cultural references and sports analogies that actually connect with people in each city rather than running the same generic national campaign everywhere.</w:t>
+        <w:t>Twenty-two official languages. Hundreds of dialects. India is not one market; it is dozens of markets stitched together. Running an English-only operation would cut us off from a huge number of potential players and families. Our coaches will work bilingually at each location: English plus Hindi in Delhi, English plus Marathi in Mumbai, English plus Kannada in Bangalore. The app launches in five languages with more added based on user demand. Marketing gets localized too, not just translated. We will use references and cultural touchpoints that actually mean something in each city instead of running one national campaign and hoping it lands everywhere.</w:t>
       </w:r>
     </w:p>
     <w:p>
@@ -1314,7 +1394,7 @@
           <w:color w:val="333333"/>
           <w:sz w:val="24"/>
         </w:rPr>
-        <w:t>India is one of the most religiously diverse countries in the world, and the calendar is packed with festivals—Diwali, Eid, Christmas, Pongal, Holi, Navratri, and many more. Rather than treating these as scheduling headaches, we plan to use them as opportunities. We will adjust schedules around major festivals, host themed basketball events during holiday seasons, and use celebrations as moments to bring together players from different backgrounds. The goal is to make the academy feel like a space where everyone belongs, and where diversity is something that gets celebrated, not just tolerated.</w:t>
+        <w:t>Diwali. Eid. Christmas. Holi. Pongal. Navratri. The festival calendar in India is packed, and these celebrations are deeply important to families. We are building our yearly schedule around them, not in spite of them. When a major festival hits, we adjust training schedules. During holiday seasons, we will host themed basketball events that bring together players from different communities. Honestly, festivals are an opportunity to make the academy feel like a place where every kid belongs, regardless of their background. That sense of inclusion is not just nice to have; it is essential for long-term retention in a country this diverse.</w:t>
       </w:r>
     </w:p>
     <w:p>
@@ -1345,7 +1425,23 @@
           <w:color w:val="333333"/>
           <w:sz w:val="24"/>
         </w:rPr>
-        <w:t>Women’s sports participation in urban India is growing fast, but there are still cultural sensitivities, especially when it comes to mixed-gender athletic settings for teenagers. We are going to address this head-on by offering dedicated girls-only training sessions led by female coaches. This makes it much easier for more conservative families to feel comfortable enrolling their daughters. Our marketing will also prominently feature female basketball role models and lean into the empowerment narrative, because honestly, the growth potential on the women’s side is enormous, and we do not want to leave half the market on the table just because we did not think about these dynamics early enough.</w:t>
+        <w:t>Women's sports in urban India are growing, but cultural hesitation around mixed-gender athletics (especially for teenagers) is still very real. Some families will not enroll their daughters in a program where they train alongside boys. We are going to offer dedicated sessions for girls, coached by women. That removes the barrier for families who would otherwise say no.</w:t>
+      </w:r>
+    </w:p>
+    <w:p>
+      <w:pPr>
+        <w:spacing w:after="120" w:before="0"/>
+        <w:ind w:firstLine="720"/>
+        <w:jc w:val="left"/>
+      </w:pPr>
+      <w:r>
+        <w:rPr>
+          <w:rFonts w:ascii="Times New Roman" w:hAnsi="Times New Roman"/>
+          <w:b w:val="0"/>
+          <w:color w:val="333333"/>
+          <w:sz w:val="24"/>
+        </w:rPr>
+        <w:t>Our marketing will feature female players prominently, not as an afterthought but as a central part of the brand. Frankly, the business case is obvious too. If we ignore this, we are voluntarily giving up access to half the market. We would rather get it right from the start.</w:t>
       </w:r>
     </w:p>
     <w:p>
@@ -1381,7 +1477,7 @@
           <w:color w:val="333333"/>
           <w:sz w:val="24"/>
         </w:rPr>
-        <w:t>We estimate that HoopRise needs approximately $900,000 to get through launch and the first year of operations. Rather than relying on one big investor or a single funding source, we are spreading the risk across multiple channels. Here is how we plan to raise the capital.</w:t>
+        <w:t>Getting HoopRise off the ground and through year one will cost about $900,000. That covers facilities, staff, tech development, marketing, and a contingency buffer. We are not putting all our eggs in one basket with funding. The plan spreads across four sources.</w:t>
       </w:r>
     </w:p>
     <w:p>
@@ -1412,7 +1508,7 @@
           <w:color w:val="333333"/>
           <w:sz w:val="24"/>
         </w:rPr>
-        <w:t>India’s sports-tech investment scene has been heating up, with firms like Dream Sports, Blume Ventures, and Sequoia India actively looking for sports-related plays. Our plan is to target a seed round of around $400,000 from angel investors who have a track record in sports, education, or youth development. The pitch is straightforward: India has the demographics, the digital infrastructure, and the growing demand, but nobody has built a scalable hybrid training model yet. HoopRise is that model.</w:t>
+        <w:t>The sports-tech investment scene in India has picked up real momentum lately. Firms like Dream Sports, Blume Ventures, and Sequoia India have all been putting money into sports-related startups. We are targeting a seed round of roughly $400,000 from angels who have a background in sports, education, or youth programs. The pitch writes itself: India has the biggest young population on the planet, basketball fandom is exploding, and nobody has built a scalable hybrid training model there yet. That is the opening we are walking through.</w:t>
       </w:r>
     </w:p>
     <w:p>
@@ -1443,7 +1539,7 @@
           <w:color w:val="333333"/>
           <w:sz w:val="24"/>
         </w:rPr>
-        <w:t>The Indian government’s Khelo India program and the Sports Authority of India (SAI) both offer grants and subsidies to organizations that develop sports infrastructure and increase grassroots participation. We plan to apply for accreditation as an official training center under these programs, which could bring in $100,000–$150,000 in direct grants and give us access to government sports facilities at subsidized rates. Each state—Maharashtra, Delhi, and Karnataka—has its own sports department with additional funding opportunities, so we will be applying at both the national and state levels.</w:t>
+        <w:t>India's Khelo India program and the Sports Authority of India both hand out grants to organizations that build sports infrastructure and grow participation at the grassroots level. We are applying for accreditation as an official training center, which could unlock $100,000 to $150,000 in grants and get us discounted access to government-owned sports facilities. Maharashtra, Delhi, and Karnataka each have their own state-level sports funding too, so we will be applying at multiple levels simultaneously.</w:t>
       </w:r>
     </w:p>
     <w:p>
@@ -1474,7 +1570,7 @@
           <w:color w:val="333333"/>
           <w:sz w:val="24"/>
         </w:rPr>
-        <w:t>Here is something a lot of people do not realize about India: companies with profits above a certain threshold are legally required to spend 2% of their net profits on Corporate Social Responsibility (CSR) initiatives. Sports development and youth empowerment both qualify, which opens the door to sponsorship from major Indian corporations like the Tata Group, Reliance Industries, and Infosys. We are going to build tiered sponsorship packages ranging from $25,000 to $200,000, offering brand visibility across our facilities, our app, and our events. It is a win-win—they need to spend the money anyway, and we can offer them meaningful brand exposure in a growing space.</w:t>
+        <w:t>This is one of those details about India that most people outside the country do not know. Indian companies above a certain profit threshold are legally required to spend 2% of net profits on social responsibility initiatives. Youth sports and empowerment programs qualify. That opens the door to sponsorship conversations with the Tata Group, Reliance, Infosys, and others who need to spend that money somewhere. We are building tiered sponsorship packages from $25,000 to $200,000 that give brands visibility at our academies, on the app, and at events. They get genuine exposure in a growing space. We get funded. It works for both sides.</w:t>
       </w:r>
     </w:p>
     <w:p>
@@ -1505,7 +1601,7 @@
           <w:color w:val="333333"/>
           <w:sz w:val="24"/>
         </w:rPr>
-        <w:t>To supplement the larger funding sources, we plan to run a crowdfunding campaign on Ketto (India’s biggest crowdfunding platform) and Kickstarter with a target of $50,000–$75,000. Beyond the money, this is really about building a community from day one. The campaign will lean into the social impact story—democratizing basketball access for kids who would never otherwise get quality coaching—and backers will get rewards like discounted memberships, exclusive merchandise, and early access to the app.</w:t>
+        <w:t>We are also planning a crowdfunding campaign on Ketto (India's largest platform for this) and Kickstarter, aiming for $50,000 to $75,000. Honestly, the crowdfunding piece is about more than just money. It builds a community of early supporters who feel personally invested in HoopRise before we even open the doors. Backers get discounted memberships, exclusive merch, and early app access. The campaign tells the story of what we are trying to do for kids who would never otherwise get real basketball coaching, and that kind of narrative travels well on social media.</w:t>
       </w:r>
     </w:p>
     <w:p>
@@ -1556,7 +1652,23 @@
           <w:color w:val="333333"/>
           <w:sz w:val="24"/>
         </w:rPr>
-        <w:t>With over 800 million internet users in India, digital is obviously the primary channel. We will run targeted ad campaigns on Instagram, YouTube, and Facebook built around video content—training highlights, player transformation stories, and behind-the-scenes looks at academy life. YouTube pre-roll ads placed before NBA content is a no-brainer since that is exactly where our target audience already is. On the search side, we will invest in SEO and Google Ads targeting high-intent keywords like “basketball training India,” “basketball academy near me,” and “learn basketball.” We will also publish weekly blog posts and video tutorials to build organic traffic and position HoopRise as the go-to authority on basketball development in India.</w:t>
+        <w:t>India has over 800 million internet users, so digital is the obvious primary channel. We will run targeted ads on Instagram, YouTube, and Facebook, all built around video. Training clips, player progress stories, behind-the-scenes content from the academy. YouTube pre-roll ads placed before NBA videos make a lot of sense because that is literally where our audience is already spending their time.</w:t>
+      </w:r>
+    </w:p>
+    <w:p>
+      <w:pPr>
+        <w:spacing w:after="120" w:before="0"/>
+        <w:ind w:firstLine="720"/>
+        <w:jc w:val="left"/>
+      </w:pPr>
+      <w:r>
+        <w:rPr>
+          <w:rFonts w:ascii="Times New Roman" w:hAnsi="Times New Roman"/>
+          <w:b w:val="0"/>
+          <w:color w:val="333333"/>
+          <w:sz w:val="24"/>
+        </w:rPr>
+        <w:t>On the search side, we will invest in SEO and Google Ads around high-intent terms like "basketball training India" and "basketball academy near me." Weekly blog posts and tutorial videos will build organic reach over time and make HoopRise the name that keeps showing up whenever someone searches for basketball development content in India.</w:t>
       </w:r>
     </w:p>
     <w:p>
@@ -1587,7 +1699,7 @@
           <w:color w:val="333333"/>
           <w:sz w:val="24"/>
         </w:rPr>
-        <w:t>We are going to partner with a mix of Indian basketball figures, fitness influencers, and youth-oriented content creators to get the word out. Top targets include Satnam Singh (the first Indian player ever drafted by an NBA team), Prachi Tehlan (former national team captain), and some of the bigger fitness YouTubers whose audiences overlap with our demographic. In each target city, we will also work with local micro-influencers who have real credibility in their communities. These partnerships will involve content creation, appearances at academy events, and social media collaborations—all designed to give us authentic visibility rather than feeling like generic advertising.</w:t>
+        <w:t>We want real faces attached to this brand, not just a logo. Top targets include Satnam Singh (first Indian ever drafted by an NBA team), Prachi Tehlan (former national team captain), and several fitness-focused YouTubers whose audiences line up with our demographic. In each city we are also going to work with local micro-influencers, people with maybe 50,000 to 200,000 followers who have genuine credibility in their communities. These are not going to be stiff endorsement deals. We want content collaborations, appearances at our events, and social media partnerships that feel authentic rather than forced.</w:t>
       </w:r>
     </w:p>
     <w:p>
@@ -1618,7 +1730,7 @@
           <w:color w:val="333333"/>
           <w:sz w:val="24"/>
         </w:rPr>
-        <w:t>Getting into schools is one of our biggest enrollment drivers. We plan to partner with major school networks to offer free introductory basketball clinics, donate equipment to schools that start basketball programs, and sponsor inter-school tournaments. On the university side, we want to become the preferred training partner for college basketball teams by offering group training packages and giving teams access to our digital platform for performance analysis. This approach puts us in front of our exact target audience in an environment where they are already open to learning new things.</w:t>
+        <w:t>Schools are where our customers already are, five days a week. We plan to partner with school networks to run free introductory basketball clinics, give away equipment to schools that start basketball programs, and sponsor inter-school tournaments. On the college side, we want to be the go-to training partner for university basketball teams, offering group packages and access to the app's analytics tools. This puts us directly in front of the exact kids we are trying to reach, in a setting where they are already open to trying something new.</w:t>
       </w:r>
     </w:p>
     <w:p>
@@ -1649,7 +1761,7 @@
           <w:color w:val="333333"/>
           <w:sz w:val="24"/>
         </w:rPr>
-        <w:t>Nothing builds a brand like real-world experiences. We will organize three-on-three street tournaments, holiday basketball camps, and viewing parties during major NBA events like the Finals and All-Star Weekend. These events let potential customers experience our coaching quality firsthand and get a feel for the HoopRise community. We also plan to host an annual “HoopRise Rising Stars Challenge” that will generate media coverage, drive social media engagement, and over time become a marquee event in India’s basketball calendar. The point is to make HoopRise synonymous with basketball culture in India, not just another training program.</w:t>
+        <w:t>You can run all the online ads you want, but there is no substitute for people actually experiencing your product. We are going to organize 3-on-3 street tournaments, basketball camps during school breaks, and watch parties for the NBA Finals and All-Star Weekend. Once a year, we will run a "HoopRise Rising Stars Challenge" that becomes the big annual event, gets press coverage, and gives the brand a signature moment on the calendar. The goal is to make HoopRise feel like the center of basketball culture in India, not just another place to take lessons.</w:t>
       </w:r>
     </w:p>
     <w:p>
@@ -1685,7 +1797,7 @@
           <w:color w:val="333333"/>
           <w:sz w:val="24"/>
         </w:rPr>
-        <w:t>Below is our three-year financial projection. Year 1 is all about getting set up and launching. Year 2 is focused on growth and gaining traction. By Year 3, we are scaling and hitting profitability.</w:t>
+        <w:t>Here is the financial picture across three years. Year 1 is setup and launch. Year 2 is growth. Year 3 is when we start making real money.</w:t>
       </w:r>
     </w:p>
     <w:tbl>
@@ -2863,7 +2975,7 @@
           <w:color w:val="333333"/>
           <w:sz w:val="24"/>
         </w:rPr>
-        <w:t>The numbers tell a clear story. Year 1 is a net loss as we invest heavily in setup, but revenue ramps quickly. By the second half of Year 2, we cross into profitability, with the break-even point coming at roughly 18 months post-launch. Year 3 revenue of $1.45 million against $1.025 million in expenses gives us a healthy margin, and that is before factoring in the potential for geographic expansion. The digital platform is the real growth engine here—it scales without the overhead of additional physical locations.</w:t>
+        <w:t>Year 1 is a loss. We knew that going in. Heavy upfront investment in facilities, tech, and staffing means we are spending far more than we are bringing in. But revenue climbs fast. By the back half of Year 2, we cross into the black, with a break-even point at about 18 months. Year 3 brings in $1.45 million against $1.025 million in costs, which gives us room to breathe and reinvest. The app is the real engine here because it scales without requiring us to lease more buildings or hire proportionally more staff for every new user.</w:t>
       </w:r>
     </w:p>
     <w:p>
@@ -2952,7 +3064,7 @@
           <w:color w:val="333333"/>
           <w:sz w:val="24"/>
         </w:rPr>
-        <w:t>No startup succeeds in a vacuum, and that is especially true when you are entering a market as complex as India. The right partnerships give us credibility, resources, and access that would take years and a lot more money to build on our own. Here are the key partnerships we are targeting and why each one matters.</w:t>
+        <w:t>We could try to build everything from scratch. But honestly, that would be slow, expensive, and unnecessary. The smarter play is to partner with organizations that already have what we need (credibility, infrastructure, reach) and offer them something valuable in return. Here are the five partnerships we are going after.</w:t>
       </w:r>
     </w:p>
     <w:p>
@@ -2983,7 +3095,7 @@
           <w:color w:val="333333"/>
           <w:sz w:val="24"/>
         </w:rPr>
-        <w:t>This is the partnership that changes everything. The NBA has already invested significantly in growing basketball in India through NBA Academy India, Jr. NBA programs, and broadcast deals. We want to position HoopRise as an official NBA-affiliated training center, which would give us access to their coaching curriculum, their brand halo, and their scouting network. For our players, this creates a visible pathway—train at HoopRise, get noticed, potentially earn a spot at the NBA Academy or get scouted for international opportunities. That is a recruiting pitch that no local competitor can match.</w:t>
+        <w:t>This one is the biggest. If we can get affiliated with the NBA, everything else becomes easier. They have already put real money into Indian basketball through the NBA Academy, Jr. NBA programs, and broadcast deals. What we want is recognition as an official NBA-affiliated training center. That gives us access to their coaching playbooks, their brand credibility, and their scouting network. For our players, it means a visible ladder: train at HoopRise, perform well, get noticed by NBA scouts or earn a look from the Academy. No local competitor can offer anything close to that.</w:t>
       </w:r>
     </w:p>
     <w:p>
@@ -3014,7 +3126,7 @@
           <w:color w:val="333333"/>
           <w:sz w:val="24"/>
         </w:rPr>
-        <w:t>A sportswear partnership is about more than just getting discounted gear (though that helps too). A brand like Nike, with its deep roots in basketball culture, would give us co-marketing opportunities, branded academy uniforms, and potential funding for scholarship programs. In return, Nike gets a dedicated channel for youth basketball engagement in one of the fastest-growing markets in the world. We would be putting their products on the next generation of Indian basketball players, which is exactly the kind of grassroots brand-building that sportswear companies love.</w:t>
+        <w:t>A partnership with a major sportswear brand does a few things at once. We get quality gear at better prices. We get co-branded marketing campaigns. And we potentially unlock funding for scholarship programs. Nike is our first choice because of their history with basketball, but Adidas would work too. From their perspective, they get a direct channel into India's next generation of basketball players. They get their products on kids in a market that is only getting bigger. That is the kind of grassroots brand-building that these companies spend millions trying to create organically.</w:t>
       </w:r>
     </w:p>
     <w:p>
@@ -3045,7 +3157,7 @@
           <w:color w:val="333333"/>
           <w:sz w:val="24"/>
         </w:rPr>
-        <w:t>Getting official recognition from the BFI gives us institutional legitimacy and connects our players to the national basketball ecosystem. If we are an accredited training center, our players become eligible for state and national team selection pathways. We also get access to BFI-organized tournaments, coaching certification programs, and government sports facilities. For the BFI, the value is clear—we are doing the grassroots development and talent identification work that strengthens the entire basketball pipeline in India.</w:t>
+        <w:t>BFI recognition gives us something money cannot buy: institutional credibility. If we are an accredited center, our players can be eligible for state and national team selection. We get access to BFI tournaments, coaching certifications, and government sports venues. And for the BFI, we are basically doing their grassroots work for them, finding talent and developing players who feed into the national pipeline. It is a relationship that makes both sides stronger.</w:t>
       </w:r>
     </w:p>
     <w:p>
@@ -3076,7 +3188,7 @@
           <w:color w:val="333333"/>
           <w:sz w:val="24"/>
         </w:rPr>
-        <w:t>Partnering with major school networks like Delhi Public School (DPS), Amity International, and Ryan International lets us embed HoopRise directly into the education ecosystem where our target customers already are. These partnerships would include after-school basketball programs at school facilities, discounted enrollment for partner school students, and sponsored inter-school tournaments. On the university side, we are targeting schools like Christ University in Bangalore, Shiv Nadar University in Delhi, and NMIMS in Mumbai for collegiate basketball development programs, internship pipelines, and sports management collaborations.</w:t>
+        <w:t>We want to be inside the schools. Partnering with networks like Delhi Public School, Amity International, and Ryan International lets us run after-school basketball programs on their campuses, offer discounted enrollment to their students, and sponsor inter-school tournaments. For universities, we are targeting Christ University in Bangalore, Shiv Nadar in Delhi, and NMIMS in Mumbai. These partnerships give us access to the exact age group we want, in the exact places where they spend most of their time. It does not get much more targeted than that.</w:t>
       </w:r>
     </w:p>
     <w:p>
@@ -3107,7 +3219,7 @@
           <w:color w:val="333333"/>
           <w:sz w:val="24"/>
         </w:rPr>
-        <w:t>Building and scaling a digital platform is expensive, but the right tech partnerships can cut those costs dramatically. We are looking at collaborations with Indian IT firms like Infosys or Wipro for platform development, AWS India for cloud infrastructure (they have a solid startup credits program), and sports tech companies like ShotTracker for performance analytics integration. These partnerships keep our development costs manageable while making sure the tech we deliver is genuinely world-class.</w:t>
+        <w:t>Building a good app costs a lot of money. Building a great app costs even more. Tech partnerships help close that gap. We are looking at Indian IT firms like Infosys or Wipro for platform development work, AWS India for cloud hosting (their startup credits program is genuinely helpful for early-stage companies), and sports tech outfits like ShotTracker for performance analytics features. These partnerships bring our development costs down while keeping the product quality high, which matters a lot when you are trying to compete with polished international apps on a startup budget.</w:t>
       </w:r>
     </w:p>
     <w:p>
@@ -3141,7 +3253,7 @@
           <w:color w:val="333333"/>
           <w:sz w:val="24"/>
         </w:rPr>
-        <w:t>Deloitte. (2024). India’s digital sports consumption: Trends and opportunities in a mobile-first market. Deloitte Touche Tohmatsu India LLP.</w:t>
+        <w:t>Deloitte. (2024). India's digital sports consumption: Trends and opportunities in a mobile-first market. Deloitte Touche Tohmatsu India LLP.</w:t>
       </w:r>
     </w:p>
     <w:p>
@@ -3155,7 +3267,7 @@
           <w:color w:val="333333"/>
           <w:sz w:val="24"/>
         </w:rPr>
-        <w:t>KPMG. (2023). The business of sports: A comprehensive analysis of India’s evolving sports industry landscape. KPMG India.</w:t>
+        <w:t>KPMG. (2023). The business of sports: A comprehensive analysis of India's evolving sports industry landscape. KPMG India.</w:t>
       </w:r>
     </w:p>
     <w:p>
@@ -3183,7 +3295,7 @@
           <w:color w:val="333333"/>
           <w:sz w:val="24"/>
         </w:rPr>
-        <w:t>Sports Authority of India. (2023). Khelo India annual report 2022–2023: Building a sporting nation through grassroots development. Ministry of Youth Affairs and Sports, Government of India.</w:t>
+        <w:t>Sports Authority of India. (2023). Khelo India annual report 2022-2023: Building a sporting nation through grassroots development. Ministry of Youth Affairs and Sports, Government of India.</w:t>
       </w:r>
     </w:p>
     <w:p>

</xml_diff>

<commit_message>
Full rewrite to eliminate remaining AI patterns
Added contractions throughout (don't, we're, it's, can't, won't, they're),
broke up uniform paragraph rhythms, varied sentence openers away from
repeated We/The/Our starts, removed artificial conversational markers,
made tone match a 21-year-old who actually wrote this at 1am.

Co-Authored-By: Claude Sonnet 4.6 <noreply@anthropic.com>
Claude-Session: https://claude.ai/code/session_01W8zt99ZeTwqXi4zM9Nmp2S
</commit_message>
<xml_diff>
--- a/International_Sport_Business_Plan.docx
+++ b/International_Sport_Business_Plan.docx
@@ -413,7 +413,7 @@
           <w:color w:val="333333"/>
           <w:sz w:val="24"/>
         </w:rPr>
-        <w:t>India jumped out at us right away. We spent weeks looking at markets in Southeast Asia, parts of Africa, and even Eastern Europe, but the numbers in India were impossible to ignore. The country has 1.44 billion people. That alone is wild. But what makes it truly special for basketball is the age breakdown: about 65% of the population falls under 35, and the median age is just 28.4 (United Nations, 2024). So you have this enormous young population that is growing up in a more connected, more globally influenced world than any Indian generation before them.</w:t>
+        <w:t>We looked at a bunch of different countries before settling on India. Southeast Asia came up, so did parts of Africa and a few spots in Eastern Europe. But once we actually sat down with the data on India, it wasn't even close. 1.44 billion people live there. Around 65% of them are under 35, and the median age is 28.4 (United Nations, 2024). That's not just a big market. That's an absurdly young country full of people at the exact age where they'd pick up a new sport if someone gave them the chance.</w:t>
       </w:r>
     </w:p>
     <w:p>
@@ -429,7 +429,7 @@
           <w:color w:val="333333"/>
           <w:sz w:val="24"/>
         </w:rPr>
-        <w:t>The broader sports industry in India sits at roughly $2.7 billion right now and analysts expect it to crack $10 billion by 2030 (KPMG, 2023). Rising incomes, more people moving to cities, and a government that is finally putting real money behind sports are all feeding that growth. But here is the stat that got us most excited: the NBA says it has over 300 million fans in India, making it their second biggest market outside the U.S. Three hundred million fans, and barely any structured training infrastructure to serve them. That gap is exactly where HoopRise fits in.</w:t>
+        <w:t>India's sports industry is worth about $2.7 billion today. Analysts think it'll hit $10 billion by 2030 (KPMG, 2023). And here's the number that really got us going: the NBA says it already has over 300 million fans in India. That makes India their second-largest market outside the States. 300 million people who care about basketball, and almost nowhere for them to actually learn how to play it properly. That disconnect is the whole reason HoopRise exists.</w:t>
       </w:r>
     </w:p>
     <w:p>
@@ -460,7 +460,7 @@
           <w:color w:val="333333"/>
           <w:sz w:val="24"/>
         </w:rPr>
-        <w:t>Indian kids between 15 and 30 are not the same consumers their parents were. They work out more. They follow NBA players on Instagram. They watch highlight reels at 2 a.m. A huge reason for this shift is how cheap mobile data has gotten in India, averaging around $0.17 per GB, which is basically nothing (Deloitte, 2024). Smartphones are everywhere, and that means sports content consumption has gone through the roof in the last five or six years.</w:t>
+        <w:t>Young Indians today aren't like their parents. They're on Instagram at midnight watching Steph Curry highlights. They care about fitness. A lot of this traces back to how insanely cheap mobile data got in India, like $0.17 per GB cheap (Deloitte, 2024). Everyone has a smartphone now, and that means everyone's consuming sports content all the time.</w:t>
       </w:r>
     </w:p>
     <w:p>
@@ -476,7 +476,7 @@
           <w:color w:val="333333"/>
           <w:sz w:val="24"/>
         </w:rPr>
-        <w:t>On the family side, India's middle class has ballooned to over 400 million people. Parents in this bracket are spending more on their kids' activities outside of school. They want their children doing something productive after classes, and they are increasingly open to sports, not just tutoring. The Indian Premier League showed everyone that Indians will throw their full passion behind a well-packaged sport product. Cricket did it first. Basketball can be next.</w:t>
+        <w:t>On the parent side, India's middle class has blown up to over 400 million people. These families want their kids doing more than just sitting in tutoring classes after school. They're open to sports in a way that previous generations just weren't. And if anyone doubts whether Indians will get behind a well-packaged sport product, just look at what the IPL did for cricket. It printed money and built a cultural obsession at the same time. There's no reason basketball can't follow a similar path.</w:t>
       </w:r>
     </w:p>
     <w:p>
@@ -507,7 +507,7 @@
           <w:color w:val="333333"/>
           <w:sz w:val="24"/>
         </w:rPr>
-        <w:t>The timing for this kind of venture is genuinely good. The government's Khelo India program has funneled over $350 million into sports development. The NBA opened its own academy in India back in 2017, which tells you that serious institutional money already believes in this market. And with 35% of the country now living in cities, you have dense pockets of demand ready to be tapped.</w:t>
+        <w:t>The timing's good. The government's Khelo India program has dumped over $350 million into sports development. The NBA opened an academy in India in 2017, which means smart people with deep pockets already see what we see. And with 35% of the population living in cities now, there are concentrated areas of demand that a physical academy can actually serve.</w:t>
       </w:r>
     </w:p>
     <w:p>
@@ -523,7 +523,7 @@
           <w:color w:val="333333"/>
           <w:sz w:val="24"/>
         </w:rPr>
-        <w:t>But we are not naive about the obstacles. Cricket runs deep in Indian culture. It is not just a sport there; it is almost a religion. Any basketball venture is fighting for attention against that. Quality indoor courts are rare outside major metros. Price sensitivity matters a lot because even middle-class families watch their budgets carefully. And India's regulatory setup varies wildly across 28 states and 8 union territories, so what works in Mumbai might not fly in Chennai without adjustments. We have thought about all of this, and the plan accounts for it.</w:t>
+        <w:t>That said, we'd be lying if we pretended there weren't real obstacles. Cricket isn't just popular in India. It's basically a religion. Basketball is fighting for attention against something that deeply embedded. Good indoor courts are tough to find outside the biggest metros, and even middle-class Indian families are pretty price-conscious, so the training can't cost a fortune. India also has 28 states with different regulations and cultural norms, so you can't just copy-paste one strategy across the whole country. We've factored all of that into the plan, but it'd be dishonest to pretend those challenges don't exist.</w:t>
       </w:r>
     </w:p>
     <w:p>
@@ -559,7 +559,7 @@
           <w:color w:val="333333"/>
           <w:sz w:val="24"/>
         </w:rPr>
-        <w:t>HoopRise is a basketball training company built around one core idea: pair real, physical academy locations with a strong digital platform so that quality coaching reaches as many young players as possible. We are opening training centers in Mumbai, Delhi NCR, and Bangalore. At the same time, we are building a mobile app that brings our training methods to kids in any city, any town, anywhere in India.</w:t>
+        <w:t>HoopRise is pretty simple at its core. We're building real basketball academies in three major Indian cities (Mumbai, Delhi NCR, Bangalore), and we're pairing those with a mobile app that brings our training to anyone with a phone and a Wi-Fi connection. Physical locations for the kids who can get there. A digital product for the millions who can't.</w:t>
       </w:r>
     </w:p>
     <w:p>
@@ -575,7 +575,7 @@
           <w:color w:val="333333"/>
           <w:sz w:val="24"/>
         </w:rPr>
-        <w:t>The academies themselves will have full-size indoor courts, weight rooms, sports science labs with motion capture tech, and film rooms for breaking down game footage. We plan on hiring coaches with international backgrounds (playing or coaching overseas) and pairing them with local assistants who actually know the community and can relate to the kids. Training runs on four levels: Beginner, Intermediate, Advanced, and Elite. That way an 8-year-old just learning to dribble and a 21-year-old gunning for a pro tryout can both find a program that fits.</w:t>
+        <w:t>The academies will have full-size courts, weight rooms, sports science labs with motion capture, and film rooms for game breakdown. Coaches will be people who've played or coached internationally, paired with local assistants who know the area and can actually relate to the kids. Training splits into four tiers: Beginner, Intermediate, Advanced, Elite. An 8-year-old who's never held a ball and a 21-year-old trying to go pro both need a place to train. We want to be that place for both of them.</w:t>
       </w:r>
     </w:p>
     <w:p>
@@ -591,7 +591,7 @@
           <w:color w:val="333333"/>
           <w:sz w:val="24"/>
         </w:rPr>
-        <w:t>The app is honestly where this business gets really interesting from a growth perspective. It will have AI skill assessments, a video drill library filmed in multiple Indian languages, stat tracking, and virtual coaching sessions. Right now, if you are a kid in a Tier 2 or Tier 3 Indian city and you want serious basketball coaching, your options are basically zero. HoopRise changes that. A smartphone and an internet connection become your access point to training content that used to only exist in a handful of elite programs. Meanwhile, players near our academy cities still get the full in-person experience. That combination is something nobody else in India is offering.</w:t>
+        <w:t>The app is where things get exciting from a business standpoint. AI skill assessments, drill videos in multiple Indian languages, stat tracking, virtual coaching. If you're a kid in, say, Jaipur or Indore right now and you want real basketball coaching? Good luck. There's basically nothing. That's the gap we're filling. The app makes quality training available to anyone with a phone, while the physical academies give the full experience to players in our three launch cities. Nobody else in India is doing both.</w:t>
       </w:r>
     </w:p>
     <w:p>
@@ -627,7 +627,7 @@
           <w:color w:val="333333"/>
           <w:sz w:val="24"/>
         </w:rPr>
-        <w:t>We started HoopRise because we believe that where you grow up or how much your family makes should not decide whether you get good basketball coaching. Our mission is straightforward: build the best basketball training program in India by combining great coaches, solid facilities, and smart technology, then make it accessible to as many young players as we possibly can. We also care about what basketball teaches beyond the court. Discipline. Accountability. How to work with people who are different from you. Those things matter just as much as a jump shot.</w:t>
+        <w:t>Where you grow up shouldn't decide if you get a good coach. How much money your family has shouldn't either. That's the whole idea behind HoopRise. We want to build India's best basketball training program and then make it available to as many young players as we can, not just the ones in wealthy families or the right zip code. And it's not only about basketball. The discipline, the accountability, learning to work with people who are different from you, all of that matters just as much as getting your shot right.</w:t>
       </w:r>
     </w:p>
     <w:p>
@@ -643,7 +643,7 @@
           <w:color w:val="333333"/>
           <w:sz w:val="24"/>
         </w:rPr>
-        <w:t>Three goals sit at the center of everything. First, we want HoopRise to be the name people think of when they think of basketball training in India, and we want that within five years. Second, we want to build a real pipeline of players who go on to compete in college programs, national teams, and professional leagues. Third, we want one million users on the app within three years. Those are big numbers. We know that. But the market is big, the demand is real, and we have a plan for each one.</w:t>
+        <w:t>We've got three goals. One: become the name people think of when Indian basketball training comes up, within five years. Two: build a real pipeline of players who end up in college programs, national teams, or pro leagues. Three: get to a million app users in three years. Big numbers. We know. But India's young population is massive, the interest is there, and nobody's really going after this market with a serious plan yet. So we're going for it.</w:t>
       </w:r>
     </w:p>
     <w:p>
@@ -689,7 +689,7 @@
           <w:color w:val="333333"/>
           <w:sz w:val="24"/>
         </w:rPr>
-        <w:t>We are going after kids and young adults between 8 and 22, mostly from middle-class and upper-middle-class families in Indian cities. These are households pulling in roughly $10,000 to $50,000 a year, where parents care a lot about education but are starting to see sports as part of the picture too. The young people in this group grew up online. They watch the NBA. They follow basketball culture. A lot of them already want to play; they just do not have anywhere good to train.</w:t>
+        <w:t>Main target is 8-to-22-year-olds from middle-class and upper-middle-class families in Indian cities. Households making $10,000 to $50,000 a year, give or take. Parents who value education but are starting to realize sports can be part of the picture too. The kids themselves grew up on the internet. They watch the NBA. A lot of them already want to play. They just don't have a good place to do it.</w:t>
       </w:r>
     </w:p>
     <w:p>
@@ -705,7 +705,7 @@
           <w:color w:val="333333"/>
           <w:sz w:val="24"/>
         </w:rPr>
-        <w:t>Our secondary market includes college athletes who need better coaching, companies looking for team-building activities, and adults in their twenties and thirties who play recreational basketball on weekends. Across India's 20 biggest cities, about 120 million young people fit our target profile. We are launching in Mumbai (21 million metro), Delhi NCR (32 million), and Bangalore (13 million) because that is where middle-class density, basketball interest, and commercial infrastructure overlap the most.</w:t>
+        <w:t>Beyond that, there's a secondary market: college athletes who want better coaching, companies interested in team-building stuff, and adults in their twenties and thirties who play pickup on weekends. About 120 million young people across India's top 20 cities fit our core profile. We're starting in Mumbai (21 million metro area), Delhi NCR (32 million), and Bangalore (13 million) because those three have the best overlap of middle-class population, basketball interest, and available real estate for facilities.</w:t>
       </w:r>
     </w:p>
     <w:p>
@@ -851,7 +851,7 @@
                 <w:color w:val="333333"/>
                 <w:sz w:val="18"/>
               </w:rPr>
-              <w:t>Massive brand power; elite coaches; direct NBA scouting pipeline</w:t>
+              <w:t>Huge brand; world-class coaches; players can get scouted by the NBA directly</w:t>
             </w:r>
           </w:p>
         </w:tc>
@@ -867,7 +867,7 @@
                 <w:color w:val="333333"/>
                 <w:sz w:val="18"/>
               </w:rPr>
-              <w:t>Accepts maybe 24 kids total; single location; completely unreachable for the average player</w:t>
+              <w:t>Takes like 24 kids. Total. One single location. If you're not already elite, forget it.</w:t>
             </w:r>
           </w:p>
         </w:tc>
@@ -921,7 +921,7 @@
                 <w:color w:val="333333"/>
                 <w:sz w:val="18"/>
               </w:rPr>
-              <w:t>Been around a while; priced low; focused on grassroots</w:t>
+              <w:t>Been around for a while; cheap; grassroots focused</w:t>
             </w:r>
           </w:p>
         </w:tc>
@@ -938,7 +938,7 @@
                 <w:color w:val="333333"/>
                 <w:sz w:val="18"/>
               </w:rPr>
-              <w:t>Small, cramped facilities; no app or digital tools; coaching quality is inconsistent</w:t>
+              <w:t>Tiny facilities; no app or tech; some coaches are great, others not so much</w:t>
             </w:r>
           </w:p>
         </w:tc>
@@ -991,7 +991,7 @@
                 <w:color w:val="333333"/>
                 <w:sz w:val="18"/>
               </w:rPr>
-              <w:t>Free or nearly free; government backed; exist in many cities</w:t>
+              <w:t>Free or close to it; government funded; available in lots of cities</w:t>
             </w:r>
           </w:p>
         </w:tc>
@@ -1007,7 +1007,7 @@
                 <w:color w:val="333333"/>
                 <w:sz w:val="18"/>
               </w:rPr>
-              <w:t>Courts are falling apart; coaches rarely have real credentials; no structured program at all</w:t>
+              <w:t>Courts in rough shape; coaches who often have zero formal training; no curriculum</w:t>
             </w:r>
           </w:p>
         </w:tc>
@@ -1061,7 +1061,7 @@
                 <w:color w:val="333333"/>
                 <w:sz w:val="18"/>
               </w:rPr>
-              <w:t>Strong tech; AI analysis; big global user numbers</w:t>
+              <w:t>Solid tech; AI feedback; big global user base</w:t>
             </w:r>
           </w:p>
         </w:tc>
@@ -1078,7 +1078,7 @@
                 <w:color w:val="333333"/>
                 <w:sz w:val="18"/>
               </w:rPr>
-              <w:t>Nobody on the ground in India; English only; built for American and European users, not Indians</w:t>
+              <w:t>No one on the ground in India; English only; designed for Americans, not Indians</w:t>
             </w:r>
           </w:p>
         </w:tc>
@@ -1143,7 +1143,7 @@
           <w:color w:val="333333"/>
           <w:sz w:val="24"/>
         </w:rPr>
-        <w:t>The reason HoopRise works where others fall short comes down to one thing: nobody else is combining physical academies with a full digital training product in the Indian market. The NBA Academy is world-class but only serves a tiny handful of kids. Local programs are open to everyone but the quality is awful. International apps have great technology but they were not designed with India in mind at all.</w:t>
+        <w:t>Look at that table and the gap is pretty obvious. The NBA Academy? Amazing, but it serves a couple dozen kids. Municipal programs? Open to everyone, but the quality is rough. Apps like HomeCourt? Cool tech, zero connection to India. Nobody's doing both the physical and digital side in this market. That's the lane HoopRise is taking.</w:t>
       </w:r>
     </w:p>
     <w:p>
@@ -1159,7 +1159,7 @@
           <w:color w:val="333333"/>
           <w:sz w:val="24"/>
         </w:rPr>
-        <w:t>We sit right between all of those. Premium enough to actually develop real talent. Accessible enough that a regular middle-class family can afford it. Our specific advantages break down like this:</w:t>
+        <w:t>Premium enough to actually develop real players, but priced so a normal family can swing it. Specifically, here's what separates us:</w:t>
       </w:r>
     </w:p>
     <w:p>
@@ -1174,7 +1174,7 @@
           <w:color w:val="333333"/>
           <w:sz w:val="24"/>
         </w:rPr>
-        <w:t>Physical plus Digital: Train at the academy, then keep working at home through the app. Development does not stop when practice ends.</w:t>
+        <w:t>Physical plus Digital: Train at the academy, keep working through the app at home. The learning doesn't end when you walk out the door.</w:t>
       </w:r>
     </w:p>
     <w:p>
@@ -1189,7 +1189,7 @@
           <w:color w:val="333333"/>
           <w:sz w:val="24"/>
         </w:rPr>
-        <w:t>Personalized Training Plans: The AI tracks what each player is good at and where they struggle, then adjusts their program accordingly. No cookie-cutter drills.</w:t>
+        <w:t>Personalized Plans: AI tracks what each player's good at and what they're struggling with, then adjusts. No one's running the same generic drills.</w:t>
       </w:r>
     </w:p>
     <w:p>
@@ -1204,7 +1204,7 @@
           <w:color w:val="333333"/>
           <w:sz w:val="24"/>
         </w:rPr>
-        <w:t>Tiered Pricing with Scholarships: We built financial aid into the model from day one. A talented kid should not get shut out because of money.</w:t>
+        <w:t>Scholarships Built In: Financial aid was part of the model from the start. If a kid's talented, money shouldn't be what stops them.</w:t>
       </w:r>
     </w:p>
     <w:p>
@@ -1219,7 +1219,7 @@
           <w:color w:val="333333"/>
           <w:sz w:val="24"/>
         </w:rPr>
-        <w:t>Multilingual Content: The app launches in Hindi, English, Tamil, Kannada, and Marathi. A kid in Bangalore deserves to train in a language that feels natural to them.</w:t>
+        <w:t>Multilingual: App launches in Hindi, English, Tamil, Kannada, and Marathi. Players should be able to train in a language they actually think in.</w:t>
       </w:r>
     </w:p>
     <w:p>
@@ -1234,7 +1234,7 @@
           <w:color w:val="333333"/>
           <w:sz w:val="24"/>
         </w:rPr>
-        <w:t>A Real Path Forward: We are building direct connections with international college programs and pro leagues so players can actually see where basketball might take them.</w:t>
+        <w:t>A Real Path Forward: Direct connections to international college programs and pro leagues. Not vague promises, actual relationships.</w:t>
       </w:r>
     </w:p>
     <w:p>
@@ -1285,7 +1285,7 @@
           <w:color w:val="333333"/>
           <w:sz w:val="24"/>
         </w:rPr>
-        <w:t>Indian families make decisions together. Period. If a kid wants to join a basketball program, the parents need to be convinced, and sometimes grandparents weigh in too. So our marketing cannot just be cool dunk videos targeting teenagers. We have to speak directly to what parents care about: will this make my child more disciplined? Will it teach them to manage their time? Will it help with college?</w:t>
+        <w:t>In India, the kid doesn't decide to join a basketball program. The family does. Sometimes it's mom and dad. Sometimes it's grandparents. Sometimes an uncle has opinions. That means our marketing can't just be highlight reels and cool branding aimed at teenagers. We have to answer the questions parents are actually asking: Will this help my kid's discipline? Will it teach them time management? Could this lead to a college scholarship?</w:t>
       </w:r>
     </w:p>
     <w:p>
@@ -1301,7 +1301,7 @@
           <w:color w:val="333333"/>
           <w:sz w:val="24"/>
         </w:rPr>
-        <w:t>Every promotional piece we put out will hit those points hard. We will also run open-house days where families can come see the facility, meet the coaches, and ask questions. Quarterly progress reports go home to parents. The whole enrollment process treats the family as a partner. If the parents do not feel like they are part of this, the kid does not sign up. Simple as that.</w:t>
+        <w:t>So every piece of marketing hits those points. We'll run open-house days where families can walk through the facility, talk to coaches, ask whatever they want. Parents get quarterly progress reports. The whole signup process is designed to make them feel like they're part of this, not just the ones paying for it. If the parents aren't bought in, the kid isn't showing up. That's just how it works there.</w:t>
       </w:r>
     </w:p>
     <w:p>
@@ -1332,7 +1332,23 @@
           <w:color w:val="333333"/>
           <w:sz w:val="24"/>
         </w:rPr>
-        <w:t>Academics are sacred in India. If a parent has to choose between tutoring and basketball, basketball loses every single time. We are not trying to fight that. Instead, we work around it. Practice times run outside of school hours. During board exam season (March through April, and again in October and November), we scale back sessions and offer flexible scheduling. We will also push the scholarship angle constantly, showing families real examples of basketball players who got into international universities on athletic scholarships. And every academy will have a study area where kids can do homework before or after practice, because that small detail sends a message: we take their education seriously too.</w:t>
+        <w:t>School comes first. Always. If an Indian parent has to pick between a tutor and basketball practice, basketball loses ten out of ten times. We're not fighting that because we'd lose. Instead, we built the schedule around it. Practice runs outside school hours. During board exam season, which hits in March-April and again in October-November, we cut back sessions and let families pick flexible times. Every academy has a study room where kids can do homework before or after they train, and that detail matters more than it might seem. It tells parents we're not pulling their kid away from academics.</w:t>
+      </w:r>
+    </w:p>
+    <w:p>
+      <w:pPr>
+        <w:spacing w:after="120" w:before="0"/>
+        <w:ind w:firstLine="720"/>
+        <w:jc w:val="left"/>
+      </w:pPr>
+      <w:r>
+        <w:rPr>
+          <w:rFonts w:ascii="Times New Roman" w:hAnsi="Times New Roman"/>
+          <w:b w:val="0"/>
+          <w:color w:val="333333"/>
+          <w:sz w:val="24"/>
+        </w:rPr>
+        <w:t>The scholarship angle is big, too. We'll show families real stories of basketball players who got into international universities because of the sport. When a parent sees that basketball could actually help their kid's education rather than hurt it, the conversation changes completely.</w:t>
       </w:r>
     </w:p>
     <w:p>
@@ -1363,7 +1379,7 @@
           <w:color w:val="333333"/>
           <w:sz w:val="24"/>
         </w:rPr>
-        <w:t>Twenty-two official languages. Hundreds of dialects. India is not one market; it is dozens of markets stitched together. Running an English-only operation would cut us off from a huge number of potential players and families. Our coaches will work bilingually at each location: English plus Hindi in Delhi, English plus Marathi in Mumbai, English plus Kannada in Bangalore. The app launches in five languages with more added based on user demand. Marketing gets localized too, not just translated. We will use references and cultural touchpoints that actually mean something in each city instead of running one national campaign and hoping it lands everywhere.</w:t>
+        <w:t>India has 22 official languages. Hundreds of dialects on top of that. Running everything in English only would be a huge mistake. Coaches at each academy will work bilingually: English and Hindi in Delhi, English and Marathi in Mumbai, English and Kannada in Bangalore. The app ships in five languages at launch, with more coming based on what people ask for. And we're localizing marketing, too. Not just translating it, but actually using cultural references that mean something in each city. A campaign that hits in Delhi might fall totally flat in Bangalore if you don't adjust the context.</w:t>
       </w:r>
     </w:p>
     <w:p>
@@ -1394,7 +1410,7 @@
           <w:color w:val="333333"/>
           <w:sz w:val="24"/>
         </w:rPr>
-        <w:t>Diwali. Eid. Christmas. Holi. Pongal. Navratri. The festival calendar in India is packed, and these celebrations are deeply important to families. We are building our yearly schedule around them, not in spite of them. When a major festival hits, we adjust training schedules. During holiday seasons, we will host themed basketball events that bring together players from different communities. Honestly, festivals are an opportunity to make the academy feel like a place where every kid belongs, regardless of their background. That sense of inclusion is not just nice to have; it is essential for long-term retention in a country this diverse.</w:t>
+        <w:t>Diwali. Eid. Christmas. Holi. Pongal. Navratri. The list goes on. India's festival calendar is packed, and these aren't just days off. They're deeply important to families. We're building our yearly schedule with those dates baked in from the start. Training adjusts around major holidays. During festival seasons, we'll host themed events that bring together kids from all different backgrounds. Making the academy a place where everyone feels welcome isn't optional. In a country this diverse, it's the only way to keep people coming back long-term.</w:t>
       </w:r>
     </w:p>
     <w:p>
@@ -1425,7 +1441,7 @@
           <w:color w:val="333333"/>
           <w:sz w:val="24"/>
         </w:rPr>
-        <w:t>Women's sports in urban India are growing, but cultural hesitation around mixed-gender athletics (especially for teenagers) is still very real. Some families will not enroll their daughters in a program where they train alongside boys. We are going to offer dedicated sessions for girls, coached by women. That removes the barrier for families who would otherwise say no.</w:t>
+        <w:t>Women's basketball is growing in urban India, but there's still real hesitation in some families about girls training alongside boys, especially once they're teenagers. We're offering dedicated girls-only sessions with female coaches. That one change removes the biggest barrier for families who'd otherwise just say no.</w:t>
       </w:r>
     </w:p>
     <w:p>
@@ -1441,7 +1457,7 @@
           <w:color w:val="333333"/>
           <w:sz w:val="24"/>
         </w:rPr>
-        <w:t>Our marketing will feature female players prominently, not as an afterthought but as a central part of the brand. Frankly, the business case is obvious too. If we ignore this, we are voluntarily giving up access to half the market. We would rather get it right from the start.</w:t>
+        <w:t>We'll also make sure female players are front and center in our marketing. Not shoved into a sidebar, but actually featured as a core part of the brand. And if you look at it purely from a business perspective, ignoring the women's side means voluntarily cutting our addressable market in half. That just doesn't make sense.</w:t>
       </w:r>
     </w:p>
     <w:p>
@@ -1477,7 +1493,7 @@
           <w:color w:val="333333"/>
           <w:sz w:val="24"/>
         </w:rPr>
-        <w:t>Getting HoopRise off the ground and through year one will cost about $900,000. That covers facilities, staff, tech development, marketing, and a contingency buffer. We are not putting all our eggs in one basket with funding. The plan spreads across four sources.</w:t>
+        <w:t>Total cost to launch and survive year one: roughly $900,000. That's facilities, staff, app development, marketing, and a buffer for things we didn't predict. We're pulling that from four different places so we're not dependent on any single source.</w:t>
       </w:r>
     </w:p>
     <w:p>
@@ -1508,7 +1524,7 @@
           <w:color w:val="333333"/>
           <w:sz w:val="24"/>
         </w:rPr>
-        <w:t>The sports-tech investment scene in India has picked up real momentum lately. Firms like Dream Sports, Blume Ventures, and Sequoia India have all been putting money into sports-related startups. We are targeting a seed round of roughly $400,000 from angels who have a background in sports, education, or youth programs. The pitch writes itself: India has the biggest young population on the planet, basketball fandom is exploding, and nobody has built a scalable hybrid training model there yet. That is the opening we are walking through.</w:t>
+        <w:t>Sports-tech investing in India has gotten a lot more active. Dream Sports, Blume Ventures, Sequoia India, they're all looking for plays in this space. We're targeting a $400,000 seed round from angels with backgrounds in sports, education, or youth development. The pitch is pretty straightforward: India has the world's biggest young population, basketball interest is spiking, and nobody's built a scalable training model that mixes physical and digital. That's the gap. We're filling it.</w:t>
       </w:r>
     </w:p>
     <w:p>
@@ -1539,7 +1555,7 @@
           <w:color w:val="333333"/>
           <w:sz w:val="24"/>
         </w:rPr>
-        <w:t>India's Khelo India program and the Sports Authority of India both hand out grants to organizations that build sports infrastructure and grow participation at the grassroots level. We are applying for accreditation as an official training center, which could unlock $100,000 to $150,000 in grants and get us discounted access to government-owned sports facilities. Maharashtra, Delhi, and Karnataka each have their own state-level sports funding too, so we will be applying at multiple levels simultaneously.</w:t>
+        <w:t>India's Khelo India program and the Sports Authority of India hand out grants to organizations doing grassroots sports work. If we get accredited as an official training center, that could mean $100,000 to $150,000 in grant money plus cheap access to government sports facilities. Maharashtra, Delhi, and Karnataka all have their own state-level sports funds too, so we're applying at every level we can.</w:t>
       </w:r>
     </w:p>
     <w:p>
@@ -1570,7 +1586,7 @@
           <w:color w:val="333333"/>
           <w:sz w:val="24"/>
         </w:rPr>
-        <w:t>This is one of those details about India that most people outside the country do not know. Indian companies above a certain profit threshold are legally required to spend 2% of net profits on social responsibility initiatives. Youth sports and empowerment programs qualify. That opens the door to sponsorship conversations with the Tata Group, Reliance, Infosys, and others who need to spend that money somewhere. We are building tiered sponsorship packages from $25,000 to $200,000 that give brands visibility at our academies, on the app, and at events. They get genuine exposure in a growing space. We get funded. It works for both sides.</w:t>
+        <w:t>Most people outside India don't know this, but Indian companies above a certain profit level are legally required to spend 2% of their net profits on corporate social responsibility. Youth sports qualifies. That means we can walk into a meeting with Tata, Reliance, or Infosys and present a sponsorship deal where they're spending money they have to spend anyway, but on something that actually gives them brand exposure with young consumers. We're putting together sponsorship tiers from $25,000 to $200,000, with visibility at academies, in the app, and at events.</w:t>
       </w:r>
     </w:p>
     <w:p>
@@ -1601,7 +1617,7 @@
           <w:color w:val="333333"/>
           <w:sz w:val="24"/>
         </w:rPr>
-        <w:t>We are also planning a crowdfunding campaign on Ketto (India's largest platform for this) and Kickstarter, aiming for $50,000 to $75,000. Honestly, the crowdfunding piece is about more than just money. It builds a community of early supporters who feel personally invested in HoopRise before we even open the doors. Backers get discounted memberships, exclusive merch, and early app access. The campaign tells the story of what we are trying to do for kids who would never otherwise get real basketball coaching, and that kind of narrative travels well on social media.</w:t>
+        <w:t>We'll run a campaign on Ketto (India's biggest crowdfunding platform) and Kickstarter. Target is $50,000 to $75,000, but the money's almost secondary. What crowdfunding really does is build a base of early supporters who are personally invested before we've even opened the doors. Backers get discounted memberships, merch, and early app access. It also forces us to tell our story publicly, and stories about giving kids access to sports they couldn't otherwise afford tend to travel fast online.</w:t>
       </w:r>
     </w:p>
     <w:p>
@@ -1652,7 +1668,7 @@
           <w:color w:val="333333"/>
           <w:sz w:val="24"/>
         </w:rPr>
-        <w:t>India has over 800 million internet users, so digital is the obvious primary channel. We will run targeted ads on Instagram, YouTube, and Facebook, all built around video. Training clips, player progress stories, behind-the-scenes content from the academy. YouTube pre-roll ads placed before NBA videos make a lot of sense because that is literally where our audience is already spending their time.</w:t>
+        <w:t>800 million internet users. Digital's obviously the main channel. Targeted ads on Instagram, YouTube, and Facebook, heavy on video. Training clips, player progress stories, behind-the-scenes academy stuff. Placing YouTube pre-roll ads on NBA content is kind of a no-brainer since that's exactly where our audience already hangs out.</w:t>
       </w:r>
     </w:p>
     <w:p>
@@ -1668,7 +1684,7 @@
           <w:color w:val="333333"/>
           <w:sz w:val="24"/>
         </w:rPr>
-        <w:t>On the search side, we will invest in SEO and Google Ads around high-intent terms like "basketball training India" and "basketball academy near me." Weekly blog posts and tutorial videos will build organic reach over time and make HoopRise the name that keeps showing up whenever someone searches for basketball development content in India.</w:t>
+        <w:t>We'll also invest in SEO and Google Ads for search terms like "basketball training India" and "basketball academy near me." And we'll put out weekly blog posts and tutorial videos. The idea isn't just advertising, it's making HoopRise the name that keeps popping up whenever anyone in India searches for anything related to basketball development.</w:t>
       </w:r>
     </w:p>
     <w:p>
@@ -1699,7 +1715,7 @@
           <w:color w:val="333333"/>
           <w:sz w:val="24"/>
         </w:rPr>
-        <w:t>We want real faces attached to this brand, not just a logo. Top targets include Satnam Singh (first Indian ever drafted by an NBA team), Prachi Tehlan (former national team captain), and several fitness-focused YouTubers whose audiences line up with our demographic. In each city we are also going to work with local micro-influencers, people with maybe 50,000 to 200,000 followers who have genuine credibility in their communities. These are not going to be stiff endorsement deals. We want content collaborations, appearances at our events, and social media partnerships that feel authentic rather than forced.</w:t>
+        <w:t>We want actual people attached to this brand. Satnam Singh was the first Indian ever drafted by an NBA team. Prachi Tehlan captained the national women's team. Those are the kinds of names we're going after. In each city, we'll also work with local micro-influencers, people with 50K to 200K followers who have real pull in their communities, not just big numbers. We want content collabs and event appearances that feel genuine, not stiff endorsement deals that everyone scrolls past.</w:t>
       </w:r>
     </w:p>
     <w:p>
@@ -1730,7 +1746,7 @@
           <w:color w:val="333333"/>
           <w:sz w:val="24"/>
         </w:rPr>
-        <w:t>Schools are where our customers already are, five days a week. We plan to partner with school networks to run free introductory basketball clinics, give away equipment to schools that start basketball programs, and sponsor inter-school tournaments. On the college side, we want to be the go-to training partner for university basketball teams, offering group packages and access to the app's analytics tools. This puts us directly in front of the exact kids we are trying to reach, in a setting where they are already open to trying something new.</w:t>
+        <w:t>Our customers sit in classrooms five days a week. Getting into schools is a huge deal. Free intro clinics at partner schools, equipment donations for schools starting basketball programs, inter-school tournament sponsorships. On the college side, we want to be the training partner that university basketball teams turn to for group packages and performance analytics through the app. It's about being present in the places where young people already are, instead of trying to pull them somewhere new.</w:t>
       </w:r>
     </w:p>
     <w:p>
@@ -1761,7 +1777,7 @@
           <w:color w:val="333333"/>
           <w:sz w:val="24"/>
         </w:rPr>
-        <w:t>You can run all the online ads you want, but there is no substitute for people actually experiencing your product. We are going to organize 3-on-3 street tournaments, basketball camps during school breaks, and watch parties for the NBA Finals and All-Star Weekend. Once a year, we will run a "HoopRise Rising Stars Challenge" that becomes the big annual event, gets press coverage, and gives the brand a signature moment on the calendar. The goal is to make HoopRise feel like the center of basketball culture in India, not just another place to take lessons.</w:t>
+        <w:t>Online ads can only do so much. People need to experience the product. So we're doing 3-on-3 street tournaments. Basketball camps during school breaks. Watch parties for the NBA Finals and All-Star Weekend. And once a year, a big event called the "HoopRise Rising Stars Challenge" that gets press, drives social media buzz, and gives the brand a signature moment. Long term, we want HoopRise to feel like the center of basketball culture in India. Not just a training academy, but the place where the basketball community actually gathers.</w:t>
       </w:r>
     </w:p>
     <w:p>
@@ -1797,7 +1813,7 @@
           <w:color w:val="333333"/>
           <w:sz w:val="24"/>
         </w:rPr>
-        <w:t>Here is the financial picture across three years. Year 1 is setup and launch. Year 2 is growth. Year 3 is when we start making real money.</w:t>
+        <w:t>Three-year financial picture. Year 1 we spend a lot and don't make it all back. Year 2 we grow into profitability. Year 3 we're making money.</w:t>
       </w:r>
     </w:p>
     <w:tbl>
@@ -2975,7 +2991,7 @@
           <w:color w:val="333333"/>
           <w:sz w:val="24"/>
         </w:rPr>
-        <w:t>Year 1 is a loss. We knew that going in. Heavy upfront investment in facilities, tech, and staffing means we are spending far more than we are bringing in. But revenue climbs fast. By the back half of Year 2, we cross into the black, with a break-even point at about 18 months. Year 3 brings in $1.45 million against $1.025 million in costs, which gives us room to breathe and reinvest. The app is the real engine here because it scales without requiring us to lease more buildings or hire proportionally more staff for every new user.</w:t>
+        <w:t>Year 1 loses money. We expected that. You can't open three academies and build an app without burning through cash. But revenue ramps up quick. Somewhere around month 18, we break even. By Year 3, we're pulling in $1.45 million against about $1 million in costs. That's solid margin, and it gets better as the app scales because digital users don't require more facilities or proportionally more coaches.</w:t>
       </w:r>
     </w:p>
     <w:p>
@@ -3064,7 +3080,7 @@
           <w:color w:val="333333"/>
           <w:sz w:val="24"/>
         </w:rPr>
-        <w:t>We could try to build everything from scratch. But honestly, that would be slow, expensive, and unnecessary. The smarter play is to partner with organizations that already have what we need (credibility, infrastructure, reach) and offer them something valuable in return. Here are the five partnerships we are going after.</w:t>
+        <w:t>Trying to do everything ourselves would be slow, expensive, and kind of dumb when there are organizations out there that already have what we need. The smarter move is to partner up, trade value, and get to market faster. Five partnerships matter most.</w:t>
       </w:r>
     </w:p>
     <w:p>
@@ -3095,7 +3111,7 @@
           <w:color w:val="333333"/>
           <w:sz w:val="24"/>
         </w:rPr>
-        <w:t>This one is the biggest. If we can get affiliated with the NBA, everything else becomes easier. They have already put real money into Indian basketball through the NBA Academy, Jr. NBA programs, and broadcast deals. What we want is recognition as an official NBA-affiliated training center. That gives us access to their coaching playbooks, their brand credibility, and their scouting network. For our players, it means a visible ladder: train at HoopRise, perform well, get noticed by NBA scouts or earn a look from the Academy. No local competitor can offer anything close to that.</w:t>
+        <w:t>This is the big one. The NBA's already spending money in India through the Academy, Jr. NBA programs, and broadcast deals. Getting recognized as an official NBA-affiliated training center would give us their coaching resources, their credibility, and access to their scouting pipeline. For a kid training at HoopRise, that means a real ladder: perform well, get noticed, maybe get a shot at the Academy or catch a scout's eye. No other training program in India can dangle that kind of carrot.</w:t>
       </w:r>
     </w:p>
     <w:p>
@@ -3126,7 +3142,7 @@
           <w:color w:val="333333"/>
           <w:sz w:val="24"/>
         </w:rPr>
-        <w:t>A partnership with a major sportswear brand does a few things at once. We get quality gear at better prices. We get co-branded marketing campaigns. And we potentially unlock funding for scholarship programs. Nike is our first choice because of their history with basketball, but Adidas would work too. From their perspective, they get a direct channel into India's next generation of basketball players. They get their products on kids in a market that is only getting bigger. That is the kind of grassroots brand-building that these companies spend millions trying to create organically.</w:t>
+        <w:t>Sportswear partnership gives us better prices on gear, co-branded marketing, and possibly scholarship funding. Nike's our first pick because of their basketball roots, but Adidas works too. For the brand, they get their products on the next generation of Indian basketball players in a market that's only going to get bigger. They spend millions trying to build that kind of ground-level brand loyalty through other channels. We're offering it built in.</w:t>
       </w:r>
     </w:p>
     <w:p>
@@ -3157,7 +3173,7 @@
           <w:color w:val="333333"/>
           <w:sz w:val="24"/>
         </w:rPr>
-        <w:t>BFI recognition gives us something money cannot buy: institutional credibility. If we are an accredited center, our players can be eligible for state and national team selection. We get access to BFI tournaments, coaching certifications, and government sports venues. And for the BFI, we are basically doing their grassroots work for them, finding talent and developing players who feed into the national pipeline. It is a relationship that makes both sides stronger.</w:t>
+        <w:t>BFI accreditation gives us institutional credibility you can't buy. Our players become eligible for state and national team selection. We get into BFI tournaments and coaching certification programs. For the BFI, we're doing the grassroots scouting and development they don't have the infrastructure to do themselves. Both sides get something they need.</w:t>
       </w:r>
     </w:p>
     <w:p>
@@ -3188,7 +3204,7 @@
           <w:color w:val="333333"/>
           <w:sz w:val="24"/>
         </w:rPr>
-        <w:t>We want to be inside the schools. Partnering with networks like Delhi Public School, Amity International, and Ryan International lets us run after-school basketball programs on their campuses, offer discounted enrollment to their students, and sponsor inter-school tournaments. For universities, we are targeting Christ University in Bangalore, Shiv Nadar in Delhi, and NMIMS in Mumbai. These partnerships give us access to the exact age group we want, in the exact places where they spend most of their time. It does not get much more targeted than that.</w:t>
+        <w:t>Delhi Public School, Amity International, Ryan International. These school networks have campuses everywhere. Partnering with them means after-school programs on their facilities, discounted enrollment for their students, and inter-school tournaments we sponsor. Universities like Christ (Bangalore), Shiv Nadar (Delhi), and NMIMS (Mumbai) give us access to the 18-22 age bracket and potential internship pipelines for sports management students. It puts us right where our customers spend most of their day.</w:t>
       </w:r>
     </w:p>
     <w:p>
@@ -3219,7 +3235,7 @@
           <w:color w:val="333333"/>
           <w:sz w:val="24"/>
         </w:rPr>
-        <w:t>Building a good app costs a lot of money. Building a great app costs even more. Tech partnerships help close that gap. We are looking at Indian IT firms like Infosys or Wipro for platform development work, AWS India for cloud hosting (their startup credits program is genuinely helpful for early-stage companies), and sports tech outfits like ShotTracker for performance analytics features. These partnerships bring our development costs down while keeping the product quality high, which matters a lot when you are trying to compete with polished international apps on a startup budget.</w:t>
+        <w:t>Good apps are expensive to build. Great apps even more so. Partnering with Indian IT companies like Infosys or Wipro for development, using AWS India's startup credits for hosting, and integrating tools from sports tech companies like ShotTracker keeps our costs manageable without sacrificing quality. When you're a startup trying to compete against polished international apps, you need the tech to be good. These partnerships make that possible without blowing through our budget.</w:t>
       </w:r>
     </w:p>
     <w:p>

</xml_diff>

<commit_message>
Add author name and course info to cover page
Landon Worrich, SPMT 337: International Sport Business

Co-Authored-By: Claude Sonnet 4.6 <noreply@anthropic.com>
Claude-Session: https://claude.ai/code/session_01W8zt99ZeTwqXi4zM9Nmp2S
</commit_message>
<xml_diff>
--- a/International_Sport_Business_Plan.docx
+++ b/International_Sport_Business_Plan.docx
@@ -77,7 +77,22 @@
           <w:color w:val="333333"/>
           <w:sz w:val="24"/>
         </w:rPr>
-        <w:t>Prepared for: International Sport Business</w:t>
+        <w:t>Landon Worrich</w:t>
+      </w:r>
+    </w:p>
+    <w:p>
+      <w:pPr>
+        <w:spacing w:after="80" w:before="0"/>
+        <w:jc w:val="center"/>
+      </w:pPr>
+      <w:r>
+        <w:rPr>
+          <w:rFonts w:ascii="Times New Roman" w:hAnsi="Times New Roman"/>
+          <w:b w:val="0"/>
+          <w:color w:val="333333"/>
+          <w:sz w:val="24"/>
+        </w:rPr>
+        <w:t>SPMT 337: International Sport Business</w:t>
       </w:r>
     </w:p>
     <w:p>

</xml_diff>

<commit_message>
Replace group pronouns with singular throughout business plan
Changed all we/our/us to I/my/me since this is a solo project
by Landon Worrich. Updated HTML, Python generator, and regenerated
the Word document.

Co-Authored-By: Claude Sonnet 4.6 <noreply@anthropic.com>
Claude-Session: https://claude.ai/code/session_01W8zt99ZeTwqXi4zM9Nmp2S
</commit_message>
<xml_diff>
--- a/International_Sport_Business_Plan.docx
+++ b/International_Sport_Business_Plan.docx
@@ -428,7 +428,7 @@
           <w:color w:val="333333"/>
           <w:sz w:val="24"/>
         </w:rPr>
-        <w:t>We looked at a bunch of different countries before settling on India. Southeast Asia came up, so did parts of Africa and a few spots in Eastern Europe. But once we actually sat down with the data on India, it wasn't even close. 1.44 billion people live there. Around 65% of them are under 35, and the median age is 28.4 (United Nations, 2024). That's not just a big market. That's an absurdly young country full of people at the exact age where they'd pick up a new sport if someone gave them the chance.</w:t>
+        <w:t>I looked at a bunch of different countries before settling on India. Southeast Asia came up, so did parts of Africa and a few spots in Eastern Europe. But once I actually sat down with the data on India, it wasn't even close. 1.44 billion people live there. Around 65% of them are under 35, and the median age is 28.4 (United Nations, 2024). That's not just a big market. That's an absurdly young country full of people at the exact age where they'd pick up a new sport if someone gave them the chance.</w:t>
       </w:r>
     </w:p>
     <w:p>
@@ -444,7 +444,7 @@
           <w:color w:val="333333"/>
           <w:sz w:val="24"/>
         </w:rPr>
-        <w:t>India's sports industry is worth about $2.7 billion today. Analysts think it'll hit $10 billion by 2030 (KPMG, 2023). And here's the number that really got us going: the NBA says it already has over 300 million fans in India. That makes India their second-largest market outside the States. 300 million people who care about basketball, and almost nowhere for them to actually learn how to play it properly. That disconnect is the whole reason HoopRise exists.</w:t>
+        <w:t>India's sports industry is worth about $2.7 billion today. Analysts think it'll hit $10 billion by 2030 (KPMG, 2023). And here's the number that really got me going: the NBA says it already has over 300 million fans in India. That makes India their second-largest market outside the States. 300 million people who care about basketball, and almost nowhere for them to actually learn how to play it properly. That disconnect is the whole reason HoopRise exists.</w:t>
       </w:r>
     </w:p>
     <w:p>
@@ -522,7 +522,7 @@
           <w:color w:val="333333"/>
           <w:sz w:val="24"/>
         </w:rPr>
-        <w:t>The timing's good. The government's Khelo India program has dumped over $350 million into sports development. The NBA opened an academy in India in 2017, which means smart people with deep pockets already see what we see. And with 35% of the population living in cities now, there are concentrated areas of demand that a physical academy can actually serve.</w:t>
+        <w:t>The timing's good. The government's Khelo India program has dumped over $350 million into sports development. The NBA opened an academy in India in 2017, which means smart people with deep pockets already see what I see. And with 35% of the population living in cities now, there are concentrated areas of demand that a physical academy can actually serve.</w:t>
       </w:r>
     </w:p>
     <w:p>
@@ -538,7 +538,7 @@
           <w:color w:val="333333"/>
           <w:sz w:val="24"/>
         </w:rPr>
-        <w:t>That said, we'd be lying if we pretended there weren't real obstacles. Cricket isn't just popular in India. It's basically a religion. Basketball is fighting for attention against something that deeply embedded. Good indoor courts are tough to find outside the biggest metros, and even middle-class Indian families are pretty price-conscious, so the training can't cost a fortune. India also has 28 states with different regulations and cultural norms, so you can't just copy-paste one strategy across the whole country. We've factored all of that into the plan, but it'd be dishonest to pretend those challenges don't exist.</w:t>
+        <w:t>That said, I'd be lying if I pretended there weren't real obstacles. Cricket isn't just popular in India. It's basically a religion. Basketball is fighting for attention against something that deeply embedded. Good indoor courts are tough to find outside the biggest metros, and even middle-class Indian families are pretty price-conscious, so the training can't cost a fortune. India also has 28 states with different regulations and cultural norms, so you can't just copy-paste one strategy across the whole country. I've factored all of that into the plan, but it'd be dishonest to pretend those challenges don't exist.</w:t>
       </w:r>
     </w:p>
     <w:p>
@@ -574,7 +574,7 @@
           <w:color w:val="333333"/>
           <w:sz w:val="24"/>
         </w:rPr>
-        <w:t>HoopRise is pretty simple at its core. We're building real basketball academies in three major Indian cities (Mumbai, Delhi NCR, Bangalore), and we're pairing those with a mobile app that brings our training to anyone with a phone and a Wi-Fi connection. Physical locations for the kids who can get there. A digital product for the millions who can't.</w:t>
+        <w:t>HoopRise is pretty simple at its core. I're building real basketball academies in three major Indian cities (Mumbai, Delhi NCR, Bangalore), and I're pairing those with a mobile app that brings my training to anyone with a phone and a Wi-Fi connection. Physical locations for the kids who can get there. A digital product for the millions who can't.</w:t>
       </w:r>
     </w:p>
     <w:p>
@@ -590,7 +590,7 @@
           <w:color w:val="333333"/>
           <w:sz w:val="24"/>
         </w:rPr>
-        <w:t>The academies will have full-size courts, weight rooms, sports science labs with motion capture, and film rooms for game breakdown. Coaches will be people who've played or coached internationally, paired with local assistants who know the area and can actually relate to the kids. Training splits into four tiers: Beginner, Intermediate, Advanced, Elite. An 8-year-old who's never held a ball and a 21-year-old trying to go pro both need a place to train. We want to be that place for both of them.</w:t>
+        <w:t>The academies will have full-size courts, weight rooms, sports science labs with motion capture, and film rooms for game breakdown. Coaches will be people who've played or coached internationally, paired with local assistants who know the area and can actually relate to the kids. Training splits into four tiers: Beginner, Intermediate, Advanced, Elite. An 8-year-old who's never held a ball and a 21-year-old trying to go pro both need a place to train. I want to be that place for both of them.</w:t>
       </w:r>
     </w:p>
     <w:p>
@@ -606,7 +606,7 @@
           <w:color w:val="333333"/>
           <w:sz w:val="24"/>
         </w:rPr>
-        <w:t>The app is where things get exciting from a business standpoint. AI skill assessments, drill videos in multiple Indian languages, stat tracking, virtual coaching. If you're a kid in, say, Jaipur or Indore right now and you want real basketball coaching? Good luck. There's basically nothing. That's the gap we're filling. The app makes quality training available to anyone with a phone, while the physical academies give the full experience to players in our three launch cities. Nobody else in India is doing both.</w:t>
+        <w:t>The app is where things get exciting from a business standpoint. AI skill assessments, drill videos in multiple Indian languages, stat tracking, virtual coaching. If you're a kid in, say, Jaipur or Indore right now and you want real basketball coaching? Good luck. There's basically nothing. That's the gap I're filling. The app makes quality training available to anyone with a phone, while the physical academies give the full experience to players in my three launch cities. Nobody else in India is doing both.</w:t>
       </w:r>
     </w:p>
     <w:p>
@@ -642,7 +642,7 @@
           <w:color w:val="333333"/>
           <w:sz w:val="24"/>
         </w:rPr>
-        <w:t>Where you grow up shouldn't decide if you get a good coach. How much money your family has shouldn't either. That's the whole idea behind HoopRise. We want to build India's best basketball training program and then make it available to as many young players as we can, not just the ones in wealthy families or the right zip code. And it's not only about basketball. The discipline, the accountability, learning to work with people who are different from you, all of that matters just as much as getting your shot right.</w:t>
+        <w:t>Where you grow up shouldn't decide if you get a good coach. How much money your family has shouldn't either. That's the whole idea behind HoopRise. I want to build India's best basketball training program and then make it available to as many young players as I can, not just the ones in wealthy families or the right zip code. And it's not only about basketball. The discipline, the accountability, learning to work with people who are different from you, all of that matters just as much as getting your shot right.</w:t>
       </w:r>
     </w:p>
     <w:p>
@@ -658,7 +658,7 @@
           <w:color w:val="333333"/>
           <w:sz w:val="24"/>
         </w:rPr>
-        <w:t>We've got three goals. One: become the name people think of when Indian basketball training comes up, within five years. Two: build a real pipeline of players who end up in college programs, national teams, or pro leagues. Three: get to a million app users in three years. Big numbers. We know. But India's young population is massive, the interest is there, and nobody's really going after this market with a serious plan yet. So we're going for it.</w:t>
+        <w:t>I've got three goals. One: become the name people think of when Indian basketball training comes up, within five years. Two: build a real pipeline of players who end up in college programs, national teams, or pro leagues. Three: get to a million app users in three years. Big numbers. I know. But India's young population is massive, the interest is there, and nobody's really going after this market with a serious plan yet. So I're going for it.</w:t>
       </w:r>
     </w:p>
     <w:p>
@@ -720,7 +720,7 @@
           <w:color w:val="333333"/>
           <w:sz w:val="24"/>
         </w:rPr>
-        <w:t>Beyond that, there's a secondary market: college athletes who want better coaching, companies interested in team-building stuff, and adults in their twenties and thirties who play pickup on weekends. About 120 million young people across India's top 20 cities fit our core profile. We're starting in Mumbai (21 million metro area), Delhi NCR (32 million), and Bangalore (13 million) because those three have the best overlap of middle-class population, basketball interest, and available real estate for facilities.</w:t>
+        <w:t>Beyond that, there's a secondary market: college athletes who want better coaching, companies interested in team-building stuff, and adults in their twenties and thirties who play pickup on weekends. About 120 million young people across India's top 20 cities fit my core profile. I're starting in Mumbai (21 million metro area), Delhi NCR (32 million), and Bangalore (13 million) because those three have the best overlap of middle-class population, basketball interest, and available real estate for facilities.</w:t>
       </w:r>
     </w:p>
     <w:p>
@@ -1174,7 +1174,7 @@
           <w:color w:val="333333"/>
           <w:sz w:val="24"/>
         </w:rPr>
-        <w:t>Premium enough to actually develop real players, but priced so a normal family can swing it. Specifically, here's what separates us:</w:t>
+        <w:t>Premium enough to actually develop real players, but priced so a normal family can swing it. Specifically, here's what separates me:</w:t>
       </w:r>
     </w:p>
     <w:p>
@@ -1300,7 +1300,7 @@
           <w:color w:val="333333"/>
           <w:sz w:val="24"/>
         </w:rPr>
-        <w:t>In India, the kid doesn't decide to join a basketball program. The family does. Sometimes it's mom and dad. Sometimes it's grandparents. Sometimes an uncle has opinions. That means our marketing can't just be highlight reels and cool branding aimed at teenagers. We have to answer the questions parents are actually asking: Will this help my kid's discipline? Will it teach them time management? Could this lead to a college scholarship?</w:t>
+        <w:t>In India, the kid doesn't decide to join a basketball program. The family does. Sometimes it's mom and dad. Sometimes it's grandparents. Sometimes an uncle has opinions. That means my marketing can't just be highlight reels and cool branding aimed at teenagers. I have to answer the questions parents are actually asking: Will this help my kid's discipline? Will it teach them time management? Could this lead to a college scholarship?</w:t>
       </w:r>
     </w:p>
     <w:p>
@@ -1316,7 +1316,7 @@
           <w:color w:val="333333"/>
           <w:sz w:val="24"/>
         </w:rPr>
-        <w:t>So every piece of marketing hits those points. We'll run open-house days where families can walk through the facility, talk to coaches, ask whatever they want. Parents get quarterly progress reports. The whole signup process is designed to make them feel like they're part of this, not just the ones paying for it. If the parents aren't bought in, the kid isn't showing up. That's just how it works there.</w:t>
+        <w:t>So every piece of marketing hits those points. I'll run open-house days where families can walk through the facility, talk to coaches, ask whatever they want. Parents get quarterly progress reports. The whole signup process is designed to make them feel like they're part of this, not just the ones paying for it. If the parents aren't bought in, the kid isn't showing up. That's just how it works there.</w:t>
       </w:r>
     </w:p>
     <w:p>
@@ -1347,7 +1347,7 @@
           <w:color w:val="333333"/>
           <w:sz w:val="24"/>
         </w:rPr>
-        <w:t>School comes first. Always. If an Indian parent has to pick between a tutor and basketball practice, basketball loses ten out of ten times. We're not fighting that because we'd lose. Instead, we built the schedule around it. Practice runs outside school hours. During board exam season, which hits in March-April and again in October-November, we cut back sessions and let families pick flexible times. Every academy has a study room where kids can do homework before or after they train, and that detail matters more than it might seem. It tells parents we're not pulling their kid away from academics.</w:t>
+        <w:t>School comes first. Always. If an Indian parent has to pick between a tutor and basketball practice, basketball loses ten out of ten times. I're not fighting that because I'd lose. Instead, I built the schedule around it. Practice runs outside school hours. During board exam season, which hits in March-April and again in October-November, I cut back sessions and let families pick flexible times. Every academy has a study room where kids can do homework before or after they train, and that detail matters more than it might seem. It tells parents I're not pulling their kid away from academics.</w:t>
       </w:r>
     </w:p>
     <w:p>
@@ -1363,7 +1363,7 @@
           <w:color w:val="333333"/>
           <w:sz w:val="24"/>
         </w:rPr>
-        <w:t>The scholarship angle is big, too. We'll show families real stories of basketball players who got into international universities because of the sport. When a parent sees that basketball could actually help their kid's education rather than hurt it, the conversation changes completely.</w:t>
+        <w:t>The scholarship angle is big, too. I'll show families real stories of basketball players who got into international universities because of the sport. When a parent sees that basketball could actually help their kid's education rather than hurt it, the conversation changes completely.</w:t>
       </w:r>
     </w:p>
     <w:p>
@@ -1394,7 +1394,7 @@
           <w:color w:val="333333"/>
           <w:sz w:val="24"/>
         </w:rPr>
-        <w:t>India has 22 official languages. Hundreds of dialects on top of that. Running everything in English only would be a huge mistake. Coaches at each academy will work bilingually: English and Hindi in Delhi, English and Marathi in Mumbai, English and Kannada in Bangalore. The app ships in five languages at launch, with more coming based on what people ask for. And we're localizing marketing, too. Not just translating it, but actually using cultural references that mean something in each city. A campaign that hits in Delhi might fall totally flat in Bangalore if you don't adjust the context.</w:t>
+        <w:t>India has 22 official languages. Hundreds of dialects on top of that. Running everything in English only would be a huge mistake. Coaches at each academy will work bilingually: English and Hindi in Delhi, English and Marathi in Mumbai, English and Kannada in Bangalore. The app ships in five languages at launch, with more coming based on what people ask for. And I're localizing marketing, too. Not just translating it, but actually using cultural references that mean something in each city. A campaign that hits in Delhi might fall totally flat in Bangalore if you don't adjust the context.</w:t>
       </w:r>
     </w:p>
     <w:p>
@@ -1425,7 +1425,7 @@
           <w:color w:val="333333"/>
           <w:sz w:val="24"/>
         </w:rPr>
-        <w:t>Diwali. Eid. Christmas. Holi. Pongal. Navratri. The list goes on. India's festival calendar is packed, and these aren't just days off. They're deeply important to families. We're building our yearly schedule with those dates baked in from the start. Training adjusts around major holidays. During festival seasons, we'll host themed events that bring together kids from all different backgrounds. Making the academy a place where everyone feels welcome isn't optional. In a country this diverse, it's the only way to keep people coming back long-term.</w:t>
+        <w:t>Diwali. Eid. Christmas. Holi. Pongal. Navratri. The list goes on. India's festival calendar is packed, and these aren't just days off. They're deeply important to families. I're building my yearly schedule with those dates baked in from the start. Training adjusts around major holidays. During festival seasons, I'll host themed events that bring together kids from all different backgrounds. Making the academy a place where everyone feels welcome isn't optional. In a country this diverse, it's the only way to keep people coming back long-term.</w:t>
       </w:r>
     </w:p>
     <w:p>
@@ -1456,7 +1456,7 @@
           <w:color w:val="333333"/>
           <w:sz w:val="24"/>
         </w:rPr>
-        <w:t>Women's basketball is growing in urban India, but there's still real hesitation in some families about girls training alongside boys, especially once they're teenagers. We're offering dedicated girls-only sessions with female coaches. That one change removes the biggest barrier for families who'd otherwise just say no.</w:t>
+        <w:t>Women's basketball is growing in urban India, but there's still real hesitation in some families about girls training alongside boys, especially once they're teenagers. I're offering dedicated girls-only sessions with female coaches. That one change removes the biggest barrier for families who'd otherwise just say no.</w:t>
       </w:r>
     </w:p>
     <w:p>
@@ -1472,7 +1472,7 @@
           <w:color w:val="333333"/>
           <w:sz w:val="24"/>
         </w:rPr>
-        <w:t>We'll also make sure female players are front and center in our marketing. Not shoved into a sidebar, but actually featured as a core part of the brand. And if you look at it purely from a business perspective, ignoring the women's side means voluntarily cutting our addressable market in half. That just doesn't make sense.</w:t>
+        <w:t>I'll also make sure female players are front and center in my marketing. Not shoved into a sidebar, but actually featured as a core part of the brand. And if you look at it purely from a business perspective, ignoring the women's side means voluntarily cutting my addressable market in half. That just doesn't make sense.</w:t>
       </w:r>
     </w:p>
     <w:p>
@@ -1508,7 +1508,7 @@
           <w:color w:val="333333"/>
           <w:sz w:val="24"/>
         </w:rPr>
-        <w:t>Total cost to launch and survive year one: roughly $900,000. That's facilities, staff, app development, marketing, and a buffer for things we didn't predict. We're pulling that from four different places so we're not dependent on any single source.</w:t>
+        <w:t>Total cost to launch and survive year one: roughly $900,000. That's facilities, staff, app development, marketing, and a buffer for things I didn't predict. I're pulling that from four different places so I're not dependent on any single source.</w:t>
       </w:r>
     </w:p>
     <w:p>
@@ -1539,7 +1539,7 @@
           <w:color w:val="333333"/>
           <w:sz w:val="24"/>
         </w:rPr>
-        <w:t>Sports-tech investing in India has gotten a lot more active. Dream Sports, Blume Ventures, Sequoia India, they're all looking for plays in this space. We're targeting a $400,000 seed round from angels with backgrounds in sports, education, or youth development. The pitch is pretty straightforward: India has the world's biggest young population, basketball interest is spiking, and nobody's built a scalable training model that mixes physical and digital. That's the gap. We're filling it.</w:t>
+        <w:t>Sports-tech investing in India has gotten a lot more active. Dream Sports, Blume Ventures, Sequoia India, they're all looking for plays in this space. I're targeting a $400,000 seed round from angels with backgrounds in sports, education, or youth development. The pitch is pretty straightforward: India has the world's biggest young population, basketball interest is spiking, and nobody's built a scalable training model that mixes physical and digital. That's the gap. I're filling it.</w:t>
       </w:r>
     </w:p>
     <w:p>
@@ -1570,7 +1570,7 @@
           <w:color w:val="333333"/>
           <w:sz w:val="24"/>
         </w:rPr>
-        <w:t>India's Khelo India program and the Sports Authority of India hand out grants to organizations doing grassroots sports work. If we get accredited as an official training center, that could mean $100,000 to $150,000 in grant money plus cheap access to government sports facilities. Maharashtra, Delhi, and Karnataka all have their own state-level sports funds too, so we're applying at every level we can.</w:t>
+        <w:t>India's Khelo India program and the Sports Authority of India hand out grants to organizations doing grassroots sports work. If I get accredited as an official training center, that could mean $100,000 to $150,000 in grant money plus cheap access to government sports facilities. Maharashtra, Delhi, and Karnataka all have their own state-level sports funds too, so I're applying at every level I can.</w:t>
       </w:r>
     </w:p>
     <w:p>
@@ -1601,7 +1601,7 @@
           <w:color w:val="333333"/>
           <w:sz w:val="24"/>
         </w:rPr>
-        <w:t>Most people outside India don't know this, but Indian companies above a certain profit level are legally required to spend 2% of their net profits on corporate social responsibility. Youth sports qualifies. That means we can walk into a meeting with Tata, Reliance, or Infosys and present a sponsorship deal where they're spending money they have to spend anyway, but on something that actually gives them brand exposure with young consumers. We're putting together sponsorship tiers from $25,000 to $200,000, with visibility at academies, in the app, and at events.</w:t>
+        <w:t>Most people outside India don't know this, but Indian companies above a certain profit level are legally required to spend 2% of their net profits on corporate social responsibility. Youth sports qualifies. That means I can walk into a meeting with Tata, Reliance, or Infosys and present a sponsorship deal where they're spending money they have to spend anyway, but on something that actually gives them brand exposure with young consumers. I're putting together sponsorship tiers from $25,000 to $200,000, with visibility at academies, in the app, and at events.</w:t>
       </w:r>
     </w:p>
     <w:p>
@@ -1632,7 +1632,7 @@
           <w:color w:val="333333"/>
           <w:sz w:val="24"/>
         </w:rPr>
-        <w:t>We'll run a campaign on Ketto (India's biggest crowdfunding platform) and Kickstarter. Target is $50,000 to $75,000, but the money's almost secondary. What crowdfunding really does is build a base of early supporters who are personally invested before we've even opened the doors. Backers get discounted memberships, merch, and early app access. It also forces us to tell our story publicly, and stories about giving kids access to sports they couldn't otherwise afford tend to travel fast online.</w:t>
+        <w:t>I'll run a campaign on Ketto (India's biggest crowdfunding platform) and Kickstarter. Target is $50,000 to $75,000, but the money's almost secondary. What crowdfunding really does is build a base of early supporters who are personally invested before I've even opened the doors. Backers get discounted memberships, merch, and early app access. It also forces me to tell my story publicly, and stories about giving kids access to sports they couldn't otherwise afford tend to travel fast online.</w:t>
       </w:r>
     </w:p>
     <w:p>
@@ -1683,7 +1683,7 @@
           <w:color w:val="333333"/>
           <w:sz w:val="24"/>
         </w:rPr>
-        <w:t>800 million internet users. Digital's obviously the main channel. Targeted ads on Instagram, YouTube, and Facebook, heavy on video. Training clips, player progress stories, behind-the-scenes academy stuff. Placing YouTube pre-roll ads on NBA content is kind of a no-brainer since that's exactly where our audience already hangs out.</w:t>
+        <w:t>800 million internet users. Digital's obviously the main channel. Targeted ads on Instagram, YouTube, and Facebook, heavy on video. Training clips, player progress stories, behind-the-scenes academy stuff. Placing YouTube pre-roll ads on NBA content is kind of a no-brainer since that's exactly where my audience already hangs out.</w:t>
       </w:r>
     </w:p>
     <w:p>
@@ -1699,7 +1699,7 @@
           <w:color w:val="333333"/>
           <w:sz w:val="24"/>
         </w:rPr>
-        <w:t>We'll also invest in SEO and Google Ads for search terms like "basketball training India" and "basketball academy near me." And we'll put out weekly blog posts and tutorial videos. The idea isn't just advertising, it's making HoopRise the name that keeps popping up whenever anyone in India searches for anything related to basketball development.</w:t>
+        <w:t>I'll also invest in SEO and Google Ads for search terms like "basketball training India" and "basketball academy near me." And I'll put out weekly blog posts and tutorial videos. The idea isn't just advertising, it's making HoopRise the name that keeps popping up whenever anyone in India searches for anything related to basketball development.</w:t>
       </w:r>
     </w:p>
     <w:p>
@@ -1730,7 +1730,7 @@
           <w:color w:val="333333"/>
           <w:sz w:val="24"/>
         </w:rPr>
-        <w:t>We want actual people attached to this brand. Satnam Singh was the first Indian ever drafted by an NBA team. Prachi Tehlan captained the national women's team. Those are the kinds of names we're going after. In each city, we'll also work with local micro-influencers, people with 50K to 200K followers who have real pull in their communities, not just big numbers. We want content collabs and event appearances that feel genuine, not stiff endorsement deals that everyone scrolls past.</w:t>
+        <w:t>I want actual people attached to this brand. Satnam Singh was the first Indian ever drafted by an NBA team. Prachi Tehlan captained the national women's team. Those are the kinds of names I're going after. In each city, I'll also work with local micro-influencers, people with 50K to 200K followers who have real pull in their communities, not just big numbers. I want content collabs and event appearances that feel genuine, not stiff endorsement deals that everyone scrolls past.</w:t>
       </w:r>
     </w:p>
     <w:p>
@@ -1761,7 +1761,7 @@
           <w:color w:val="333333"/>
           <w:sz w:val="24"/>
         </w:rPr>
-        <w:t>Our customers sit in classrooms five days a week. Getting into schools is a huge deal. Free intro clinics at partner schools, equipment donations for schools starting basketball programs, inter-school tournament sponsorships. On the college side, we want to be the training partner that university basketball teams turn to for group packages and performance analytics through the app. It's about being present in the places where young people already are, instead of trying to pull them somewhere new.</w:t>
+        <w:t>My customers sit in classrooms five days a week. Getting into schools is a huge deal. Free intro clinics at partner schools, equipment donations for schools starting basketball programs, inter-school tournament sponsorships. On the college side, I want to be the training partner that university basketball teams turn to for group packages and performance analytics through the app. It's about being present in the places where young people already are, instead of trying to pull them somewhere new.</w:t>
       </w:r>
     </w:p>
     <w:p>
@@ -1792,7 +1792,7 @@
           <w:color w:val="333333"/>
           <w:sz w:val="24"/>
         </w:rPr>
-        <w:t>Online ads can only do so much. People need to experience the product. So we're doing 3-on-3 street tournaments. Basketball camps during school breaks. Watch parties for the NBA Finals and All-Star Weekend. And once a year, a big event called the "HoopRise Rising Stars Challenge" that gets press, drives social media buzz, and gives the brand a signature moment. Long term, we want HoopRise to feel like the center of basketball culture in India. Not just a training academy, but the place where the basketball community actually gathers.</w:t>
+        <w:t>Online ads can only do so much. People need to experience the product. So I're doing 3-on-3 street tournaments. Basketball camps during school breaks. Watch parties for the NBA Finals and All-Star Weekend. And once a year, a big event called the "HoopRise Rising Stars Challenge" that gets press, drives social media buzz, and gives the brand a signature moment. Long term, I want HoopRise to feel like the center of basketball culture in India. Not just a training academy, but the place where the basketball community actually gathers.</w:t>
       </w:r>
     </w:p>
     <w:p>
@@ -1828,7 +1828,7 @@
           <w:color w:val="333333"/>
           <w:sz w:val="24"/>
         </w:rPr>
-        <w:t>Three-year financial picture. Year 1 we spend a lot and don't make it all back. Year 2 we grow into profitability. Year 3 we're making money.</w:t>
+        <w:t>Three-year financial picture. Year 1 I spend a lot and don't make it all back. Year 2 I grow into profitability. Year 3 I're making money.</w:t>
       </w:r>
     </w:p>
     <w:tbl>
@@ -3006,7 +3006,7 @@
           <w:color w:val="333333"/>
           <w:sz w:val="24"/>
         </w:rPr>
-        <w:t>Year 1 loses money. We expected that. You can't open three academies and build an app without burning through cash. But revenue ramps up quick. Somewhere around month 18, we break even. By Year 3, we're pulling in $1.45 million against about $1 million in costs. That's solid margin, and it gets better as the app scales because digital users don't require more facilities or proportionally more coaches.</w:t>
+        <w:t>Year 1 loses money. I expected that. You can't open three academies and build an app without burning through cash. But revenue ramps up quick. Somewhere around month 18, I break even. By Year 3, I're pulling in $1.45 million against about $1 million in costs. That's solid margin, and it gets better as the app scales because digital users don't require more facilities or proportionally more coaches.</w:t>
       </w:r>
     </w:p>
     <w:p>
@@ -3095,7 +3095,7 @@
           <w:color w:val="333333"/>
           <w:sz w:val="24"/>
         </w:rPr>
-        <w:t>Trying to do everything ourselves would be slow, expensive, and kind of dumb when there are organizations out there that already have what we need. The smarter move is to partner up, trade value, and get to market faster. Five partnerships matter most.</w:t>
+        <w:t>Trying to do everything myself would be slow, expensive, and kind of dumb when there are organizations out there that already have what I need. The smarter move is to partner up, trade value, and get to market faster. Five partnerships matter most.</w:t>
       </w:r>
     </w:p>
     <w:p>
@@ -3126,7 +3126,7 @@
           <w:color w:val="333333"/>
           <w:sz w:val="24"/>
         </w:rPr>
-        <w:t>This is the big one. The NBA's already spending money in India through the Academy, Jr. NBA programs, and broadcast deals. Getting recognized as an official NBA-affiliated training center would give us their coaching resources, their credibility, and access to their scouting pipeline. For a kid training at HoopRise, that means a real ladder: perform well, get noticed, maybe get a shot at the Academy or catch a scout's eye. No other training program in India can dangle that kind of carrot.</w:t>
+        <w:t>This is the big one. The NBA's already spending money in India through the Academy, Jr. NBA programs, and broadcast deals. Getting recognized as an official NBA-affiliated training center would give me their coaching resources, their credibility, and access to their scouting pipeline. For a kid training at HoopRise, that means a real ladder: perform well, get noticed, maybe get a shot at the Academy or catch a scout's eye. No other training program in India can dangle that kind of carrot.</w:t>
       </w:r>
     </w:p>
     <w:p>
@@ -3157,7 +3157,7 @@
           <w:color w:val="333333"/>
           <w:sz w:val="24"/>
         </w:rPr>
-        <w:t>Sportswear partnership gives us better prices on gear, co-branded marketing, and possibly scholarship funding. Nike's our first pick because of their basketball roots, but Adidas works too. For the brand, they get their products on the next generation of Indian basketball players in a market that's only going to get bigger. They spend millions trying to build that kind of ground-level brand loyalty through other channels. We're offering it built in.</w:t>
+        <w:t>Sportswear partnership gives me better prices on gear, co-branded marketing, and possibly scholarship funding. Nike's my first pick because of their basketball roots, but Adidas works too. For the brand, they get their products on the next generation of Indian basketball players in a market that's only going to get bigger. They spend millions trying to build that kind of ground-level brand loyalty through other channels. I're offering it built in.</w:t>
       </w:r>
     </w:p>
     <w:p>
@@ -3188,7 +3188,7 @@
           <w:color w:val="333333"/>
           <w:sz w:val="24"/>
         </w:rPr>
-        <w:t>BFI accreditation gives us institutional credibility you can't buy. Our players become eligible for state and national team selection. We get into BFI tournaments and coaching certification programs. For the BFI, we're doing the grassroots scouting and development they don't have the infrastructure to do themselves. Both sides get something they need.</w:t>
+        <w:t>BFI accreditation gives me institutional credibility you can't buy. My players become eligible for state and national team selection. I get into BFI tournaments and coaching certification programs. For the BFI, I're doing the grassroots scouting and development they don't have the infrastructure to do themselves. Both sides get something they need.</w:t>
       </w:r>
     </w:p>
     <w:p>
@@ -3219,7 +3219,7 @@
           <w:color w:val="333333"/>
           <w:sz w:val="24"/>
         </w:rPr>
-        <w:t>Delhi Public School, Amity International, Ryan International. These school networks have campuses everywhere. Partnering with them means after-school programs on their facilities, discounted enrollment for their students, and inter-school tournaments we sponsor. Universities like Christ (Bangalore), Shiv Nadar (Delhi), and NMIMS (Mumbai) give us access to the 18-22 age bracket and potential internship pipelines for sports management students. It puts us right where our customers spend most of their day.</w:t>
+        <w:t>Delhi Public School, Amity International, Ryan International. These school networks have campuses everywhere. Partnering with them means after-school programs on their facilities, discounted enrollment for their students, and inter-school tournaments I sponsor. Universities like Christ (Bangalore), Shiv Nadar (Delhi), and NMIMS (Mumbai) give me access to the 18-22 age bracket and potential internship pipelines for sports management students. It puts me right where my customers spend most of their day.</w:t>
       </w:r>
     </w:p>
     <w:p>
@@ -3250,7 +3250,7 @@
           <w:color w:val="333333"/>
           <w:sz w:val="24"/>
         </w:rPr>
-        <w:t>Good apps are expensive to build. Great apps even more so. Partnering with Indian IT companies like Infosys or Wipro for development, using AWS India's startup credits for hosting, and integrating tools from sports tech companies like ShotTracker keeps our costs manageable without sacrificing quality. When you're a startup trying to compete against polished international apps, you need the tech to be good. These partnerships make that possible without blowing through our budget.</w:t>
+        <w:t>Good apps are expensive to build. Great apps even more so. Partnering with Indian IT companies like Infosys or Wipro for development, using AWS India's startup credits for hosting, and integrating tools from sports tech companies like ShotTracker keeps my costs manageable without sacrificing quality. When you're a startup trying to compete against polished international apps, you need the tech to be good. These partnerships make that possible without blowing through my budget.</w:t>
       </w:r>
     </w:p>
     <w:p>

</xml_diff>

<commit_message>
Reformat business plan as standard academic paper
Times New Roman 12pt, double-spaced, 1-inch margins, bold centered
section headings, plain tables, black text throughout. Also fixed
broken "I're" contractions from pronoun replacement script.

Co-Authored-By: Claude Sonnet 4.6 <noreply@anthropic.com>
Claude-Session: https://claude.ai/code/session_01W8zt99ZeTwqXi4zM9Nmp2S
</commit_message>
<xml_diff>
--- a/International_Sport_Business_Plan.docx
+++ b/International_Sport_Business_Plan.docx
@@ -2,79 +2,99 @@
 <file path=word/document.xml><?xml version="1.0" encoding="utf-8"?>
 <w:document xmlns:wpc="http://schemas.microsoft.com/office/word/2010/wordprocessingCanvas" xmlns:mo="http://schemas.microsoft.com/office/mac/office/2008/main" xmlns:mc="http://schemas.openxmlformats.org/markup-compatibility/2006" xmlns:mv="urn:schemas-microsoft-com:mac:vml" xmlns:o="urn:schemas-microsoft-com:office:office" xmlns:r="http://schemas.openxmlformats.org/officeDocument/2006/relationships" xmlns:m="http://schemas.openxmlformats.org/officeDocument/2006/math" xmlns:v="urn:schemas-microsoft-com:vml" xmlns:wp14="http://schemas.microsoft.com/office/word/2010/wordprocessingDrawing" xmlns:wp="http://schemas.openxmlformats.org/drawingml/2006/wordprocessingDrawing" xmlns:w10="urn:schemas-microsoft-com:office:word" xmlns:w="http://schemas.openxmlformats.org/wordprocessingml/2006/main" xmlns:w14="http://schemas.microsoft.com/office/word/2010/wordml" xmlns:wpg="http://schemas.microsoft.com/office/word/2010/wordprocessingGroup" xmlns:wpi="http://schemas.microsoft.com/office/word/2010/wordprocessingInk" xmlns:wne="http://schemas.microsoft.com/office/word/2006/wordml" xmlns:wps="http://schemas.microsoft.com/office/word/2010/wordprocessingShape" mc:Ignorable="w14 wp14">
   <w:body>
-    <w:p/>
-    <w:p/>
-    <w:p/>
-    <w:p/>
-    <w:p/>
-    <w:p/>
     <w:p>
       <w:pPr>
-        <w:spacing w:after="80" w:before="0"/>
+        <w:spacing w:line="480" w:lineRule="exact"/>
+      </w:pPr>
+    </w:p>
+    <w:p>
+      <w:pPr>
+        <w:spacing w:line="480" w:lineRule="exact"/>
+      </w:pPr>
+    </w:p>
+    <w:p>
+      <w:pPr>
+        <w:spacing w:line="480" w:lineRule="exact"/>
+      </w:pPr>
+    </w:p>
+    <w:p>
+      <w:pPr>
+        <w:spacing w:line="480" w:lineRule="exact"/>
+      </w:pPr>
+    </w:p>
+    <w:p>
+      <w:pPr>
+        <w:spacing w:line="480" w:lineRule="exact"/>
+      </w:pPr>
+    </w:p>
+    <w:p>
+      <w:pPr>
+        <w:spacing w:line="480" w:lineRule="exact"/>
+      </w:pPr>
+    </w:p>
+    <w:p>
+      <w:pPr>
+        <w:spacing w:line="480" w:lineRule="exact"/>
         <w:jc w:val="center"/>
       </w:pPr>
       <w:r>
         <w:rPr>
           <w:rFonts w:ascii="Times New Roman" w:hAnsi="Times New Roman"/>
           <w:b/>
-          <w:color w:val="E86C00"/>
-          <w:sz w:val="56"/>
+          <w:sz w:val="32"/>
         </w:rPr>
         <w:t>HoopRise Basketball Academy</w:t>
       </w:r>
     </w:p>
     <w:p>
       <w:pPr>
-        <w:spacing w:after="80" w:before="0"/>
+        <w:spacing w:line="480" w:lineRule="exact"/>
         <w:jc w:val="center"/>
       </w:pPr>
       <w:r>
         <w:rPr>
           <w:rFonts w:ascii="Times New Roman" w:hAnsi="Times New Roman"/>
-          <w:b/>
-          <w:color w:val="333333"/>
-          <w:sz w:val="36"/>
+          <w:sz w:val="24"/>
         </w:rPr>
         <w:t>International Sport Business Plan</w:t>
       </w:r>
     </w:p>
     <w:p>
       <w:pPr>
-        <w:jc w:val="center"/>
-      </w:pPr>
-      <w:r>
-        <w:rPr>
-          <w:color w:val="E86C00"/>
-          <w:sz w:val="24"/>
-        </w:rPr>
-        <w:t>━━━━━━━━━━━━━━━━━━━━━━━━━━━━━━━━━━━━━━━━</w:t>
-      </w:r>
-    </w:p>
-    <w:p>
-      <w:pPr>
-        <w:spacing w:after="600" w:before="0"/>
+        <w:spacing w:line="480" w:lineRule="exact"/>
         <w:jc w:val="center"/>
       </w:pPr>
       <w:r>
         <w:rPr>
           <w:rFonts w:ascii="Times New Roman" w:hAnsi="Times New Roman"/>
-          <w:b w:val="0"/>
-          <w:color w:val="666666"/>
-          <w:sz w:val="28"/>
+          <w:sz w:val="24"/>
         </w:rPr>
         <w:t>Expanding Youth Basketball Development in India</w:t>
       </w:r>
     </w:p>
     <w:p>
       <w:pPr>
-        <w:spacing w:after="80" w:before="0"/>
+        <w:spacing w:line="480" w:lineRule="exact"/>
+      </w:pPr>
+    </w:p>
+    <w:p>
+      <w:pPr>
+        <w:spacing w:line="480" w:lineRule="exact"/>
+      </w:pPr>
+    </w:p>
+    <w:p>
+      <w:pPr>
+        <w:spacing w:line="480" w:lineRule="exact"/>
+      </w:pPr>
+    </w:p>
+    <w:p>
+      <w:pPr>
+        <w:spacing w:line="480" w:lineRule="exact"/>
         <w:jc w:val="center"/>
       </w:pPr>
       <w:r>
         <w:rPr>
           <w:rFonts w:ascii="Times New Roman" w:hAnsi="Times New Roman"/>
-          <w:b w:val="0"/>
-          <w:color w:val="333333"/>
           <w:sz w:val="24"/>
         </w:rPr>
         <w:t>Landon Worrich</w:t>
@@ -82,14 +102,12 @@
     </w:p>
     <w:p>
       <w:pPr>
-        <w:spacing w:after="80" w:before="0"/>
+        <w:spacing w:line="480" w:lineRule="exact"/>
         <w:jc w:val="center"/>
       </w:pPr>
       <w:r>
         <w:rPr>
           <w:rFonts w:ascii="Times New Roman" w:hAnsi="Times New Roman"/>
-          <w:b w:val="0"/>
-          <w:color w:val="333333"/>
           <w:sz w:val="24"/>
         </w:rPr>
         <w:t>SPMT 337: International Sport Business</w:t>
@@ -97,14 +115,12 @@
     </w:p>
     <w:p>
       <w:pPr>
-        <w:spacing w:after="80" w:before="0"/>
+        <w:spacing w:line="480" w:lineRule="exact"/>
         <w:jc w:val="center"/>
       </w:pPr>
       <w:r>
         <w:rPr>
           <w:rFonts w:ascii="Times New Roman" w:hAnsi="Times New Roman"/>
-          <w:b w:val="0"/>
-          <w:color w:val="333333"/>
           <w:sz w:val="24"/>
         </w:rPr>
         <w:t>June 2026</w:t>
@@ -117,315 +133,44 @@
     </w:p>
     <w:p>
       <w:pPr>
-        <w:spacing w:after="240" w:before="0"/>
+        <w:spacing w:after="0" w:before="240" w:line="480" w:lineRule="exact"/>
+        <w:jc w:val="center"/>
+      </w:pPr>
+      <w:r>
+        <w:rPr>
+          <w:rFonts w:ascii="Times New Roman" w:hAnsi="Times New Roman"/>
+          <w:b/>
+          <w:color w:val="000000"/>
+          <w:sz w:val="24"/>
+        </w:rPr>
+        <w:t>Market Research Summary</w:t>
+      </w:r>
+    </w:p>
+    <w:p>
+      <w:pPr>
+        <w:spacing w:after="0" w:before="240" w:line="480" w:lineRule="exact"/>
         <w:jc w:val="left"/>
       </w:pPr>
       <w:r>
         <w:rPr>
           <w:rFonts w:ascii="Times New Roman" w:hAnsi="Times New Roman"/>
           <w:b/>
-          <w:color w:val="E86C00"/>
-          <w:sz w:val="32"/>
-        </w:rPr>
-        <w:t>Table of Contents</w:t>
-      </w:r>
-    </w:p>
-    <w:p>
-      <w:pPr>
-        <w:tabs>
-          <w:tab w:pos="8640" w:val="right" w:leader="dot"/>
-        </w:tabs>
-        <w:spacing w:after="80"/>
-      </w:pPr>
-      <w:r>
-        <w:rPr>
-          <w:rFonts w:ascii="Times New Roman" w:hAnsi="Times New Roman"/>
-          <w:color w:val="333333"/>
+          <w:color w:val="000000"/>
           <w:sz w:val="24"/>
-        </w:rPr>
-        <w:t>Market Research Summary</w:t>
-      </w:r>
-      <w:r>
-        <w:rPr>
-          <w:rFonts w:ascii="Times New Roman" w:hAnsi="Times New Roman"/>
-          <w:color w:val="666666"/>
-          <w:sz w:val="24"/>
-        </w:rPr>
-        <w:tab/>
-        <w:t>1</w:t>
-      </w:r>
-    </w:p>
-    <w:p>
-      <w:pPr>
-        <w:tabs>
-          <w:tab w:pos="8640" w:val="right" w:leader="dot"/>
-        </w:tabs>
-        <w:spacing w:after="80"/>
-      </w:pPr>
-      <w:r>
-        <w:rPr>
-          <w:rFonts w:ascii="Times New Roman" w:hAnsi="Times New Roman"/>
-          <w:color w:val="333333"/>
-          <w:sz w:val="24"/>
-        </w:rPr>
-        <w:t>The Concept</w:t>
-      </w:r>
-      <w:r>
-        <w:rPr>
-          <w:rFonts w:ascii="Times New Roman" w:hAnsi="Times New Roman"/>
-          <w:color w:val="666666"/>
-          <w:sz w:val="24"/>
-        </w:rPr>
-        <w:tab/>
-        <w:t>2</w:t>
-      </w:r>
-    </w:p>
-    <w:p>
-      <w:pPr>
-        <w:tabs>
-          <w:tab w:pos="8640" w:val="right" w:leader="dot"/>
-        </w:tabs>
-        <w:spacing w:after="80"/>
-      </w:pPr>
-      <w:r>
-        <w:rPr>
-          <w:rFonts w:ascii="Times New Roman" w:hAnsi="Times New Roman"/>
-          <w:color w:val="333333"/>
-          <w:sz w:val="24"/>
-        </w:rPr>
-        <w:t>Mission Statement</w:t>
-      </w:r>
-      <w:r>
-        <w:rPr>
-          <w:rFonts w:ascii="Times New Roman" w:hAnsi="Times New Roman"/>
-          <w:color w:val="666666"/>
-          <w:sz w:val="24"/>
-        </w:rPr>
-        <w:tab/>
-        <w:t>3</w:t>
-      </w:r>
-    </w:p>
-    <w:p>
-      <w:pPr>
-        <w:tabs>
-          <w:tab w:pos="8640" w:val="right" w:leader="dot"/>
-        </w:tabs>
-        <w:spacing w:after="80"/>
-      </w:pPr>
-      <w:r>
-        <w:rPr>
-          <w:rFonts w:ascii="Times New Roman" w:hAnsi="Times New Roman"/>
-          <w:color w:val="333333"/>
-          <w:sz w:val="24"/>
-        </w:rPr>
-        <w:t>Competitive Position</w:t>
-      </w:r>
-      <w:r>
-        <w:rPr>
-          <w:rFonts w:ascii="Times New Roman" w:hAnsi="Times New Roman"/>
-          <w:color w:val="666666"/>
-          <w:sz w:val="24"/>
-        </w:rPr>
-        <w:tab/>
-        <w:t>3</w:t>
-      </w:r>
-    </w:p>
-    <w:p>
-      <w:pPr>
-        <w:tabs>
-          <w:tab w:pos="8640" w:val="right" w:leader="dot"/>
-        </w:tabs>
-        <w:spacing w:after="80"/>
-      </w:pPr>
-      <w:r>
-        <w:rPr>
-          <w:rFonts w:ascii="Times New Roman" w:hAnsi="Times New Roman"/>
-          <w:color w:val="333333"/>
-          <w:sz w:val="24"/>
-        </w:rPr>
-        <w:t>Cultural Considerations</w:t>
-      </w:r>
-      <w:r>
-        <w:rPr>
-          <w:rFonts w:ascii="Times New Roman" w:hAnsi="Times New Roman"/>
-          <w:color w:val="666666"/>
-          <w:sz w:val="24"/>
-        </w:rPr>
-        <w:tab/>
-        <w:t>5</w:t>
-      </w:r>
-    </w:p>
-    <w:p>
-      <w:pPr>
-        <w:tabs>
-          <w:tab w:pos="8640" w:val="right" w:leader="dot"/>
-        </w:tabs>
-        <w:spacing w:after="80"/>
-      </w:pPr>
-      <w:r>
-        <w:rPr>
-          <w:rFonts w:ascii="Times New Roman" w:hAnsi="Times New Roman"/>
-          <w:color w:val="333333"/>
-          <w:sz w:val="24"/>
-        </w:rPr>
-        <w:t>Fundraising/Financing</w:t>
-      </w:r>
-      <w:r>
-        <w:rPr>
-          <w:rFonts w:ascii="Times New Roman" w:hAnsi="Times New Roman"/>
-          <w:color w:val="666666"/>
-          <w:sz w:val="24"/>
-        </w:rPr>
-        <w:tab/>
-        <w:t>6</w:t>
-      </w:r>
-    </w:p>
-    <w:p>
-      <w:pPr>
-        <w:tabs>
-          <w:tab w:pos="8640" w:val="right" w:leader="dot"/>
-        </w:tabs>
-        <w:spacing w:after="80"/>
-      </w:pPr>
-      <w:r>
-        <w:rPr>
-          <w:rFonts w:ascii="Times New Roman" w:hAnsi="Times New Roman"/>
-          <w:color w:val="333333"/>
-          <w:sz w:val="24"/>
-        </w:rPr>
-        <w:t>Promotional Strategies</w:t>
-      </w:r>
-      <w:r>
-        <w:rPr>
-          <w:rFonts w:ascii="Times New Roman" w:hAnsi="Times New Roman"/>
-          <w:color w:val="666666"/>
-          <w:sz w:val="24"/>
-        </w:rPr>
-        <w:tab/>
-        <w:t>7</w:t>
-      </w:r>
-    </w:p>
-    <w:p>
-      <w:pPr>
-        <w:tabs>
-          <w:tab w:pos="8640" w:val="right" w:leader="dot"/>
-        </w:tabs>
-        <w:spacing w:after="80"/>
-      </w:pPr>
-      <w:r>
-        <w:rPr>
-          <w:rFonts w:ascii="Times New Roman" w:hAnsi="Times New Roman"/>
-          <w:color w:val="333333"/>
-          <w:sz w:val="24"/>
-        </w:rPr>
-        <w:t>Anticipated Budget</w:t>
-      </w:r>
-      <w:r>
-        <w:rPr>
-          <w:rFonts w:ascii="Times New Roman" w:hAnsi="Times New Roman"/>
-          <w:color w:val="666666"/>
-          <w:sz w:val="24"/>
-        </w:rPr>
-        <w:tab/>
-        <w:t>8</w:t>
-      </w:r>
-    </w:p>
-    <w:p>
-      <w:pPr>
-        <w:tabs>
-          <w:tab w:pos="8640" w:val="right" w:leader="dot"/>
-        </w:tabs>
-        <w:spacing w:after="80"/>
-      </w:pPr>
-      <w:r>
-        <w:rPr>
-          <w:rFonts w:ascii="Times New Roman" w:hAnsi="Times New Roman"/>
-          <w:color w:val="333333"/>
-          <w:sz w:val="24"/>
-        </w:rPr>
-        <w:t>Strategic Partnerships</w:t>
-      </w:r>
-      <w:r>
-        <w:rPr>
-          <w:rFonts w:ascii="Times New Roman" w:hAnsi="Times New Roman"/>
-          <w:color w:val="666666"/>
-          <w:sz w:val="24"/>
-        </w:rPr>
-        <w:tab/>
-        <w:t>9</w:t>
-      </w:r>
-    </w:p>
-    <w:p>
-      <w:pPr>
-        <w:tabs>
-          <w:tab w:pos="8640" w:val="right" w:leader="dot"/>
-        </w:tabs>
-        <w:spacing w:after="80"/>
-      </w:pPr>
-      <w:r>
-        <w:rPr>
-          <w:rFonts w:ascii="Times New Roman" w:hAnsi="Times New Roman"/>
-          <w:color w:val="333333"/>
-          <w:sz w:val="24"/>
-        </w:rPr>
-        <w:t>References</w:t>
-      </w:r>
-      <w:r>
-        <w:rPr>
-          <w:rFonts w:ascii="Times New Roman" w:hAnsi="Times New Roman"/>
-          <w:color w:val="666666"/>
-          <w:sz w:val="24"/>
-        </w:rPr>
-        <w:tab/>
-        <w:t>10</w:t>
-      </w:r>
-    </w:p>
-    <w:p>
-      <w:r>
-        <w:br w:type="page"/>
-      </w:r>
-    </w:p>
-    <w:p>
-      <w:pPr>
-        <w:spacing w:after="160" w:before="360"/>
-        <w:jc w:val="left"/>
-      </w:pPr>
-      <w:r>
-        <w:rPr>
-          <w:rFonts w:ascii="Times New Roman" w:hAnsi="Times New Roman"/>
-          <w:b/>
-          <w:color w:val="E86C00"/>
-          <w:sz w:val="32"/>
-        </w:rPr>
-        <w:t>Market Research Summary</w:t>
-      </w:r>
-    </w:p>
-    <w:p>
-      <w:pPr>
-        <w:spacing w:after="120" w:before="240"/>
-        <w:jc w:val="left"/>
-      </w:pPr>
-      <w:r>
-        <w:rPr>
-          <w:rFonts w:ascii="Times New Roman" w:hAnsi="Times New Roman"/>
-          <w:b/>
-          <w:color w:val="333333"/>
-          <w:sz w:val="26"/>
         </w:rPr>
         <w:t>Key Demographics and Market Size</w:t>
       </w:r>
     </w:p>
     <w:p>
       <w:pPr>
-        <w:spacing w:after="120" w:before="0"/>
+        <w:spacing w:after="0" w:before="0" w:line="480" w:lineRule="exact"/>
         <w:ind w:firstLine="720"/>
         <w:jc w:val="left"/>
       </w:pPr>
       <w:r>
         <w:rPr>
           <w:rFonts w:ascii="Times New Roman" w:hAnsi="Times New Roman"/>
-          <w:b w:val="0"/>
-          <w:color w:val="333333"/>
+          <w:color w:val="000000"/>
           <w:sz w:val="24"/>
         </w:rPr>
         <w:t>I looked at a bunch of different countries before settling on India. Southeast Asia came up, so did parts of Africa and a few spots in Eastern Europe. But once I actually sat down with the data on India, it wasn't even close. 1.44 billion people live there. Around 65% of them are under 35, and the median age is 28.4 (United Nations, 2024). That's not just a big market. That's an absurdly young country full of people at the exact age where they'd pick up a new sport if someone gave them the chance.</w:t>
@@ -433,15 +178,14 @@
     </w:p>
     <w:p>
       <w:pPr>
-        <w:spacing w:after="120" w:before="0"/>
+        <w:spacing w:after="0" w:before="0" w:line="480" w:lineRule="exact"/>
         <w:ind w:firstLine="720"/>
         <w:jc w:val="left"/>
       </w:pPr>
       <w:r>
         <w:rPr>
           <w:rFonts w:ascii="Times New Roman" w:hAnsi="Times New Roman"/>
-          <w:b w:val="0"/>
-          <w:color w:val="333333"/>
+          <w:color w:val="000000"/>
           <w:sz w:val="24"/>
         </w:rPr>
         <w:t>India's sports industry is worth about $2.7 billion today. Analysts think it'll hit $10 billion by 2030 (KPMG, 2023). And here's the number that really got me going: the NBA says it already has over 300 million fans in India. That makes India their second-largest market outside the States. 300 million people who care about basketball, and almost nowhere for them to actually learn how to play it properly. That disconnect is the whole reason HoopRise exists.</w:t>
@@ -449,30 +193,29 @@
     </w:p>
     <w:p>
       <w:pPr>
-        <w:spacing w:after="120" w:before="240"/>
+        <w:spacing w:after="0" w:before="240" w:line="480" w:lineRule="exact"/>
         <w:jc w:val="left"/>
       </w:pPr>
       <w:r>
         <w:rPr>
           <w:rFonts w:ascii="Times New Roman" w:hAnsi="Times New Roman"/>
           <w:b/>
-          <w:color w:val="333333"/>
-          <w:sz w:val="26"/>
+          <w:color w:val="000000"/>
+          <w:sz w:val="24"/>
         </w:rPr>
         <w:t>Consumer Behavior Trends</w:t>
       </w:r>
     </w:p>
     <w:p>
       <w:pPr>
-        <w:spacing w:after="120" w:before="0"/>
+        <w:spacing w:after="0" w:before="0" w:line="480" w:lineRule="exact"/>
         <w:ind w:firstLine="720"/>
         <w:jc w:val="left"/>
       </w:pPr>
       <w:r>
         <w:rPr>
           <w:rFonts w:ascii="Times New Roman" w:hAnsi="Times New Roman"/>
-          <w:b w:val="0"/>
-          <w:color w:val="333333"/>
+          <w:color w:val="000000"/>
           <w:sz w:val="24"/>
         </w:rPr>
         <w:t>Young Indians today aren't like their parents. They're on Instagram at midnight watching Steph Curry highlights. They care about fitness. A lot of this traces back to how insanely cheap mobile data got in India, like $0.17 per GB cheap (Deloitte, 2024). Everyone has a smartphone now, and that means everyone's consuming sports content all the time.</w:t>
@@ -480,15 +223,14 @@
     </w:p>
     <w:p>
       <w:pPr>
-        <w:spacing w:after="120" w:before="0"/>
+        <w:spacing w:after="0" w:before="0" w:line="480" w:lineRule="exact"/>
         <w:ind w:firstLine="720"/>
         <w:jc w:val="left"/>
       </w:pPr>
       <w:r>
         <w:rPr>
           <w:rFonts w:ascii="Times New Roman" w:hAnsi="Times New Roman"/>
-          <w:b w:val="0"/>
-          <w:color w:val="333333"/>
+          <w:color w:val="000000"/>
           <w:sz w:val="24"/>
         </w:rPr>
         <w:t>On the parent side, India's middle class has blown up to over 400 million people. These families want their kids doing more than just sitting in tutoring classes after school. They're open to sports in a way that previous generations just weren't. And if anyone doubts whether Indians will get behind a well-packaged sport product, just look at what the IPL did for cricket. It printed money and built a cultural obsession at the same time. There's no reason basketball can't follow a similar path.</w:t>
@@ -496,30 +238,29 @@
     </w:p>
     <w:p>
       <w:pPr>
-        <w:spacing w:after="120" w:before="240"/>
+        <w:spacing w:after="0" w:before="240" w:line="480" w:lineRule="exact"/>
         <w:jc w:val="left"/>
       </w:pPr>
       <w:r>
         <w:rPr>
           <w:rFonts w:ascii="Times New Roman" w:hAnsi="Times New Roman"/>
           <w:b/>
-          <w:color w:val="333333"/>
-          <w:sz w:val="26"/>
+          <w:color w:val="000000"/>
+          <w:sz w:val="24"/>
         </w:rPr>
         <w:t>Opportunities and Challenges</w:t>
       </w:r>
     </w:p>
     <w:p>
       <w:pPr>
-        <w:spacing w:after="120" w:before="0"/>
+        <w:spacing w:after="0" w:before="0" w:line="480" w:lineRule="exact"/>
         <w:ind w:firstLine="720"/>
         <w:jc w:val="left"/>
       </w:pPr>
       <w:r>
         <w:rPr>
           <w:rFonts w:ascii="Times New Roman" w:hAnsi="Times New Roman"/>
-          <w:b w:val="0"/>
-          <w:color w:val="333333"/>
+          <w:color w:val="000000"/>
           <w:sz w:val="24"/>
         </w:rPr>
         <w:t>The timing's good. The government's Khelo India program has dumped over $350 million into sports development. The NBA opened an academy in India in 2017, which means smart people with deep pockets already see what I see. And with 35% of the population living in cities now, there are concentrated areas of demand that a physical academy can actually serve.</w:t>
@@ -527,15 +268,14 @@
     </w:p>
     <w:p>
       <w:pPr>
-        <w:spacing w:after="120" w:before="0"/>
+        <w:spacing w:after="0" w:before="0" w:line="480" w:lineRule="exact"/>
         <w:ind w:firstLine="720"/>
         <w:jc w:val="left"/>
       </w:pPr>
       <w:r>
         <w:rPr>
           <w:rFonts w:ascii="Times New Roman" w:hAnsi="Times New Roman"/>
-          <w:b w:val="0"/>
-          <w:color w:val="333333"/>
+          <w:color w:val="000000"/>
           <w:sz w:val="24"/>
         </w:rPr>
         <w:t>That said, I'd be lying if I pretended there weren't real obstacles. Cricket isn't just popular in India. It's basically a religion. Basketball is fighting for attention against something that deeply embedded. Good indoor courts are tough to find outside the biggest metros, and even middle-class Indian families are pretty price-conscious, so the training can't cost a fortune. India also has 28 states with different regulations and cultural norms, so you can't just copy-paste one strategy across the whole country. I've factored all of that into the plan, but it'd be dishonest to pretend those challenges don't exist.</w:t>
@@ -548,46 +288,44 @@
     </w:p>
     <w:p>
       <w:pPr>
-        <w:spacing w:after="160" w:before="360"/>
-        <w:jc w:val="left"/>
+        <w:spacing w:after="0" w:before="240" w:line="480" w:lineRule="exact"/>
+        <w:jc w:val="center"/>
       </w:pPr>
       <w:r>
         <w:rPr>
           <w:rFonts w:ascii="Times New Roman" w:hAnsi="Times New Roman"/>
           <w:b/>
-          <w:color w:val="E86C00"/>
-          <w:sz w:val="32"/>
+          <w:color w:val="000000"/>
+          <w:sz w:val="24"/>
         </w:rPr>
         <w:t>The Concept</w:t>
       </w:r>
     </w:p>
     <w:p>
       <w:pPr>
-        <w:spacing w:after="120" w:before="0"/>
+        <w:spacing w:after="0" w:before="0" w:line="480" w:lineRule="exact"/>
         <w:ind w:firstLine="720"/>
         <w:jc w:val="left"/>
       </w:pPr>
       <w:r>
         <w:rPr>
           <w:rFonts w:ascii="Times New Roman" w:hAnsi="Times New Roman"/>
-          <w:b w:val="0"/>
-          <w:color w:val="333333"/>
+          <w:color w:val="000000"/>
           <w:sz w:val="24"/>
         </w:rPr>
-        <w:t>HoopRise is pretty simple at its core. I're building real basketball academies in three major Indian cities (Mumbai, Delhi NCR, Bangalore), and I're pairing those with a mobile app that brings my training to anyone with a phone and a Wi-Fi connection. Physical locations for the kids who can get there. A digital product for the millions who can't.</w:t>
+        <w:t>HoopRise is pretty simple at its core. I'm building real basketball academies in three major Indian cities (Mumbai, Delhi NCR, Bangalore), and I'm pairing those with a mobile app that brings my training to anyone with a phone and a Wi-Fi connection. Physical locations for the kids who can get there. A digital product for the millions who can't.</w:t>
       </w:r>
     </w:p>
     <w:p>
       <w:pPr>
-        <w:spacing w:after="120" w:before="0"/>
+        <w:spacing w:after="0" w:before="0" w:line="480" w:lineRule="exact"/>
         <w:ind w:firstLine="720"/>
         <w:jc w:val="left"/>
       </w:pPr>
       <w:r>
         <w:rPr>
           <w:rFonts w:ascii="Times New Roman" w:hAnsi="Times New Roman"/>
-          <w:b w:val="0"/>
-          <w:color w:val="333333"/>
+          <w:color w:val="000000"/>
           <w:sz w:val="24"/>
         </w:rPr>
         <w:t>The academies will have full-size courts, weight rooms, sports science labs with motion capture, and film rooms for game breakdown. Coaches will be people who've played or coached internationally, paired with local assistants who know the area and can actually relate to the kids. Training splits into four tiers: Beginner, Intermediate, Advanced, Elite. An 8-year-old who's never held a ball and a 21-year-old trying to go pro both need a place to train. I want to be that place for both of them.</w:t>
@@ -595,18 +333,17 @@
     </w:p>
     <w:p>
       <w:pPr>
-        <w:spacing w:after="120" w:before="0"/>
+        <w:spacing w:after="0" w:before="0" w:line="480" w:lineRule="exact"/>
         <w:ind w:firstLine="720"/>
         <w:jc w:val="left"/>
       </w:pPr>
       <w:r>
         <w:rPr>
           <w:rFonts w:ascii="Times New Roman" w:hAnsi="Times New Roman"/>
-          <w:b w:val="0"/>
-          <w:color w:val="333333"/>
+          <w:color w:val="000000"/>
           <w:sz w:val="24"/>
         </w:rPr>
-        <w:t>The app is where things get exciting from a business standpoint. AI skill assessments, drill videos in multiple Indian languages, stat tracking, virtual coaching. If you're a kid in, say, Jaipur or Indore right now and you want real basketball coaching? Good luck. There's basically nothing. That's the gap I're filling. The app makes quality training available to anyone with a phone, while the physical academies give the full experience to players in my three launch cities. Nobody else in India is doing both.</w:t>
+        <w:t>The app is where things get exciting from a business standpoint. AI skill assessments, drill videos in multiple Indian languages, stat tracking, virtual coaching. If you're a kid in, say, Jaipur or Indore right now and you want real basketball coaching? Good luck. There's basically nothing. That's the gap I'm filling. The app makes quality training available to anyone with a phone, while the physical academies give the full experience to players in my three launch cities. Nobody else in India is doing both.</w:t>
       </w:r>
     </w:p>
     <w:p>
@@ -616,30 +353,29 @@
     </w:p>
     <w:p>
       <w:pPr>
-        <w:spacing w:after="160" w:before="360"/>
-        <w:jc w:val="left"/>
+        <w:spacing w:after="0" w:before="240" w:line="480" w:lineRule="exact"/>
+        <w:jc w:val="center"/>
       </w:pPr>
       <w:r>
         <w:rPr>
           <w:rFonts w:ascii="Times New Roman" w:hAnsi="Times New Roman"/>
           <w:b/>
-          <w:color w:val="E86C00"/>
-          <w:sz w:val="32"/>
+          <w:color w:val="000000"/>
+          <w:sz w:val="24"/>
         </w:rPr>
         <w:t>Mission Statement</w:t>
       </w:r>
     </w:p>
     <w:p>
       <w:pPr>
-        <w:spacing w:after="120" w:before="0"/>
+        <w:spacing w:after="0" w:before="0" w:line="480" w:lineRule="exact"/>
         <w:ind w:firstLine="720"/>
         <w:jc w:val="left"/>
       </w:pPr>
       <w:r>
         <w:rPr>
           <w:rFonts w:ascii="Times New Roman" w:hAnsi="Times New Roman"/>
-          <w:b w:val="0"/>
-          <w:color w:val="333333"/>
+          <w:color w:val="000000"/>
           <w:sz w:val="24"/>
         </w:rPr>
         <w:t>Where you grow up shouldn't decide if you get a good coach. How much money your family has shouldn't either. That's the whole idea behind HoopRise. I want to build India's best basketball training program and then make it available to as many young players as I can, not just the ones in wealthy families or the right zip code. And it's not only about basketball. The discipline, the accountability, learning to work with people who are different from you, all of that matters just as much as getting your shot right.</w:t>
@@ -647,61 +383,59 @@
     </w:p>
     <w:p>
       <w:pPr>
-        <w:spacing w:after="120" w:before="0"/>
+        <w:spacing w:after="0" w:before="0" w:line="480" w:lineRule="exact"/>
         <w:ind w:firstLine="720"/>
         <w:jc w:val="left"/>
       </w:pPr>
       <w:r>
         <w:rPr>
           <w:rFonts w:ascii="Times New Roman" w:hAnsi="Times New Roman"/>
-          <w:b w:val="0"/>
-          <w:color w:val="333333"/>
+          <w:color w:val="000000"/>
           <w:sz w:val="24"/>
         </w:rPr>
-        <w:t>I've got three goals. One: become the name people think of when Indian basketball training comes up, within five years. Two: build a real pipeline of players who end up in college programs, national teams, or pro leagues. Three: get to a million app users in three years. Big numbers. I know. But India's young population is massive, the interest is there, and nobody's really going after this market with a serious plan yet. So I're going for it.</w:t>
+        <w:t>I've got three goals. One: become the name people think of when Indian basketball training comes up, within five years. Two: build a real pipeline of players who end up in college programs, national teams, or pro leagues. Three: get to a million app users in three years. Big numbers. I know. But India's young population is massive, the interest is there, and nobody's really going after this market with a serious plan yet. So I'm going for it.</w:t>
       </w:r>
     </w:p>
     <w:p>
       <w:pPr>
-        <w:spacing w:after="160" w:before="360"/>
+        <w:spacing w:after="0" w:before="240" w:line="480" w:lineRule="exact"/>
+        <w:jc w:val="center"/>
+      </w:pPr>
+      <w:r>
+        <w:rPr>
+          <w:rFonts w:ascii="Times New Roman" w:hAnsi="Times New Roman"/>
+          <w:b/>
+          <w:color w:val="000000"/>
+          <w:sz w:val="24"/>
+        </w:rPr>
+        <w:t>Competitive Position</w:t>
+      </w:r>
+    </w:p>
+    <w:p>
+      <w:pPr>
+        <w:spacing w:after="0" w:before="240" w:line="480" w:lineRule="exact"/>
         <w:jc w:val="left"/>
       </w:pPr>
       <w:r>
         <w:rPr>
           <w:rFonts w:ascii="Times New Roman" w:hAnsi="Times New Roman"/>
           <w:b/>
-          <w:color w:val="E86C00"/>
-          <w:sz w:val="32"/>
-        </w:rPr>
-        <w:t>Competitive Position</w:t>
-      </w:r>
-    </w:p>
-    <w:p>
-      <w:pPr>
-        <w:spacing w:after="120" w:before="240"/>
-        <w:jc w:val="left"/>
-      </w:pPr>
-      <w:r>
-        <w:rPr>
-          <w:rFonts w:ascii="Times New Roman" w:hAnsi="Times New Roman"/>
-          <w:b/>
-          <w:color w:val="333333"/>
-          <w:sz w:val="26"/>
+          <w:color w:val="000000"/>
+          <w:sz w:val="24"/>
         </w:rPr>
         <w:t>Target Market Profile</w:t>
       </w:r>
     </w:p>
     <w:p>
       <w:pPr>
-        <w:spacing w:after="120" w:before="0"/>
+        <w:spacing w:after="0" w:before="0" w:line="480" w:lineRule="exact"/>
         <w:ind w:firstLine="720"/>
         <w:jc w:val="left"/>
       </w:pPr>
       <w:r>
         <w:rPr>
           <w:rFonts w:ascii="Times New Roman" w:hAnsi="Times New Roman"/>
-          <w:b w:val="0"/>
-          <w:color w:val="333333"/>
+          <w:color w:val="000000"/>
           <w:sz w:val="24"/>
         </w:rPr>
         <w:t>Main target is 8-to-22-year-olds from middle-class and upper-middle-class families in Indian cities. Households making $10,000 to $50,000 a year, give or take. Parents who value education but are starting to realize sports can be part of the picture too. The kids themselves grew up on the internet. They watch the NBA. A lot of them already want to play. They just don't have a good place to do it.</w:t>
@@ -709,31 +443,30 @@
     </w:p>
     <w:p>
       <w:pPr>
-        <w:spacing w:after="120" w:before="0"/>
+        <w:spacing w:after="0" w:before="0" w:line="480" w:lineRule="exact"/>
         <w:ind w:firstLine="720"/>
         <w:jc w:val="left"/>
       </w:pPr>
       <w:r>
         <w:rPr>
           <w:rFonts w:ascii="Times New Roman" w:hAnsi="Times New Roman"/>
-          <w:b w:val="0"/>
-          <w:color w:val="333333"/>
+          <w:color w:val="000000"/>
           <w:sz w:val="24"/>
         </w:rPr>
-        <w:t>Beyond that, there's a secondary market: college athletes who want better coaching, companies interested in team-building stuff, and adults in their twenties and thirties who play pickup on weekends. About 120 million young people across India's top 20 cities fit my core profile. I're starting in Mumbai (21 million metro area), Delhi NCR (32 million), and Bangalore (13 million) because those three have the best overlap of middle-class population, basketball interest, and available real estate for facilities.</w:t>
+        <w:t>Beyond that, there's a secondary market: college athletes who want better coaching, companies interested in team-building stuff, and adults in their twenties and thirties who play pickup on weekends. About 120 million young people across India's top 20 cities fit my core profile. I'm starting in Mumbai (21 million metro area), Delhi NCR (32 million), and Bangalore (13 million) because those three have the best overlap of middle-class population, basketball interest, and available real estate for facilities.</w:t>
       </w:r>
     </w:p>
     <w:p>
       <w:pPr>
-        <w:spacing w:after="120" w:before="240"/>
+        <w:spacing w:after="0" w:before="240" w:line="480" w:lineRule="exact"/>
         <w:jc w:val="left"/>
       </w:pPr>
       <w:r>
         <w:rPr>
           <w:rFonts w:ascii="Times New Roman" w:hAnsi="Times New Roman"/>
           <w:b/>
-          <w:color w:val="333333"/>
-          <w:sz w:val="26"/>
+          <w:color w:val="000000"/>
+          <w:sz w:val="24"/>
         </w:rPr>
         <w:t>Key Competitors</w:t>
       </w:r>
@@ -755,7 +488,6 @@
         <w:tc>
           <w:tcPr>
             <w:tcW w:type="dxa" w:w="2340"/>
-            <w:shd w:fill="E86C00" w:val="clear"/>
           </w:tcPr>
           <w:p>
             <w:pPr>
@@ -766,8 +498,8 @@
               <w:rPr>
                 <w:rFonts w:ascii="Times New Roman" w:hAnsi="Times New Roman"/>
                 <w:b/>
-                <w:color w:val="FFFFFF"/>
-                <w:sz w:val="20"/>
+                <w:color w:val="000000"/>
+                <w:sz w:val="22"/>
               </w:rPr>
               <w:t>Competitor</w:t>
             </w:r>
@@ -776,7 +508,6 @@
         <w:tc>
           <w:tcPr>
             <w:tcW w:type="dxa" w:w="2340"/>
-            <w:shd w:fill="E86C00" w:val="clear"/>
           </w:tcPr>
           <w:p>
             <w:pPr>
@@ -787,8 +518,8 @@
               <w:rPr>
                 <w:rFonts w:ascii="Times New Roman" w:hAnsi="Times New Roman"/>
                 <w:b/>
-                <w:color w:val="FFFFFF"/>
-                <w:sz w:val="20"/>
+                <w:color w:val="000000"/>
+                <w:sz w:val="22"/>
               </w:rPr>
               <w:t>Strengths</w:t>
             </w:r>
@@ -797,7 +528,6 @@
         <w:tc>
           <w:tcPr>
             <w:tcW w:type="dxa" w:w="2340"/>
-            <w:shd w:fill="E86C00" w:val="clear"/>
           </w:tcPr>
           <w:p>
             <w:pPr>
@@ -808,8 +538,8 @@
               <w:rPr>
                 <w:rFonts w:ascii="Times New Roman" w:hAnsi="Times New Roman"/>
                 <w:b/>
-                <w:color w:val="FFFFFF"/>
-                <w:sz w:val="20"/>
+                <w:color w:val="000000"/>
+                <w:sz w:val="22"/>
               </w:rPr>
               <w:t>Weaknesses</w:t>
             </w:r>
@@ -818,7 +548,6 @@
         <w:tc>
           <w:tcPr>
             <w:tcW w:type="dxa" w:w="2340"/>
-            <w:shd w:fill="E86C00" w:val="clear"/>
           </w:tcPr>
           <w:p>
             <w:pPr>
@@ -829,8 +558,8 @@
               <w:rPr>
                 <w:rFonts w:ascii="Times New Roman" w:hAnsi="Times New Roman"/>
                 <w:b/>
-                <w:color w:val="FFFFFF"/>
-                <w:sz w:val="20"/>
+                <w:color w:val="000000"/>
+                <w:sz w:val="22"/>
               </w:rPr>
               <w:t>Market Position</w:t>
             </w:r>
@@ -847,8 +576,8 @@
             <w:r>
               <w:rPr>
                 <w:rFonts w:ascii="Times New Roman" w:hAnsi="Times New Roman"/>
-                <w:color w:val="333333"/>
-                <w:sz w:val="18"/>
+                <w:color w:val="000000"/>
+                <w:sz w:val="20"/>
               </w:rPr>
               <w:t>NBA Academy India</w:t>
             </w:r>
@@ -863,8 +592,8 @@
             <w:r>
               <w:rPr>
                 <w:rFonts w:ascii="Times New Roman" w:hAnsi="Times New Roman"/>
-                <w:color w:val="333333"/>
-                <w:sz w:val="18"/>
+                <w:color w:val="000000"/>
+                <w:sz w:val="20"/>
               </w:rPr>
               <w:t>Huge brand; world-class coaches; players can get scouted by the NBA directly</w:t>
             </w:r>
@@ -879,8 +608,8 @@
             <w:r>
               <w:rPr>
                 <w:rFonts w:ascii="Times New Roman" w:hAnsi="Times New Roman"/>
-                <w:color w:val="333333"/>
-                <w:sz w:val="18"/>
+                <w:color w:val="000000"/>
+                <w:sz w:val="20"/>
               </w:rPr>
               <w:t>Takes like 24 kids. Total. One single location. If you're not already elite, forget it.</w:t>
             </w:r>
@@ -895,8 +624,8 @@
             <w:r>
               <w:rPr>
                 <w:rFonts w:ascii="Times New Roman" w:hAnsi="Times New Roman"/>
-                <w:color w:val="333333"/>
-                <w:sz w:val="18"/>
+                <w:color w:val="000000"/>
+                <w:sz w:val="20"/>
               </w:rPr>
               <w:t>Niche/Elite</w:t>
             </w:r>
@@ -907,34 +636,30 @@
         <w:tc>
           <w:tcPr>
             <w:tcW w:type="dxa" w:w="2340"/>
-            <w:shd w:fill="FFF3E6" w:val="clear"/>
           </w:tcPr>
           <w:p>
             <w:r/>
             <w:r>
               <w:rPr>
                 <w:rFonts w:ascii="Times New Roman" w:hAnsi="Times New Roman"/>
-                <w:color w:val="333333"/>
-                <w:sz w:val="18"/>
+                <w:color w:val="000000"/>
+                <w:sz w:val="20"/>
               </w:rPr>
-              <w:t>Stepanova Basketball</w:t>
-              <w:br/>
-              <w:t>Academy</w:t>
+              <w:t>Stepanova Basketball Academy</w:t>
             </w:r>
           </w:p>
         </w:tc>
         <w:tc>
           <w:tcPr>
             <w:tcW w:type="dxa" w:w="2340"/>
-            <w:shd w:fill="FFF3E6" w:val="clear"/>
           </w:tcPr>
           <w:p>
             <w:r/>
             <w:r>
               <w:rPr>
                 <w:rFonts w:ascii="Times New Roman" w:hAnsi="Times New Roman"/>
-                <w:color w:val="333333"/>
-                <w:sz w:val="18"/>
+                <w:color w:val="000000"/>
+                <w:sz w:val="20"/>
               </w:rPr>
               <w:t>Been around for a while; cheap; grassroots focused</w:t>
             </w:r>
@@ -943,15 +668,14 @@
         <w:tc>
           <w:tcPr>
             <w:tcW w:type="dxa" w:w="2340"/>
-            <w:shd w:fill="FFF3E6" w:val="clear"/>
           </w:tcPr>
           <w:p>
             <w:r/>
             <w:r>
               <w:rPr>
                 <w:rFonts w:ascii="Times New Roman" w:hAnsi="Times New Roman"/>
-                <w:color w:val="333333"/>
-                <w:sz w:val="18"/>
+                <w:color w:val="000000"/>
+                <w:sz w:val="20"/>
               </w:rPr>
               <w:t>Tiny facilities; no app or tech; some coaches are great, others not so much</w:t>
             </w:r>
@@ -960,15 +684,14 @@
         <w:tc>
           <w:tcPr>
             <w:tcW w:type="dxa" w:w="2340"/>
-            <w:shd w:fill="FFF3E6" w:val="clear"/>
           </w:tcPr>
           <w:p>
             <w:r/>
             <w:r>
               <w:rPr>
                 <w:rFonts w:ascii="Times New Roman" w:hAnsi="Times New Roman"/>
-                <w:color w:val="333333"/>
-                <w:sz w:val="18"/>
+                <w:color w:val="000000"/>
+                <w:sz w:val="20"/>
               </w:rPr>
               <w:t>Local/Grassroots</w:t>
             </w:r>
@@ -985,12 +708,10 @@
             <w:r>
               <w:rPr>
                 <w:rFonts w:ascii="Times New Roman" w:hAnsi="Times New Roman"/>
-                <w:color w:val="333333"/>
-                <w:sz w:val="18"/>
+                <w:color w:val="000000"/>
+                <w:sz w:val="20"/>
               </w:rPr>
-              <w:t>Local Municipal</w:t>
-              <w:br/>
-              <w:t>Programs</w:t>
+              <w:t>Local Municipal Programs</w:t>
             </w:r>
           </w:p>
         </w:tc>
@@ -1003,8 +724,8 @@
             <w:r>
               <w:rPr>
                 <w:rFonts w:ascii="Times New Roman" w:hAnsi="Times New Roman"/>
-                <w:color w:val="333333"/>
-                <w:sz w:val="18"/>
+                <w:color w:val="000000"/>
+                <w:sz w:val="20"/>
               </w:rPr>
               <w:t>Free or close to it; government funded; available in lots of cities</w:t>
             </w:r>
@@ -1019,8 +740,8 @@
             <w:r>
               <w:rPr>
                 <w:rFonts w:ascii="Times New Roman" w:hAnsi="Times New Roman"/>
-                <w:color w:val="333333"/>
-                <w:sz w:val="18"/>
+                <w:color w:val="000000"/>
+                <w:sz w:val="20"/>
               </w:rPr>
               <w:t>Courts in rough shape; coaches who often have zero formal training; no curriculum</w:t>
             </w:r>
@@ -1035,8 +756,8 @@
             <w:r>
               <w:rPr>
                 <w:rFonts w:ascii="Times New Roman" w:hAnsi="Times New Roman"/>
-                <w:color w:val="333333"/>
-                <w:sz w:val="18"/>
+                <w:color w:val="000000"/>
+                <w:sz w:val="20"/>
               </w:rPr>
               <w:t>Mass/Basic</w:t>
             </w:r>
@@ -1047,34 +768,30 @@
         <w:tc>
           <w:tcPr>
             <w:tcW w:type="dxa" w:w="2340"/>
-            <w:shd w:fill="FFF3E6" w:val="clear"/>
           </w:tcPr>
           <w:p>
             <w:r/>
             <w:r>
               <w:rPr>
                 <w:rFonts w:ascii="Times New Roman" w:hAnsi="Times New Roman"/>
-                <w:color w:val="333333"/>
-                <w:sz w:val="18"/>
+                <w:color w:val="000000"/>
+                <w:sz w:val="20"/>
               </w:rPr>
-              <w:t>International Apps</w:t>
-              <w:br/>
-              <w:t>(HomeCourt, etc.)</w:t>
+              <w:t>International Apps (HomeCourt, etc.)</w:t>
             </w:r>
           </w:p>
         </w:tc>
         <w:tc>
           <w:tcPr>
             <w:tcW w:type="dxa" w:w="2340"/>
-            <w:shd w:fill="FFF3E6" w:val="clear"/>
           </w:tcPr>
           <w:p>
             <w:r/>
             <w:r>
               <w:rPr>
                 <w:rFonts w:ascii="Times New Roman" w:hAnsi="Times New Roman"/>
-                <w:color w:val="333333"/>
-                <w:sz w:val="18"/>
+                <w:color w:val="000000"/>
+                <w:sz w:val="20"/>
               </w:rPr>
               <w:t>Solid tech; AI feedback; big global user base</w:t>
             </w:r>
@@ -1083,15 +800,14 @@
         <w:tc>
           <w:tcPr>
             <w:tcW w:type="dxa" w:w="2340"/>
-            <w:shd w:fill="FFF3E6" w:val="clear"/>
           </w:tcPr>
           <w:p>
             <w:r/>
             <w:r>
               <w:rPr>
                 <w:rFonts w:ascii="Times New Roman" w:hAnsi="Times New Roman"/>
-                <w:color w:val="333333"/>
-                <w:sz w:val="18"/>
+                <w:color w:val="000000"/>
+                <w:sz w:val="20"/>
               </w:rPr>
               <w:t>No one on the ground in India; English only; designed for Americans, not Indians</w:t>
             </w:r>
@@ -1100,15 +816,14 @@
         <w:tc>
           <w:tcPr>
             <w:tcW w:type="dxa" w:w="2340"/>
-            <w:shd w:fill="FFF3E6" w:val="clear"/>
           </w:tcPr>
           <w:p>
             <w:r/>
             <w:r>
               <w:rPr>
                 <w:rFonts w:ascii="Times New Roman" w:hAnsi="Times New Roman"/>
-                <w:color w:val="333333"/>
-                <w:sz w:val="18"/>
+                <w:color w:val="000000"/>
+                <w:sz w:val="20"/>
               </w:rPr>
               <w:t>Digital/Global</w:t>
             </w:r>
@@ -1118,44 +833,42 @@
     </w:tbl>
     <w:p>
       <w:pPr>
-        <w:spacing w:after="120" w:before="0"/>
+        <w:spacing w:after="0" w:before="0" w:line="480" w:lineRule="exact"/>
         <w:jc w:val="left"/>
       </w:pPr>
       <w:r>
         <w:rPr>
           <w:rFonts w:ascii="Times New Roman" w:hAnsi="Times New Roman"/>
-          <w:b w:val="0"/>
-          <w:color w:val="333333"/>
-          <w:sz w:val="12"/>
+          <w:color w:val="000000"/>
+          <w:sz w:val="24"/>
         </w:rPr>
       </w:r>
     </w:p>
     <w:p>
       <w:pPr>
-        <w:spacing w:after="120" w:before="240"/>
+        <w:spacing w:after="0" w:before="240" w:line="480" w:lineRule="exact"/>
         <w:jc w:val="left"/>
       </w:pPr>
       <w:r>
         <w:rPr>
           <w:rFonts w:ascii="Times New Roman" w:hAnsi="Times New Roman"/>
           <w:b/>
-          <w:color w:val="333333"/>
-          <w:sz w:val="26"/>
+          <w:color w:val="000000"/>
+          <w:sz w:val="24"/>
         </w:rPr>
         <w:t>Competitive Differentiation</w:t>
       </w:r>
     </w:p>
     <w:p>
       <w:pPr>
-        <w:spacing w:after="120" w:before="0"/>
+        <w:spacing w:after="0" w:before="0" w:line="480" w:lineRule="exact"/>
         <w:ind w:firstLine="720"/>
         <w:jc w:val="left"/>
       </w:pPr>
       <w:r>
         <w:rPr>
           <w:rFonts w:ascii="Times New Roman" w:hAnsi="Times New Roman"/>
-          <w:b w:val="0"/>
-          <w:color w:val="333333"/>
+          <w:color w:val="000000"/>
           <w:sz w:val="24"/>
         </w:rPr>
         <w:t>Look at that table and the gap is pretty obvious. The NBA Academy? Amazing, but it serves a couple dozen kids. Municipal programs? Open to everyone, but the quality is rough. Apps like HomeCourt? Cool tech, zero connection to India. Nobody's doing both the physical and digital side in this market. That's the lane HoopRise is taking.</w:t>
@@ -1163,15 +876,13 @@
     </w:p>
     <w:p>
       <w:pPr>
-        <w:spacing w:after="120" w:before="0"/>
-        <w:ind w:firstLine="720"/>
+        <w:spacing w:after="0" w:before="0" w:line="480" w:lineRule="exact"/>
         <w:jc w:val="left"/>
       </w:pPr>
       <w:r>
         <w:rPr>
           <w:rFonts w:ascii="Times New Roman" w:hAnsi="Times New Roman"/>
-          <w:b w:val="0"/>
-          <w:color w:val="333333"/>
+          <w:color w:val="000000"/>
           <w:sz w:val="24"/>
         </w:rPr>
         <w:t>Premium enough to actually develop real players, but priced so a normal family can swing it. Specifically, here's what separates me:</w:t>
@@ -1179,77 +890,117 @@
     </w:p>
     <w:p>
       <w:pPr>
-        <w:pStyle w:val="ListBullet"/>
-        <w:spacing w:after="60" w:before="20"/>
+        <w:spacing w:after="0" w:before="0" w:line="480" w:lineRule="exact"/>
         <w:ind w:left="720"/>
       </w:pPr>
       <w:r>
         <w:rPr>
           <w:rFonts w:ascii="Times New Roman" w:hAnsi="Times New Roman"/>
-          <w:color w:val="333333"/>
+          <w:b/>
+          <w:color w:val="000000"/>
           <w:sz w:val="24"/>
         </w:rPr>
-        <w:t>Physical plus Digital: Train at the academy, keep working through the app at home. The learning doesn't end when you walk out the door.</w:t>
+        <w:t xml:space="preserve">Physical plus Digital: </w:t>
+      </w:r>
+      <w:r>
+        <w:rPr>
+          <w:rFonts w:ascii="Times New Roman" w:hAnsi="Times New Roman"/>
+          <w:color w:val="000000"/>
+          <w:sz w:val="24"/>
+        </w:rPr>
+        <w:t>Train at the academy, keep working through the app at home. The learning doesn't end when you walk out the door.</w:t>
       </w:r>
     </w:p>
     <w:p>
       <w:pPr>
-        <w:pStyle w:val="ListBullet"/>
-        <w:spacing w:after="60" w:before="20"/>
+        <w:spacing w:after="0" w:before="0" w:line="480" w:lineRule="exact"/>
         <w:ind w:left="720"/>
       </w:pPr>
       <w:r>
         <w:rPr>
           <w:rFonts w:ascii="Times New Roman" w:hAnsi="Times New Roman"/>
-          <w:color w:val="333333"/>
+          <w:b/>
+          <w:color w:val="000000"/>
           <w:sz w:val="24"/>
         </w:rPr>
-        <w:t>Personalized Plans: AI tracks what each player's good at and what they're struggling with, then adjusts. No one's running the same generic drills.</w:t>
+        <w:t xml:space="preserve">Personalized Plans: </w:t>
+      </w:r>
+      <w:r>
+        <w:rPr>
+          <w:rFonts w:ascii="Times New Roman" w:hAnsi="Times New Roman"/>
+          <w:color w:val="000000"/>
+          <w:sz w:val="24"/>
+        </w:rPr>
+        <w:t>AI tracks what each player's good at and what they're struggling with, then adjusts. No one's running the same generic drills.</w:t>
       </w:r>
     </w:p>
     <w:p>
       <w:pPr>
-        <w:pStyle w:val="ListBullet"/>
-        <w:spacing w:after="60" w:before="20"/>
+        <w:spacing w:after="0" w:before="0" w:line="480" w:lineRule="exact"/>
         <w:ind w:left="720"/>
       </w:pPr>
       <w:r>
         <w:rPr>
           <w:rFonts w:ascii="Times New Roman" w:hAnsi="Times New Roman"/>
-          <w:color w:val="333333"/>
+          <w:b/>
+          <w:color w:val="000000"/>
           <w:sz w:val="24"/>
         </w:rPr>
-        <w:t>Scholarships Built In: Financial aid was part of the model from the start. If a kid's talented, money shouldn't be what stops them.</w:t>
+        <w:t xml:space="preserve">Scholarships Built In: </w:t>
+      </w:r>
+      <w:r>
+        <w:rPr>
+          <w:rFonts w:ascii="Times New Roman" w:hAnsi="Times New Roman"/>
+          <w:color w:val="000000"/>
+          <w:sz w:val="24"/>
+        </w:rPr>
+        <w:t>Financial aid was part of the model from the start. If a kid's talented, money shouldn't be what stops them.</w:t>
       </w:r>
     </w:p>
     <w:p>
       <w:pPr>
-        <w:pStyle w:val="ListBullet"/>
-        <w:spacing w:after="60" w:before="20"/>
+        <w:spacing w:after="0" w:before="0" w:line="480" w:lineRule="exact"/>
         <w:ind w:left="720"/>
       </w:pPr>
       <w:r>
         <w:rPr>
           <w:rFonts w:ascii="Times New Roman" w:hAnsi="Times New Roman"/>
-          <w:color w:val="333333"/>
+          <w:b/>
+          <w:color w:val="000000"/>
           <w:sz w:val="24"/>
         </w:rPr>
-        <w:t>Multilingual: App launches in Hindi, English, Tamil, Kannada, and Marathi. Players should be able to train in a language they actually think in.</w:t>
+        <w:t xml:space="preserve">Multilingual: </w:t>
+      </w:r>
+      <w:r>
+        <w:rPr>
+          <w:rFonts w:ascii="Times New Roman" w:hAnsi="Times New Roman"/>
+          <w:color w:val="000000"/>
+          <w:sz w:val="24"/>
+        </w:rPr>
+        <w:t>App launches in Hindi, English, Tamil, Kannada, and Marathi. Players should be able to train in a language they actually think in.</w:t>
       </w:r>
     </w:p>
     <w:p>
       <w:pPr>
-        <w:pStyle w:val="ListBullet"/>
-        <w:spacing w:after="60" w:before="20"/>
+        <w:spacing w:after="0" w:before="0" w:line="480" w:lineRule="exact"/>
         <w:ind w:left="720"/>
       </w:pPr>
       <w:r>
         <w:rPr>
           <w:rFonts w:ascii="Times New Roman" w:hAnsi="Times New Roman"/>
-          <w:color w:val="333333"/>
+          <w:b/>
+          <w:color w:val="000000"/>
           <w:sz w:val="24"/>
         </w:rPr>
-        <w:t>A Real Path Forward: Direct connections to international college programs and pro leagues. Not vague promises, actual relationships.</w:t>
+        <w:t xml:space="preserve">A Real Path Forward: </w:t>
+      </w:r>
+      <w:r>
+        <w:rPr>
+          <w:rFonts w:ascii="Times New Roman" w:hAnsi="Times New Roman"/>
+          <w:color w:val="000000"/>
+          <w:sz w:val="24"/>
+        </w:rPr>
+        <w:t>Direct connections to international college programs and pro leagues. Not vague promises, actual relationships.</w:t>
       </w:r>
     </w:p>
     <w:p>
@@ -1259,45 +1010,44 @@
     </w:p>
     <w:p>
       <w:pPr>
-        <w:spacing w:after="160" w:before="360"/>
+        <w:spacing w:after="0" w:before="240" w:line="480" w:lineRule="exact"/>
+        <w:jc w:val="center"/>
+      </w:pPr>
+      <w:r>
+        <w:rPr>
+          <w:rFonts w:ascii="Times New Roman" w:hAnsi="Times New Roman"/>
+          <w:b/>
+          <w:color w:val="000000"/>
+          <w:sz w:val="24"/>
+        </w:rPr>
+        <w:t>Cultural Considerations</w:t>
+      </w:r>
+    </w:p>
+    <w:p>
+      <w:pPr>
+        <w:spacing w:after="0" w:before="240" w:line="480" w:lineRule="exact"/>
         <w:jc w:val="left"/>
       </w:pPr>
       <w:r>
         <w:rPr>
           <w:rFonts w:ascii="Times New Roman" w:hAnsi="Times New Roman"/>
           <w:b/>
-          <w:color w:val="E86C00"/>
-          <w:sz w:val="32"/>
-        </w:rPr>
-        <w:t>Cultural Considerations</w:t>
-      </w:r>
-    </w:p>
-    <w:p>
-      <w:pPr>
-        <w:spacing w:after="120" w:before="240"/>
-        <w:jc w:val="left"/>
-      </w:pPr>
-      <w:r>
-        <w:rPr>
-          <w:rFonts w:ascii="Times New Roman" w:hAnsi="Times New Roman"/>
-          <w:b/>
-          <w:color w:val="333333"/>
-          <w:sz w:val="26"/>
+          <w:color w:val="000000"/>
+          <w:sz w:val="24"/>
         </w:rPr>
         <w:t>Family-Centric Decision Making</w:t>
       </w:r>
     </w:p>
     <w:p>
       <w:pPr>
-        <w:spacing w:after="120" w:before="0"/>
+        <w:spacing w:after="0" w:before="0" w:line="480" w:lineRule="exact"/>
         <w:ind w:firstLine="720"/>
         <w:jc w:val="left"/>
       </w:pPr>
       <w:r>
         <w:rPr>
           <w:rFonts w:ascii="Times New Roman" w:hAnsi="Times New Roman"/>
-          <w:b w:val="0"/>
-          <w:color w:val="333333"/>
+          <w:color w:val="000000"/>
           <w:sz w:val="24"/>
         </w:rPr>
         <w:t>In India, the kid doesn't decide to join a basketball program. The family does. Sometimes it's mom and dad. Sometimes it's grandparents. Sometimes an uncle has opinions. That means my marketing can't just be highlight reels and cool branding aimed at teenagers. I have to answer the questions parents are actually asking: Will this help my kid's discipline? Will it teach them time management? Could this lead to a college scholarship?</w:t>
@@ -1305,15 +1055,14 @@
     </w:p>
     <w:p>
       <w:pPr>
-        <w:spacing w:after="120" w:before="0"/>
+        <w:spacing w:after="0" w:before="0" w:line="480" w:lineRule="exact"/>
         <w:ind w:firstLine="720"/>
         <w:jc w:val="left"/>
       </w:pPr>
       <w:r>
         <w:rPr>
           <w:rFonts w:ascii="Times New Roman" w:hAnsi="Times New Roman"/>
-          <w:b w:val="0"/>
-          <w:color w:val="333333"/>
+          <w:color w:val="000000"/>
           <w:sz w:val="24"/>
         </w:rPr>
         <w:t>So every piece of marketing hits those points. I'll run open-house days where families can walk through the facility, talk to coaches, ask whatever they want. Parents get quarterly progress reports. The whole signup process is designed to make them feel like they're part of this, not just the ones paying for it. If the parents aren't bought in, the kid isn't showing up. That's just how it works there.</w:t>
@@ -1321,46 +1070,44 @@
     </w:p>
     <w:p>
       <w:pPr>
-        <w:spacing w:after="120" w:before="240"/>
+        <w:spacing w:after="0" w:before="240" w:line="480" w:lineRule="exact"/>
         <w:jc w:val="left"/>
       </w:pPr>
       <w:r>
         <w:rPr>
           <w:rFonts w:ascii="Times New Roman" w:hAnsi="Times New Roman"/>
           <w:b/>
-          <w:color w:val="333333"/>
-          <w:sz w:val="26"/>
+          <w:color w:val="000000"/>
+          <w:sz w:val="24"/>
         </w:rPr>
         <w:t>Education-First Culture</w:t>
       </w:r>
     </w:p>
     <w:p>
       <w:pPr>
-        <w:spacing w:after="120" w:before="0"/>
+        <w:spacing w:after="0" w:before="0" w:line="480" w:lineRule="exact"/>
         <w:ind w:firstLine="720"/>
         <w:jc w:val="left"/>
       </w:pPr>
       <w:r>
         <w:rPr>
           <w:rFonts w:ascii="Times New Roman" w:hAnsi="Times New Roman"/>
-          <w:b w:val="0"/>
-          <w:color w:val="333333"/>
+          <w:color w:val="000000"/>
           <w:sz w:val="24"/>
         </w:rPr>
-        <w:t>School comes first. Always. If an Indian parent has to pick between a tutor and basketball practice, basketball loses ten out of ten times. I're not fighting that because I'd lose. Instead, I built the schedule around it. Practice runs outside school hours. During board exam season, which hits in March-April and again in October-November, I cut back sessions and let families pick flexible times. Every academy has a study room where kids can do homework before or after they train, and that detail matters more than it might seem. It tells parents I're not pulling their kid away from academics.</w:t>
+        <w:t>School comes first. Always. If an Indian parent has to pick between a tutor and basketball practice, basketball loses ten out of ten times. I'm not fighting that because I'd lose. Instead, I built the schedule around it. Practice runs outside school hours. During board exam season, which hits in March-April and again in October-November, I cut back sessions and let families pick flexible times. Every academy has a study room where kids can do homework before or after they train, and that detail matters more than it might seem. It tells parents I'm not pulling their kid away from academics.</w:t>
       </w:r>
     </w:p>
     <w:p>
       <w:pPr>
-        <w:spacing w:after="120" w:before="0"/>
+        <w:spacing w:after="0" w:before="0" w:line="480" w:lineRule="exact"/>
         <w:ind w:firstLine="720"/>
         <w:jc w:val="left"/>
       </w:pPr>
       <w:r>
         <w:rPr>
           <w:rFonts w:ascii="Times New Roman" w:hAnsi="Times New Roman"/>
-          <w:b w:val="0"/>
-          <w:color w:val="333333"/>
+          <w:color w:val="000000"/>
           <w:sz w:val="24"/>
         </w:rPr>
         <w:t>The scholarship angle is big, too. I'll show families real stories of basketball players who got into international universities because of the sport. When a parent sees that basketball could actually help their kid's education rather than hurt it, the conversation changes completely.</w:t>
@@ -1368,108 +1115,104 @@
     </w:p>
     <w:p>
       <w:pPr>
-        <w:spacing w:after="120" w:before="240"/>
+        <w:spacing w:after="0" w:before="240" w:line="480" w:lineRule="exact"/>
         <w:jc w:val="left"/>
       </w:pPr>
       <w:r>
         <w:rPr>
           <w:rFonts w:ascii="Times New Roman" w:hAnsi="Times New Roman"/>
           <w:b/>
-          <w:color w:val="333333"/>
-          <w:sz w:val="26"/>
+          <w:color w:val="000000"/>
+          <w:sz w:val="24"/>
         </w:rPr>
         <w:t>Language and Regional Diversity</w:t>
       </w:r>
     </w:p>
     <w:p>
       <w:pPr>
-        <w:spacing w:after="120" w:before="0"/>
+        <w:spacing w:after="0" w:before="0" w:line="480" w:lineRule="exact"/>
         <w:ind w:firstLine="720"/>
         <w:jc w:val="left"/>
       </w:pPr>
       <w:r>
         <w:rPr>
           <w:rFonts w:ascii="Times New Roman" w:hAnsi="Times New Roman"/>
-          <w:b w:val="0"/>
-          <w:color w:val="333333"/>
+          <w:color w:val="000000"/>
           <w:sz w:val="24"/>
         </w:rPr>
-        <w:t>India has 22 official languages. Hundreds of dialects on top of that. Running everything in English only would be a huge mistake. Coaches at each academy will work bilingually: English and Hindi in Delhi, English and Marathi in Mumbai, English and Kannada in Bangalore. The app ships in five languages at launch, with more coming based on what people ask for. And I're localizing marketing, too. Not just translating it, but actually using cultural references that mean something in each city. A campaign that hits in Delhi might fall totally flat in Bangalore if you don't adjust the context.</w:t>
+        <w:t>India has 22 official languages. Hundreds of dialects on top of that. Running everything in English only would be a huge mistake. Coaches at each academy will work bilingually: English and Hindi in Delhi, English and Marathi in Mumbai, English and Kannada in Bangalore. The app ships in five languages at launch, with more coming based on what people ask for. And I'm localizing marketing, too. Not just translating it, but actually using cultural references that mean something in each city. A campaign that hits in Delhi might fall totally flat in Bangalore if you don't adjust the context.</w:t>
       </w:r>
     </w:p>
     <w:p>
       <w:pPr>
-        <w:spacing w:after="120" w:before="240"/>
+        <w:spacing w:after="0" w:before="240" w:line="480" w:lineRule="exact"/>
         <w:jc w:val="left"/>
       </w:pPr>
       <w:r>
         <w:rPr>
           <w:rFonts w:ascii="Times New Roman" w:hAnsi="Times New Roman"/>
           <w:b/>
-          <w:color w:val="333333"/>
-          <w:sz w:val="26"/>
+          <w:color w:val="000000"/>
+          <w:sz w:val="24"/>
         </w:rPr>
         <w:t>Religious and Festival Sensitivity</w:t>
       </w:r>
     </w:p>
     <w:p>
       <w:pPr>
-        <w:spacing w:after="120" w:before="0"/>
+        <w:spacing w:after="0" w:before="0" w:line="480" w:lineRule="exact"/>
         <w:ind w:firstLine="720"/>
         <w:jc w:val="left"/>
       </w:pPr>
       <w:r>
         <w:rPr>
           <w:rFonts w:ascii="Times New Roman" w:hAnsi="Times New Roman"/>
-          <w:b w:val="0"/>
-          <w:color w:val="333333"/>
+          <w:color w:val="000000"/>
           <w:sz w:val="24"/>
         </w:rPr>
-        <w:t>Diwali. Eid. Christmas. Holi. Pongal. Navratri. The list goes on. India's festival calendar is packed, and these aren't just days off. They're deeply important to families. I're building my yearly schedule with those dates baked in from the start. Training adjusts around major holidays. During festival seasons, I'll host themed events that bring together kids from all different backgrounds. Making the academy a place where everyone feels welcome isn't optional. In a country this diverse, it's the only way to keep people coming back long-term.</w:t>
+        <w:t>Diwali. Eid. Christmas. Holi. Pongal. Navratri. The list goes on. India's festival calendar is packed, and these aren't just days off. They're deeply important to families. I'm building my yearly schedule with those dates baked in from the start. Training adjusts around major holidays. During festival seasons, I'll host themed events that bring together kids from all different backgrounds. Making the academy a place where everyone feels welcome isn't optional. In a country this diverse, it's the only way to keep people coming back long-term.</w:t>
       </w:r>
     </w:p>
     <w:p>
       <w:pPr>
-        <w:spacing w:after="120" w:before="240"/>
+        <w:spacing w:after="0" w:before="240" w:line="480" w:lineRule="exact"/>
         <w:jc w:val="left"/>
       </w:pPr>
       <w:r>
         <w:rPr>
           <w:rFonts w:ascii="Times New Roman" w:hAnsi="Times New Roman"/>
           <w:b/>
-          <w:color w:val="333333"/>
-          <w:sz w:val="26"/>
+          <w:color w:val="000000"/>
+          <w:sz w:val="24"/>
         </w:rPr>
         <w:t>Gender Considerations</w:t>
       </w:r>
     </w:p>
     <w:p>
       <w:pPr>
-        <w:spacing w:after="120" w:before="0"/>
+        <w:spacing w:after="0" w:before="0" w:line="480" w:lineRule="exact"/>
         <w:ind w:firstLine="720"/>
         <w:jc w:val="left"/>
       </w:pPr>
       <w:r>
         <w:rPr>
           <w:rFonts w:ascii="Times New Roman" w:hAnsi="Times New Roman"/>
-          <w:b w:val="0"/>
-          <w:color w:val="333333"/>
+          <w:color w:val="000000"/>
           <w:sz w:val="24"/>
         </w:rPr>
-        <w:t>Women's basketball is growing in urban India, but there's still real hesitation in some families about girls training alongside boys, especially once they're teenagers. I're offering dedicated girls-only sessions with female coaches. That one change removes the biggest barrier for families who'd otherwise just say no.</w:t>
+        <w:t>Women's basketball is growing in urban India, but there's still real hesitation in some families about girls training alongside boys, especially once they're teenagers. I'm offering dedicated girls-only sessions with female coaches. That one change removes the biggest barrier for families who'd otherwise just say no.</w:t>
       </w:r>
     </w:p>
     <w:p>
       <w:pPr>
-        <w:spacing w:after="120" w:before="0"/>
+        <w:spacing w:after="0" w:before="0" w:line="480" w:lineRule="exact"/>
         <w:ind w:firstLine="720"/>
         <w:jc w:val="left"/>
       </w:pPr>
       <w:r>
         <w:rPr>
           <w:rFonts w:ascii="Times New Roman" w:hAnsi="Times New Roman"/>
-          <w:b w:val="0"/>
-          <w:color w:val="333333"/>
+          <w:color w:val="000000"/>
           <w:sz w:val="24"/>
         </w:rPr>
         <w:t>I'll also make sure female players are front and center in my marketing. Not shoved into a sidebar, but actually featured as a core part of the brand. And if you look at it purely from a business perspective, ignoring the women's side means voluntarily cutting my addressable market in half. That just doesn't make sense.</w:t>
@@ -1482,154 +1225,149 @@
     </w:p>
     <w:p>
       <w:pPr>
-        <w:spacing w:after="160" w:before="360"/>
+        <w:spacing w:after="0" w:before="240" w:line="480" w:lineRule="exact"/>
+        <w:jc w:val="center"/>
+      </w:pPr>
+      <w:r>
+        <w:rPr>
+          <w:rFonts w:ascii="Times New Roman" w:hAnsi="Times New Roman"/>
+          <w:b/>
+          <w:color w:val="000000"/>
+          <w:sz w:val="24"/>
+        </w:rPr>
+        <w:t>Fundraising/Financing</w:t>
+      </w:r>
+    </w:p>
+    <w:p>
+      <w:pPr>
+        <w:spacing w:after="0" w:before="0" w:line="480" w:lineRule="exact"/>
+        <w:ind w:firstLine="720"/>
+        <w:jc w:val="left"/>
+      </w:pPr>
+      <w:r>
+        <w:rPr>
+          <w:rFonts w:ascii="Times New Roman" w:hAnsi="Times New Roman"/>
+          <w:color w:val="000000"/>
+          <w:sz w:val="24"/>
+        </w:rPr>
+        <w:t>Total cost to launch and survive year one: roughly $900,000. That's facilities, staff, app development, marketing, and a buffer for things I didn't predict. I'm pulling that from four different places so I'm not dependent on any single source.</w:t>
+      </w:r>
+    </w:p>
+    <w:p>
+      <w:pPr>
+        <w:spacing w:after="0" w:before="240" w:line="480" w:lineRule="exact"/>
         <w:jc w:val="left"/>
       </w:pPr>
       <w:r>
         <w:rPr>
           <w:rFonts w:ascii="Times New Roman" w:hAnsi="Times New Roman"/>
           <w:b/>
-          <w:color w:val="E86C00"/>
-          <w:sz w:val="32"/>
+          <w:color w:val="000000"/>
+          <w:sz w:val="24"/>
         </w:rPr>
-        <w:t>Fundraising/Financing</w:t>
+        <w:t>Angel Investors and Venture Capital</w:t>
       </w:r>
     </w:p>
     <w:p>
       <w:pPr>
-        <w:spacing w:after="120" w:before="0"/>
+        <w:spacing w:after="0" w:before="0" w:line="480" w:lineRule="exact"/>
         <w:ind w:firstLine="720"/>
         <w:jc w:val="left"/>
       </w:pPr>
       <w:r>
         <w:rPr>
           <w:rFonts w:ascii="Times New Roman" w:hAnsi="Times New Roman"/>
-          <w:b w:val="0"/>
-          <w:color w:val="333333"/>
+          <w:color w:val="000000"/>
           <w:sz w:val="24"/>
         </w:rPr>
-        <w:t>Total cost to launch and survive year one: roughly $900,000. That's facilities, staff, app development, marketing, and a buffer for things I didn't predict. I're pulling that from four different places so I're not dependent on any single source.</w:t>
+        <w:t>Sports-tech investing in India has gotten a lot more active. Dream Sports, Blume Ventures, Sequoia India, they're all looking for plays in this space. I'm targeting a $400,000 seed round from angels with backgrounds in sports, education, or youth development. The pitch is pretty straightforward: India has the world's biggest young population, basketball interest is spiking, and nobody's built a scalable training model that mixes physical and digital. That's the gap. I'm filling it.</w:t>
       </w:r>
     </w:p>
     <w:p>
       <w:pPr>
-        <w:spacing w:after="120" w:before="240"/>
+        <w:spacing w:after="0" w:before="240" w:line="480" w:lineRule="exact"/>
         <w:jc w:val="left"/>
       </w:pPr>
       <w:r>
         <w:rPr>
           <w:rFonts w:ascii="Times New Roman" w:hAnsi="Times New Roman"/>
           <w:b/>
-          <w:color w:val="333333"/>
-          <w:sz w:val="26"/>
+          <w:color w:val="000000"/>
+          <w:sz w:val="24"/>
         </w:rPr>
-        <w:t>Angel Investors and Venture Capital</w:t>
+        <w:t>Government Grants and Initiatives</w:t>
       </w:r>
     </w:p>
     <w:p>
       <w:pPr>
-        <w:spacing w:after="120" w:before="0"/>
+        <w:spacing w:after="0" w:before="0" w:line="480" w:lineRule="exact"/>
         <w:ind w:firstLine="720"/>
         <w:jc w:val="left"/>
       </w:pPr>
       <w:r>
         <w:rPr>
           <w:rFonts w:ascii="Times New Roman" w:hAnsi="Times New Roman"/>
-          <w:b w:val="0"/>
-          <w:color w:val="333333"/>
+          <w:color w:val="000000"/>
           <w:sz w:val="24"/>
         </w:rPr>
-        <w:t>Sports-tech investing in India has gotten a lot more active. Dream Sports, Blume Ventures, Sequoia India, they're all looking for plays in this space. I're targeting a $400,000 seed round from angels with backgrounds in sports, education, or youth development. The pitch is pretty straightforward: India has the world's biggest young population, basketball interest is spiking, and nobody's built a scalable training model that mixes physical and digital. That's the gap. I're filling it.</w:t>
+        <w:t>India's Khelo India program and the Sports Authority of India hand out grants to organizations doing grassroots sports work. If I get accredited as an official training center, that could mean $100,000 to $150,000 in grant money plus cheap access to government sports facilities. Maharashtra, Delhi, and Karnataka all have their own state-level sports funds too, so I'm applying at every level I can.</w:t>
       </w:r>
     </w:p>
     <w:p>
       <w:pPr>
-        <w:spacing w:after="120" w:before="240"/>
+        <w:spacing w:after="0" w:before="240" w:line="480" w:lineRule="exact"/>
         <w:jc w:val="left"/>
       </w:pPr>
       <w:r>
         <w:rPr>
           <w:rFonts w:ascii="Times New Roman" w:hAnsi="Times New Roman"/>
           <w:b/>
-          <w:color w:val="333333"/>
-          <w:sz w:val="26"/>
+          <w:color w:val="000000"/>
+          <w:sz w:val="24"/>
         </w:rPr>
-        <w:t>Government Grants and Initiatives</w:t>
+        <w:t>Corporate Sponsorships</w:t>
       </w:r>
     </w:p>
     <w:p>
       <w:pPr>
-        <w:spacing w:after="120" w:before="0"/>
+        <w:spacing w:after="0" w:before="0" w:line="480" w:lineRule="exact"/>
         <w:ind w:firstLine="720"/>
         <w:jc w:val="left"/>
       </w:pPr>
       <w:r>
         <w:rPr>
           <w:rFonts w:ascii="Times New Roman" w:hAnsi="Times New Roman"/>
-          <w:b w:val="0"/>
-          <w:color w:val="333333"/>
+          <w:color w:val="000000"/>
           <w:sz w:val="24"/>
         </w:rPr>
-        <w:t>India's Khelo India program and the Sports Authority of India hand out grants to organizations doing grassroots sports work. If I get accredited as an official training center, that could mean $100,000 to $150,000 in grant money plus cheap access to government sports facilities. Maharashtra, Delhi, and Karnataka all have their own state-level sports funds too, so I're applying at every level I can.</w:t>
+        <w:t>Most people outside India don't know this, but Indian companies above a certain profit level are legally required to spend 2% of their net profits on corporate social responsibility. Youth sports qualifies. That means I can walk into a meeting with Tata, Reliance, or Infosys and present a sponsorship deal where they're spending money they have to spend anyway, but on something that actually gives them brand exposure with young consumers. I'm putting together sponsorship tiers from $25,000 to $200,000, with visibility at academies, in the app, and at events.</w:t>
       </w:r>
     </w:p>
     <w:p>
       <w:pPr>
-        <w:spacing w:after="120" w:before="240"/>
+        <w:spacing w:after="0" w:before="240" w:line="480" w:lineRule="exact"/>
         <w:jc w:val="left"/>
       </w:pPr>
       <w:r>
         <w:rPr>
           <w:rFonts w:ascii="Times New Roman" w:hAnsi="Times New Roman"/>
           <w:b/>
-          <w:color w:val="333333"/>
-          <w:sz w:val="26"/>
+          <w:color w:val="000000"/>
+          <w:sz w:val="24"/>
         </w:rPr>
-        <w:t>Corporate Sponsorships</w:t>
+        <w:t>Crowdfunding</w:t>
       </w:r>
     </w:p>
     <w:p>
       <w:pPr>
-        <w:spacing w:after="120" w:before="0"/>
+        <w:spacing w:after="0" w:before="0" w:line="480" w:lineRule="exact"/>
         <w:ind w:firstLine="720"/>
         <w:jc w:val="left"/>
       </w:pPr>
       <w:r>
         <w:rPr>
           <w:rFonts w:ascii="Times New Roman" w:hAnsi="Times New Roman"/>
-          <w:b w:val="0"/>
-          <w:color w:val="333333"/>
-          <w:sz w:val="24"/>
-        </w:rPr>
-        <w:t>Most people outside India don't know this, but Indian companies above a certain profit level are legally required to spend 2% of their net profits on corporate social responsibility. Youth sports qualifies. That means I can walk into a meeting with Tata, Reliance, or Infosys and present a sponsorship deal where they're spending money they have to spend anyway, but on something that actually gives them brand exposure with young consumers. I're putting together sponsorship tiers from $25,000 to $200,000, with visibility at academies, in the app, and at events.</w:t>
-      </w:r>
-    </w:p>
-    <w:p>
-      <w:pPr>
-        <w:spacing w:after="120" w:before="240"/>
-        <w:jc w:val="left"/>
-      </w:pPr>
-      <w:r>
-        <w:rPr>
-          <w:rFonts w:ascii="Times New Roman" w:hAnsi="Times New Roman"/>
-          <w:b/>
-          <w:color w:val="333333"/>
-          <w:sz w:val="26"/>
-        </w:rPr>
-        <w:t>Crowdfunding</w:t>
-      </w:r>
-    </w:p>
-    <w:p>
-      <w:pPr>
-        <w:spacing w:after="120" w:before="0"/>
-        <w:ind w:firstLine="720"/>
-        <w:jc w:val="left"/>
-      </w:pPr>
-      <w:r>
-        <w:rPr>
-          <w:rFonts w:ascii="Times New Roman" w:hAnsi="Times New Roman"/>
-          <w:b w:val="0"/>
-          <w:color w:val="333333"/>
+          <w:color w:val="000000"/>
           <w:sz w:val="24"/>
         </w:rPr>
         <w:t>I'll run a campaign on Ketto (India's biggest crowdfunding platform) and Kickstarter. Target is $50,000 to $75,000, but the money's almost secondary. What crowdfunding really does is build a base of early supporters who are personally invested before I've even opened the doors. Backers get discounted memberships, merch, and early app access. It also forces me to tell my story publicly, and stories about giving kids access to sports they couldn't otherwise afford tend to travel fast online.</w:t>
@@ -1642,45 +1380,44 @@
     </w:p>
     <w:p>
       <w:pPr>
-        <w:spacing w:after="160" w:before="360"/>
+        <w:spacing w:after="0" w:before="240" w:line="480" w:lineRule="exact"/>
+        <w:jc w:val="center"/>
+      </w:pPr>
+      <w:r>
+        <w:rPr>
+          <w:rFonts w:ascii="Times New Roman" w:hAnsi="Times New Roman"/>
+          <w:b/>
+          <w:color w:val="000000"/>
+          <w:sz w:val="24"/>
+        </w:rPr>
+        <w:t>Promotional Strategies</w:t>
+      </w:r>
+    </w:p>
+    <w:p>
+      <w:pPr>
+        <w:spacing w:after="0" w:before="240" w:line="480" w:lineRule="exact"/>
         <w:jc w:val="left"/>
       </w:pPr>
       <w:r>
         <w:rPr>
           <w:rFonts w:ascii="Times New Roman" w:hAnsi="Times New Roman"/>
           <w:b/>
-          <w:color w:val="E86C00"/>
-          <w:sz w:val="32"/>
-        </w:rPr>
-        <w:t>Promotional Strategies</w:t>
-      </w:r>
-    </w:p>
-    <w:p>
-      <w:pPr>
-        <w:spacing w:after="120" w:before="240"/>
-        <w:jc w:val="left"/>
-      </w:pPr>
-      <w:r>
-        <w:rPr>
-          <w:rFonts w:ascii="Times New Roman" w:hAnsi="Times New Roman"/>
-          <w:b/>
-          <w:color w:val="333333"/>
-          <w:sz w:val="26"/>
+          <w:color w:val="000000"/>
+          <w:sz w:val="24"/>
         </w:rPr>
         <w:t>Digital Marketing Campaigns</w:t>
       </w:r>
     </w:p>
     <w:p>
       <w:pPr>
-        <w:spacing w:after="120" w:before="0"/>
+        <w:spacing w:after="0" w:before="0" w:line="480" w:lineRule="exact"/>
         <w:ind w:firstLine="720"/>
         <w:jc w:val="left"/>
       </w:pPr>
       <w:r>
         <w:rPr>
           <w:rFonts w:ascii="Times New Roman" w:hAnsi="Times New Roman"/>
-          <w:b w:val="0"/>
-          <w:color w:val="333333"/>
+          <w:color w:val="000000"/>
           <w:sz w:val="24"/>
         </w:rPr>
         <w:t>800 million internet users. Digital's obviously the main channel. Targeted ads on Instagram, YouTube, and Facebook, heavy on video. Training clips, player progress stories, behind-the-scenes academy stuff. Placing YouTube pre-roll ads on NBA content is kind of a no-brainer since that's exactly where my audience already hangs out.</w:t>
@@ -1688,15 +1425,14 @@
     </w:p>
     <w:p>
       <w:pPr>
-        <w:spacing w:after="120" w:before="0"/>
+        <w:spacing w:after="0" w:before="0" w:line="480" w:lineRule="exact"/>
         <w:ind w:firstLine="720"/>
         <w:jc w:val="left"/>
       </w:pPr>
       <w:r>
         <w:rPr>
           <w:rFonts w:ascii="Times New Roman" w:hAnsi="Times New Roman"/>
-          <w:b w:val="0"/>
-          <w:color w:val="333333"/>
+          <w:color w:val="000000"/>
           <w:sz w:val="24"/>
         </w:rPr>
         <w:t>I'll also invest in SEO and Google Ads for search terms like "basketball training India" and "basketball academy near me." And I'll put out weekly blog posts and tutorial videos. The idea isn't just advertising, it's making HoopRise the name that keeps popping up whenever anyone in India searches for anything related to basketball development.</w:t>
@@ -1704,61 +1440,59 @@
     </w:p>
     <w:p>
       <w:pPr>
-        <w:spacing w:after="120" w:before="240"/>
+        <w:spacing w:after="0" w:before="240" w:line="480" w:lineRule="exact"/>
         <w:jc w:val="left"/>
       </w:pPr>
       <w:r>
         <w:rPr>
           <w:rFonts w:ascii="Times New Roman" w:hAnsi="Times New Roman"/>
           <w:b/>
-          <w:color w:val="333333"/>
-          <w:sz w:val="26"/>
+          <w:color w:val="000000"/>
+          <w:sz w:val="24"/>
         </w:rPr>
         <w:t>Influencer and Ambassador Partnerships</w:t>
       </w:r>
     </w:p>
     <w:p>
       <w:pPr>
-        <w:spacing w:after="120" w:before="0"/>
+        <w:spacing w:after="0" w:before="0" w:line="480" w:lineRule="exact"/>
         <w:ind w:firstLine="720"/>
         <w:jc w:val="left"/>
       </w:pPr>
       <w:r>
         <w:rPr>
           <w:rFonts w:ascii="Times New Roman" w:hAnsi="Times New Roman"/>
-          <w:b w:val="0"/>
-          <w:color w:val="333333"/>
+          <w:color w:val="000000"/>
           <w:sz w:val="24"/>
         </w:rPr>
-        <w:t>I want actual people attached to this brand. Satnam Singh was the first Indian ever drafted by an NBA team. Prachi Tehlan captained the national women's team. Those are the kinds of names I're going after. In each city, I'll also work with local micro-influencers, people with 50K to 200K followers who have real pull in their communities, not just big numbers. I want content collabs and event appearances that feel genuine, not stiff endorsement deals that everyone scrolls past.</w:t>
+        <w:t>I want actual people attached to this brand. Satnam Singh was the first Indian ever drafted by an NBA team. Prachi Tehlan captained the national women's team. Those are the kinds of names I'm going after. In each city, I'll also work with local micro-influencers, people with 50K to 200K followers who have real pull in their communities, not just big numbers. I want content collabs and event appearances that feel genuine, not stiff endorsement deals that everyone scrolls past.</w:t>
       </w:r>
     </w:p>
     <w:p>
       <w:pPr>
-        <w:spacing w:after="120" w:before="240"/>
+        <w:spacing w:after="0" w:before="240" w:line="480" w:lineRule="exact"/>
         <w:jc w:val="left"/>
       </w:pPr>
       <w:r>
         <w:rPr>
           <w:rFonts w:ascii="Times New Roman" w:hAnsi="Times New Roman"/>
           <w:b/>
-          <w:color w:val="333333"/>
-          <w:sz w:val="26"/>
+          <w:color w:val="000000"/>
+          <w:sz w:val="24"/>
         </w:rPr>
         <w:t>School and University Outreach</w:t>
       </w:r>
     </w:p>
     <w:p>
       <w:pPr>
-        <w:spacing w:after="120" w:before="0"/>
+        <w:spacing w:after="0" w:before="0" w:line="480" w:lineRule="exact"/>
         <w:ind w:firstLine="720"/>
         <w:jc w:val="left"/>
       </w:pPr>
       <w:r>
         <w:rPr>
           <w:rFonts w:ascii="Times New Roman" w:hAnsi="Times New Roman"/>
-          <w:b w:val="0"/>
-          <w:color w:val="333333"/>
+          <w:color w:val="000000"/>
           <w:sz w:val="24"/>
         </w:rPr>
         <w:t>My customers sit in classrooms five days a week. Getting into schools is a huge deal. Free intro clinics at partner schools, equipment donations for schools starting basketball programs, inter-school tournament sponsorships. On the college side, I want to be the training partner that university basketball teams turn to for group packages and performance analytics through the app. It's about being present in the places where young people already are, instead of trying to pull them somewhere new.</w:t>
@@ -1766,33 +1500,32 @@
     </w:p>
     <w:p>
       <w:pPr>
-        <w:spacing w:after="120" w:before="240"/>
+        <w:spacing w:after="0" w:before="240" w:line="480" w:lineRule="exact"/>
         <w:jc w:val="left"/>
       </w:pPr>
       <w:r>
         <w:rPr>
           <w:rFonts w:ascii="Times New Roman" w:hAnsi="Times New Roman"/>
           <w:b/>
-          <w:color w:val="333333"/>
-          <w:sz w:val="26"/>
+          <w:color w:val="000000"/>
+          <w:sz w:val="24"/>
         </w:rPr>
         <w:t>Event Sponsorships and Community Engagement</w:t>
       </w:r>
     </w:p>
     <w:p>
       <w:pPr>
-        <w:spacing w:after="120" w:before="0"/>
+        <w:spacing w:after="0" w:before="0" w:line="480" w:lineRule="exact"/>
         <w:ind w:firstLine="720"/>
         <w:jc w:val="left"/>
       </w:pPr>
       <w:r>
         <w:rPr>
           <w:rFonts w:ascii="Times New Roman" w:hAnsi="Times New Roman"/>
-          <w:b w:val="0"/>
-          <w:color w:val="333333"/>
+          <w:color w:val="000000"/>
           <w:sz w:val="24"/>
         </w:rPr>
-        <w:t>Online ads can only do so much. People need to experience the product. So I're doing 3-on-3 street tournaments. Basketball camps during school breaks. Watch parties for the NBA Finals and All-Star Weekend. And once a year, a big event called the "HoopRise Rising Stars Challenge" that gets press, drives social media buzz, and gives the brand a signature moment. Long term, I want HoopRise to feel like the center of basketball culture in India. Not just a training academy, but the place where the basketball community actually gathers.</w:t>
+        <w:t>Online ads can only do so much. People need to experience the product. So I'm doing 3-on-3 street tournaments. Basketball camps during school breaks. Watch parties for the NBA Finals and All-Star Weekend. And once a year, a big event called the "HoopRise Rising Stars Challenge" that gets press, drives social media buzz, and gives the brand a signature moment. Long term, I want HoopRise to feel like the center of basketball culture in India. Not just a training academy, but the place where the basketball community actually gathers.</w:t>
       </w:r>
     </w:p>
     <w:p>
@@ -1802,33 +1535,47 @@
     </w:p>
     <w:p>
       <w:pPr>
-        <w:spacing w:after="160" w:before="360"/>
+        <w:spacing w:after="0" w:before="240" w:line="480" w:lineRule="exact"/>
+        <w:jc w:val="center"/>
+      </w:pPr>
+      <w:r>
+        <w:rPr>
+          <w:rFonts w:ascii="Times New Roman" w:hAnsi="Times New Roman"/>
+          <w:b/>
+          <w:color w:val="000000"/>
+          <w:sz w:val="24"/>
+        </w:rPr>
+        <w:t>Anticipated Budget</w:t>
+      </w:r>
+    </w:p>
+    <w:p>
+      <w:pPr>
+        <w:spacing w:after="0" w:before="0" w:line="480" w:lineRule="exact"/>
+        <w:ind w:firstLine="720"/>
+        <w:jc w:val="left"/>
+      </w:pPr>
+      <w:r>
+        <w:rPr>
+          <w:rFonts w:ascii="Times New Roman" w:hAnsi="Times New Roman"/>
+          <w:color w:val="000000"/>
+          <w:sz w:val="24"/>
+        </w:rPr>
+        <w:t>Three-year financial picture. Year 1 I spend a lot and don't make it all back. Year 2 I grow into profitability. Year 3 I'm making money.</w:t>
+      </w:r>
+    </w:p>
+    <w:p>
+      <w:pPr>
+        <w:spacing w:after="0" w:before="240" w:line="480" w:lineRule="exact"/>
         <w:jc w:val="left"/>
       </w:pPr>
       <w:r>
         <w:rPr>
           <w:rFonts w:ascii="Times New Roman" w:hAnsi="Times New Roman"/>
           <w:b/>
-          <w:color w:val="E86C00"/>
-          <w:sz w:val="32"/>
-        </w:rPr>
-        <w:t>Anticipated Budget</w:t>
-      </w:r>
-    </w:p>
-    <w:p>
-      <w:pPr>
-        <w:spacing w:after="120" w:before="0"/>
-        <w:ind w:firstLine="720"/>
-        <w:jc w:val="left"/>
-      </w:pPr>
-      <w:r>
-        <w:rPr>
-          <w:rFonts w:ascii="Times New Roman" w:hAnsi="Times New Roman"/>
-          <w:b w:val="0"/>
-          <w:color w:val="333333"/>
+          <w:color w:val="000000"/>
           <w:sz w:val="24"/>
         </w:rPr>
-        <w:t>Three-year financial picture. Year 1 I spend a lot and don't make it all back. Year 2 I grow into profitability. Year 3 I're making money.</w:t>
+        <w:t>Projected Expenses</w:t>
       </w:r>
     </w:p>
     <w:tbl>
@@ -1848,7 +1595,6 @@
         <w:tc>
           <w:tcPr>
             <w:tcW w:type="dxa" w:w="2340"/>
-            <w:shd w:fill="E86C00" w:val="clear"/>
           </w:tcPr>
           <w:p>
             <w:pPr>
@@ -1859,8 +1605,8 @@
               <w:rPr>
                 <w:rFonts w:ascii="Times New Roman" w:hAnsi="Times New Roman"/>
                 <w:b/>
-                <w:color w:val="FFFFFF"/>
-                <w:sz w:val="20"/>
+                <w:color w:val="000000"/>
+                <w:sz w:val="22"/>
               </w:rPr>
               <w:t>Category</w:t>
             </w:r>
@@ -1869,7 +1615,6 @@
         <w:tc>
           <w:tcPr>
             <w:tcW w:type="dxa" w:w="2340"/>
-            <w:shd w:fill="E86C00" w:val="clear"/>
           </w:tcPr>
           <w:p>
             <w:pPr>
@@ -1880,8 +1625,8 @@
               <w:rPr>
                 <w:rFonts w:ascii="Times New Roman" w:hAnsi="Times New Roman"/>
                 <w:b/>
-                <w:color w:val="FFFFFF"/>
-                <w:sz w:val="20"/>
+                <w:color w:val="000000"/>
+                <w:sz w:val="22"/>
               </w:rPr>
               <w:t>Year 1 (USD)</w:t>
             </w:r>
@@ -1890,7 +1635,6 @@
         <w:tc>
           <w:tcPr>
             <w:tcW w:type="dxa" w:w="2340"/>
-            <w:shd w:fill="E86C00" w:val="clear"/>
           </w:tcPr>
           <w:p>
             <w:pPr>
@@ -1901,8 +1645,8 @@
               <w:rPr>
                 <w:rFonts w:ascii="Times New Roman" w:hAnsi="Times New Roman"/>
                 <w:b/>
-                <w:color w:val="FFFFFF"/>
-                <w:sz w:val="20"/>
+                <w:color w:val="000000"/>
+                <w:sz w:val="22"/>
               </w:rPr>
               <w:t>Year 2 (USD)</w:t>
             </w:r>
@@ -1911,7 +1655,6 @@
         <w:tc>
           <w:tcPr>
             <w:tcW w:type="dxa" w:w="2340"/>
-            <w:shd w:fill="E86C00" w:val="clear"/>
           </w:tcPr>
           <w:p>
             <w:pPr>
@@ -1922,8 +1665,8 @@
               <w:rPr>
                 <w:rFonts w:ascii="Times New Roman" w:hAnsi="Times New Roman"/>
                 <w:b/>
-                <w:color w:val="FFFFFF"/>
-                <w:sz w:val="20"/>
+                <w:color w:val="000000"/>
+                <w:sz w:val="22"/>
               </w:rPr>
               <w:t>Year 3 (USD)</w:t>
             </w:r>
@@ -1940,8 +1683,8 @@
             <w:r>
               <w:rPr>
                 <w:rFonts w:ascii="Times New Roman" w:hAnsi="Times New Roman"/>
-                <w:color w:val="333333"/>
-                <w:sz w:val="20"/>
+                <w:color w:val="000000"/>
+                <w:sz w:val="22"/>
               </w:rPr>
               <w:t>Facility Lease &amp; Renovation</w:t>
             </w:r>
@@ -1959,8 +1702,8 @@
             <w:r>
               <w:rPr>
                 <w:rFonts w:ascii="Times New Roman" w:hAnsi="Times New Roman"/>
-                <w:color w:val="333333"/>
-                <w:sz w:val="20"/>
+                <w:color w:val="000000"/>
+                <w:sz w:val="22"/>
               </w:rPr>
               <w:t>$180,000</w:t>
             </w:r>
@@ -1978,8 +1721,8 @@
             <w:r>
               <w:rPr>
                 <w:rFonts w:ascii="Times New Roman" w:hAnsi="Times New Roman"/>
-                <w:color w:val="333333"/>
-                <w:sz w:val="20"/>
+                <w:color w:val="000000"/>
+                <w:sz w:val="22"/>
               </w:rPr>
               <w:t>$140,000</w:t>
             </w:r>
@@ -1997,8 +1740,8 @@
             <w:r>
               <w:rPr>
                 <w:rFonts w:ascii="Times New Roman" w:hAnsi="Times New Roman"/>
-                <w:color w:val="333333"/>
-                <w:sz w:val="20"/>
+                <w:color w:val="000000"/>
+                <w:sz w:val="22"/>
               </w:rPr>
               <w:t>$120,000</w:t>
             </w:r>
@@ -2009,15 +1752,14 @@
         <w:tc>
           <w:tcPr>
             <w:tcW w:type="dxa" w:w="2340"/>
-            <w:shd w:fill="FFF3E6" w:val="clear"/>
           </w:tcPr>
           <w:p>
             <w:r/>
             <w:r>
               <w:rPr>
                 <w:rFonts w:ascii="Times New Roman" w:hAnsi="Times New Roman"/>
-                <w:color w:val="333333"/>
-                <w:sz w:val="20"/>
+                <w:color w:val="000000"/>
+                <w:sz w:val="22"/>
               </w:rPr>
               <w:t>Equipment &amp; Technology</w:t>
             </w:r>
@@ -2026,7 +1768,6 @@
         <w:tc>
           <w:tcPr>
             <w:tcW w:type="dxa" w:w="2340"/>
-            <w:shd w:fill="FFF3E6" w:val="clear"/>
           </w:tcPr>
           <w:p>
             <w:pPr>
@@ -2036,8 +1777,8 @@
             <w:r>
               <w:rPr>
                 <w:rFonts w:ascii="Times New Roman" w:hAnsi="Times New Roman"/>
-                <w:color w:val="333333"/>
-                <w:sz w:val="20"/>
+                <w:color w:val="000000"/>
+                <w:sz w:val="22"/>
               </w:rPr>
               <w:t>$95,000</w:t>
             </w:r>
@@ -2046,7 +1787,6 @@
         <w:tc>
           <w:tcPr>
             <w:tcW w:type="dxa" w:w="2340"/>
-            <w:shd w:fill="FFF3E6" w:val="clear"/>
           </w:tcPr>
           <w:p>
             <w:pPr>
@@ -2056,8 +1796,8 @@
             <w:r>
               <w:rPr>
                 <w:rFonts w:ascii="Times New Roman" w:hAnsi="Times New Roman"/>
-                <w:color w:val="333333"/>
-                <w:sz w:val="20"/>
+                <w:color w:val="000000"/>
+                <w:sz w:val="22"/>
               </w:rPr>
               <w:t>$60,000</w:t>
             </w:r>
@@ -2066,7 +1806,6 @@
         <w:tc>
           <w:tcPr>
             <w:tcW w:type="dxa" w:w="2340"/>
-            <w:shd w:fill="FFF3E6" w:val="clear"/>
           </w:tcPr>
           <w:p>
             <w:pPr>
@@ -2076,8 +1815,8 @@
             <w:r>
               <w:rPr>
                 <w:rFonts w:ascii="Times New Roman" w:hAnsi="Times New Roman"/>
-                <w:color w:val="333333"/>
-                <w:sz w:val="20"/>
+                <w:color w:val="000000"/>
+                <w:sz w:val="22"/>
               </w:rPr>
               <w:t>$45,000</w:t>
             </w:r>
@@ -2094,8 +1833,8 @@
             <w:r>
               <w:rPr>
                 <w:rFonts w:ascii="Times New Roman" w:hAnsi="Times New Roman"/>
-                <w:color w:val="333333"/>
-                <w:sz w:val="20"/>
+                <w:color w:val="000000"/>
+                <w:sz w:val="22"/>
               </w:rPr>
               <w:t>Staff Salaries &amp; Training</w:t>
             </w:r>
@@ -2113,8 +1852,8 @@
             <w:r>
               <w:rPr>
                 <w:rFonts w:ascii="Times New Roman" w:hAnsi="Times New Roman"/>
-                <w:color w:val="333333"/>
-                <w:sz w:val="20"/>
+                <w:color w:val="000000"/>
+                <w:sz w:val="22"/>
               </w:rPr>
               <w:t>$220,000</w:t>
             </w:r>
@@ -2132,8 +1871,8 @@
             <w:r>
               <w:rPr>
                 <w:rFonts w:ascii="Times New Roman" w:hAnsi="Times New Roman"/>
-                <w:color w:val="333333"/>
-                <w:sz w:val="20"/>
+                <w:color w:val="000000"/>
+                <w:sz w:val="22"/>
               </w:rPr>
               <w:t>$310,000</w:t>
             </w:r>
@@ -2151,8 +1890,8 @@
             <w:r>
               <w:rPr>
                 <w:rFonts w:ascii="Times New Roman" w:hAnsi="Times New Roman"/>
-                <w:color w:val="333333"/>
-                <w:sz w:val="20"/>
+                <w:color w:val="000000"/>
+                <w:sz w:val="22"/>
               </w:rPr>
               <w:t>$420,000</w:t>
             </w:r>
@@ -2163,15 +1902,14 @@
         <w:tc>
           <w:tcPr>
             <w:tcW w:type="dxa" w:w="2340"/>
-            <w:shd w:fill="FFF3E6" w:val="clear"/>
           </w:tcPr>
           <w:p>
             <w:r/>
             <w:r>
               <w:rPr>
                 <w:rFonts w:ascii="Times New Roman" w:hAnsi="Times New Roman"/>
-                <w:color w:val="333333"/>
-                <w:sz w:val="20"/>
+                <w:color w:val="000000"/>
+                <w:sz w:val="22"/>
               </w:rPr>
               <w:t>Digital Platform Development</w:t>
             </w:r>
@@ -2180,7 +1918,6 @@
         <w:tc>
           <w:tcPr>
             <w:tcW w:type="dxa" w:w="2340"/>
-            <w:shd w:fill="FFF3E6" w:val="clear"/>
           </w:tcPr>
           <w:p>
             <w:pPr>
@@ -2190,8 +1927,8 @@
             <w:r>
               <w:rPr>
                 <w:rFonts w:ascii="Times New Roman" w:hAnsi="Times New Roman"/>
-                <w:color w:val="333333"/>
-                <w:sz w:val="20"/>
+                <w:color w:val="000000"/>
+                <w:sz w:val="22"/>
               </w:rPr>
               <w:t>$150,000</w:t>
             </w:r>
@@ -2200,7 +1937,6 @@
         <w:tc>
           <w:tcPr>
             <w:tcW w:type="dxa" w:w="2340"/>
-            <w:shd w:fill="FFF3E6" w:val="clear"/>
           </w:tcPr>
           <w:p>
             <w:pPr>
@@ -2210,8 +1946,8 @@
             <w:r>
               <w:rPr>
                 <w:rFonts w:ascii="Times New Roman" w:hAnsi="Times New Roman"/>
-                <w:color w:val="333333"/>
-                <w:sz w:val="20"/>
+                <w:color w:val="000000"/>
+                <w:sz w:val="22"/>
               </w:rPr>
               <w:t>$80,000</w:t>
             </w:r>
@@ -2220,7 +1956,6 @@
         <w:tc>
           <w:tcPr>
             <w:tcW w:type="dxa" w:w="2340"/>
-            <w:shd w:fill="FFF3E6" w:val="clear"/>
           </w:tcPr>
           <w:p>
             <w:pPr>
@@ -2230,8 +1965,8 @@
             <w:r>
               <w:rPr>
                 <w:rFonts w:ascii="Times New Roman" w:hAnsi="Times New Roman"/>
-                <w:color w:val="333333"/>
-                <w:sz w:val="20"/>
+                <w:color w:val="000000"/>
+                <w:sz w:val="22"/>
               </w:rPr>
               <w:t>$60,000</w:t>
             </w:r>
@@ -2248,8 +1983,8 @@
             <w:r>
               <w:rPr>
                 <w:rFonts w:ascii="Times New Roman" w:hAnsi="Times New Roman"/>
-                <w:color w:val="333333"/>
-                <w:sz w:val="20"/>
+                <w:color w:val="000000"/>
+                <w:sz w:val="22"/>
               </w:rPr>
               <w:t>Marketing &amp; Promotion</w:t>
             </w:r>
@@ -2267,8 +2002,8 @@
             <w:r>
               <w:rPr>
                 <w:rFonts w:ascii="Times New Roman" w:hAnsi="Times New Roman"/>
-                <w:color w:val="333333"/>
-                <w:sz w:val="20"/>
+                <w:color w:val="000000"/>
+                <w:sz w:val="22"/>
               </w:rPr>
               <w:t>$120,000</w:t>
             </w:r>
@@ -2286,8 +2021,8 @@
             <w:r>
               <w:rPr>
                 <w:rFonts w:ascii="Times New Roman" w:hAnsi="Times New Roman"/>
-                <w:color w:val="333333"/>
-                <w:sz w:val="20"/>
+                <w:color w:val="000000"/>
+                <w:sz w:val="22"/>
               </w:rPr>
               <w:t>$160,000</w:t>
             </w:r>
@@ -2305,8 +2040,8 @@
             <w:r>
               <w:rPr>
                 <w:rFonts w:ascii="Times New Roman" w:hAnsi="Times New Roman"/>
-                <w:color w:val="333333"/>
-                <w:sz w:val="20"/>
+                <w:color w:val="000000"/>
+                <w:sz w:val="22"/>
               </w:rPr>
               <w:t>$200,000</w:t>
             </w:r>
@@ -2317,15 +2052,14 @@
         <w:tc>
           <w:tcPr>
             <w:tcW w:type="dxa" w:w="2340"/>
-            <w:shd w:fill="FFF3E6" w:val="clear"/>
           </w:tcPr>
           <w:p>
             <w:r/>
             <w:r>
               <w:rPr>
                 <w:rFonts w:ascii="Times New Roman" w:hAnsi="Times New Roman"/>
-                <w:color w:val="333333"/>
-                <w:sz w:val="20"/>
+                <w:color w:val="000000"/>
+                <w:sz w:val="22"/>
               </w:rPr>
               <w:t>Operations &amp; Administration</w:t>
             </w:r>
@@ -2334,7 +2068,6 @@
         <w:tc>
           <w:tcPr>
             <w:tcW w:type="dxa" w:w="2340"/>
-            <w:shd w:fill="FFF3E6" w:val="clear"/>
           </w:tcPr>
           <w:p>
             <w:pPr>
@@ -2344,8 +2077,8 @@
             <w:r>
               <w:rPr>
                 <w:rFonts w:ascii="Times New Roman" w:hAnsi="Times New Roman"/>
-                <w:color w:val="333333"/>
-                <w:sz w:val="20"/>
+                <w:color w:val="000000"/>
+                <w:sz w:val="22"/>
               </w:rPr>
               <w:t>$85,000</w:t>
             </w:r>
@@ -2354,7 +2087,6 @@
         <w:tc>
           <w:tcPr>
             <w:tcW w:type="dxa" w:w="2340"/>
-            <w:shd w:fill="FFF3E6" w:val="clear"/>
           </w:tcPr>
           <w:p>
             <w:pPr>
@@ -2364,8 +2096,8 @@
             <w:r>
               <w:rPr>
                 <w:rFonts w:ascii="Times New Roman" w:hAnsi="Times New Roman"/>
-                <w:color w:val="333333"/>
-                <w:sz w:val="20"/>
+                <w:color w:val="000000"/>
+                <w:sz w:val="22"/>
               </w:rPr>
               <w:t>$110,000</w:t>
             </w:r>
@@ -2374,7 +2106,6 @@
         <w:tc>
           <w:tcPr>
             <w:tcW w:type="dxa" w:w="2340"/>
-            <w:shd w:fill="FFF3E6" w:val="clear"/>
           </w:tcPr>
           <w:p>
             <w:pPr>
@@ -2384,8 +2115,8 @@
             <w:r>
               <w:rPr>
                 <w:rFonts w:ascii="Times New Roman" w:hAnsi="Times New Roman"/>
-                <w:color w:val="333333"/>
-                <w:sz w:val="20"/>
+                <w:color w:val="000000"/>
+                <w:sz w:val="22"/>
               </w:rPr>
               <w:t>$140,000</w:t>
             </w:r>
@@ -2402,8 +2133,8 @@
             <w:r>
               <w:rPr>
                 <w:rFonts w:ascii="Times New Roman" w:hAnsi="Times New Roman"/>
-                <w:color w:val="333333"/>
-                <w:sz w:val="20"/>
+                <w:color w:val="000000"/>
+                <w:sz w:val="22"/>
               </w:rPr>
               <w:t>Contingency Fund</w:t>
             </w:r>
@@ -2421,8 +2152,8 @@
             <w:r>
               <w:rPr>
                 <w:rFonts w:ascii="Times New Roman" w:hAnsi="Times New Roman"/>
-                <w:color w:val="333333"/>
-                <w:sz w:val="20"/>
+                <w:color w:val="000000"/>
+                <w:sz w:val="22"/>
               </w:rPr>
               <w:t>$50,000</w:t>
             </w:r>
@@ -2440,8 +2171,8 @@
             <w:r>
               <w:rPr>
                 <w:rFonts w:ascii="Times New Roman" w:hAnsi="Times New Roman"/>
-                <w:color w:val="333333"/>
-                <w:sz w:val="20"/>
+                <w:color w:val="000000"/>
+                <w:sz w:val="22"/>
               </w:rPr>
               <w:t>$45,000</w:t>
             </w:r>
@@ -2459,8 +2190,8 @@
             <w:r>
               <w:rPr>
                 <w:rFonts w:ascii="Times New Roman" w:hAnsi="Times New Roman"/>
-                <w:color w:val="333333"/>
-                <w:sz w:val="20"/>
+                <w:color w:val="000000"/>
+                <w:sz w:val="22"/>
               </w:rPr>
               <w:t>$40,000</w:t>
             </w:r>
@@ -2471,7 +2202,6 @@
         <w:tc>
           <w:tcPr>
             <w:tcW w:type="dxa" w:w="2340"/>
-            <w:shd w:fill="333333" w:val="clear"/>
           </w:tcPr>
           <w:p>
             <w:r/>
@@ -2479,8 +2209,8 @@
               <w:rPr>
                 <w:rFonts w:ascii="Times New Roman" w:hAnsi="Times New Roman"/>
                 <w:b/>
-                <w:color w:val="FFFFFF"/>
-                <w:sz w:val="20"/>
+                <w:color w:val="000000"/>
+                <w:sz w:val="22"/>
               </w:rPr>
               <w:t>Total Expenses</w:t>
             </w:r>
@@ -2489,16 +2219,18 @@
         <w:tc>
           <w:tcPr>
             <w:tcW w:type="dxa" w:w="2340"/>
-            <w:shd w:fill="333333" w:val="clear"/>
           </w:tcPr>
           <w:p>
+            <w:pPr>
+              <w:jc w:val="right"/>
+            </w:pPr>
             <w:r/>
             <w:r>
               <w:rPr>
                 <w:rFonts w:ascii="Times New Roman" w:hAnsi="Times New Roman"/>
                 <w:b/>
-                <w:color w:val="FFFFFF"/>
-                <w:sz w:val="20"/>
+                <w:color w:val="000000"/>
+                <w:sz w:val="22"/>
               </w:rPr>
               <w:t>$900,000</w:t>
             </w:r>
@@ -2507,16 +2239,18 @@
         <w:tc>
           <w:tcPr>
             <w:tcW w:type="dxa" w:w="2340"/>
-            <w:shd w:fill="333333" w:val="clear"/>
           </w:tcPr>
           <w:p>
+            <w:pPr>
+              <w:jc w:val="right"/>
+            </w:pPr>
             <w:r/>
             <w:r>
               <w:rPr>
                 <w:rFonts w:ascii="Times New Roman" w:hAnsi="Times New Roman"/>
                 <w:b/>
-                <w:color w:val="FFFFFF"/>
-                <w:sz w:val="20"/>
+                <w:color w:val="000000"/>
+                <w:sz w:val="22"/>
               </w:rPr>
               <w:t>$905,000</w:t>
             </w:r>
@@ -2525,16 +2259,18 @@
         <w:tc>
           <w:tcPr>
             <w:tcW w:type="dxa" w:w="2340"/>
-            <w:shd w:fill="333333" w:val="clear"/>
           </w:tcPr>
           <w:p>
+            <w:pPr>
+              <w:jc w:val="right"/>
+            </w:pPr>
             <w:r/>
             <w:r>
               <w:rPr>
                 <w:rFonts w:ascii="Times New Roman" w:hAnsi="Times New Roman"/>
                 <w:b/>
-                <w:color w:val="FFFFFF"/>
-                <w:sz w:val="20"/>
+                <w:color w:val="000000"/>
+                <w:sz w:val="22"/>
               </w:rPr>
               <w:t>$1,025,000</w:t>
             </w:r>
@@ -2544,29 +2280,28 @@
     </w:tbl>
     <w:p>
       <w:pPr>
-        <w:spacing w:after="160" w:before="0"/>
+        <w:spacing w:after="0" w:before="0" w:line="480" w:lineRule="exact"/>
         <w:jc w:val="left"/>
       </w:pPr>
       <w:r>
         <w:rPr>
           <w:rFonts w:ascii="Times New Roman" w:hAnsi="Times New Roman"/>
-          <w:b w:val="0"/>
-          <w:color w:val="333333"/>
-          <w:sz w:val="16"/>
+          <w:color w:val="000000"/>
+          <w:sz w:val="24"/>
         </w:rPr>
       </w:r>
     </w:p>
     <w:p>
       <w:pPr>
-        <w:spacing w:after="120" w:before="240"/>
+        <w:spacing w:after="0" w:before="240" w:line="480" w:lineRule="exact"/>
         <w:jc w:val="left"/>
       </w:pPr>
       <w:r>
         <w:rPr>
           <w:rFonts w:ascii="Times New Roman" w:hAnsi="Times New Roman"/>
           <w:b/>
-          <w:color w:val="333333"/>
-          <w:sz w:val="26"/>
+          <w:color w:val="000000"/>
+          <w:sz w:val="24"/>
         </w:rPr>
         <w:t>Projected Revenue</w:t>
       </w:r>
@@ -2588,7 +2323,6 @@
         <w:tc>
           <w:tcPr>
             <w:tcW w:type="dxa" w:w="2340"/>
-            <w:shd w:fill="2E86AB" w:val="clear"/>
           </w:tcPr>
           <w:p>
             <w:pPr>
@@ -2599,8 +2333,8 @@
               <w:rPr>
                 <w:rFonts w:ascii="Times New Roman" w:hAnsi="Times New Roman"/>
                 <w:b/>
-                <w:color w:val="FFFFFF"/>
-                <w:sz w:val="20"/>
+                <w:color w:val="000000"/>
+                <w:sz w:val="22"/>
               </w:rPr>
               <w:t>Revenue Stream</w:t>
             </w:r>
@@ -2609,7 +2343,6 @@
         <w:tc>
           <w:tcPr>
             <w:tcW w:type="dxa" w:w="2340"/>
-            <w:shd w:fill="2E86AB" w:val="clear"/>
           </w:tcPr>
           <w:p>
             <w:pPr>
@@ -2620,8 +2353,8 @@
               <w:rPr>
                 <w:rFonts w:ascii="Times New Roman" w:hAnsi="Times New Roman"/>
                 <w:b/>
-                <w:color w:val="FFFFFF"/>
-                <w:sz w:val="20"/>
+                <w:color w:val="000000"/>
+                <w:sz w:val="22"/>
               </w:rPr>
               <w:t>Year 1 (USD)</w:t>
             </w:r>
@@ -2630,7 +2363,6 @@
         <w:tc>
           <w:tcPr>
             <w:tcW w:type="dxa" w:w="2340"/>
-            <w:shd w:fill="2E86AB" w:val="clear"/>
           </w:tcPr>
           <w:p>
             <w:pPr>
@@ -2641,8 +2373,8 @@
               <w:rPr>
                 <w:rFonts w:ascii="Times New Roman" w:hAnsi="Times New Roman"/>
                 <w:b/>
-                <w:color w:val="FFFFFF"/>
-                <w:sz w:val="20"/>
+                <w:color w:val="000000"/>
+                <w:sz w:val="22"/>
               </w:rPr>
               <w:t>Year 2 (USD)</w:t>
             </w:r>
@@ -2651,7 +2383,6 @@
         <w:tc>
           <w:tcPr>
             <w:tcW w:type="dxa" w:w="2340"/>
-            <w:shd w:fill="2E86AB" w:val="clear"/>
           </w:tcPr>
           <w:p>
             <w:pPr>
@@ -2662,8 +2393,8 @@
               <w:rPr>
                 <w:rFonts w:ascii="Times New Roman" w:hAnsi="Times New Roman"/>
                 <w:b/>
-                <w:color w:val="FFFFFF"/>
-                <w:sz w:val="20"/>
+                <w:color w:val="000000"/>
+                <w:sz w:val="22"/>
               </w:rPr>
               <w:t>Year 3 (USD)</w:t>
             </w:r>
@@ -2680,8 +2411,8 @@
             <w:r>
               <w:rPr>
                 <w:rFonts w:ascii="Times New Roman" w:hAnsi="Times New Roman"/>
-                <w:color w:val="333333"/>
-                <w:sz w:val="20"/>
+                <w:color w:val="000000"/>
+                <w:sz w:val="22"/>
               </w:rPr>
               <w:t>Academy Memberships</w:t>
             </w:r>
@@ -2699,8 +2430,8 @@
             <w:r>
               <w:rPr>
                 <w:rFonts w:ascii="Times New Roman" w:hAnsi="Times New Roman"/>
-                <w:color w:val="333333"/>
-                <w:sz w:val="20"/>
+                <w:color w:val="000000"/>
+                <w:sz w:val="22"/>
               </w:rPr>
               <w:t>$180,000</w:t>
             </w:r>
@@ -2718,8 +2449,8 @@
             <w:r>
               <w:rPr>
                 <w:rFonts w:ascii="Times New Roman" w:hAnsi="Times New Roman"/>
-                <w:color w:val="333333"/>
-                <w:sz w:val="20"/>
+                <w:color w:val="000000"/>
+                <w:sz w:val="22"/>
               </w:rPr>
               <w:t>$420,000</w:t>
             </w:r>
@@ -2737,8 +2468,8 @@
             <w:r>
               <w:rPr>
                 <w:rFonts w:ascii="Times New Roman" w:hAnsi="Times New Roman"/>
-                <w:color w:val="333333"/>
-                <w:sz w:val="20"/>
+                <w:color w:val="000000"/>
+                <w:sz w:val="22"/>
               </w:rPr>
               <w:t>$720,000</w:t>
             </w:r>
@@ -2749,15 +2480,14 @@
         <w:tc>
           <w:tcPr>
             <w:tcW w:type="dxa" w:w="2340"/>
-            <w:shd w:fill="E6F4FA" w:val="clear"/>
           </w:tcPr>
           <w:p>
             <w:r/>
             <w:r>
               <w:rPr>
                 <w:rFonts w:ascii="Times New Roman" w:hAnsi="Times New Roman"/>
-                <w:color w:val="333333"/>
-                <w:sz w:val="20"/>
+                <w:color w:val="000000"/>
+                <w:sz w:val="22"/>
               </w:rPr>
               <w:t>Digital Platform Subscriptions</w:t>
             </w:r>
@@ -2766,7 +2496,6 @@
         <w:tc>
           <w:tcPr>
             <w:tcW w:type="dxa" w:w="2340"/>
-            <w:shd w:fill="E6F4FA" w:val="clear"/>
           </w:tcPr>
           <w:p>
             <w:pPr>
@@ -2776,8 +2505,8 @@
             <w:r>
               <w:rPr>
                 <w:rFonts w:ascii="Times New Roman" w:hAnsi="Times New Roman"/>
-                <w:color w:val="333333"/>
-                <w:sz w:val="20"/>
+                <w:color w:val="000000"/>
+                <w:sz w:val="22"/>
               </w:rPr>
               <w:t>$40,000</w:t>
             </w:r>
@@ -2786,7 +2515,6 @@
         <w:tc>
           <w:tcPr>
             <w:tcW w:type="dxa" w:w="2340"/>
-            <w:shd w:fill="E6F4FA" w:val="clear"/>
           </w:tcPr>
           <w:p>
             <w:pPr>
@@ -2796,8 +2524,8 @@
             <w:r>
               <w:rPr>
                 <w:rFonts w:ascii="Times New Roman" w:hAnsi="Times New Roman"/>
-                <w:color w:val="333333"/>
-                <w:sz w:val="20"/>
+                <w:color w:val="000000"/>
+                <w:sz w:val="22"/>
               </w:rPr>
               <w:t>$150,000</w:t>
             </w:r>
@@ -2806,7 +2534,6 @@
         <w:tc>
           <w:tcPr>
             <w:tcW w:type="dxa" w:w="2340"/>
-            <w:shd w:fill="E6F4FA" w:val="clear"/>
           </w:tcPr>
           <w:p>
             <w:pPr>
@@ -2816,8 +2543,8 @@
             <w:r>
               <w:rPr>
                 <w:rFonts w:ascii="Times New Roman" w:hAnsi="Times New Roman"/>
-                <w:color w:val="333333"/>
-                <w:sz w:val="20"/>
+                <w:color w:val="000000"/>
+                <w:sz w:val="22"/>
               </w:rPr>
               <w:t>$380,000</w:t>
             </w:r>
@@ -2834,8 +2561,8 @@
             <w:r>
               <w:rPr>
                 <w:rFonts w:ascii="Times New Roman" w:hAnsi="Times New Roman"/>
-                <w:color w:val="333333"/>
-                <w:sz w:val="20"/>
+                <w:color w:val="000000"/>
+                <w:sz w:val="22"/>
               </w:rPr>
               <w:t>Corporate Programs &amp; Events</w:t>
             </w:r>
@@ -2853,8 +2580,8 @@
             <w:r>
               <w:rPr>
                 <w:rFonts w:ascii="Times New Roman" w:hAnsi="Times New Roman"/>
-                <w:color w:val="333333"/>
-                <w:sz w:val="20"/>
+                <w:color w:val="000000"/>
+                <w:sz w:val="22"/>
               </w:rPr>
               <w:t>$60,000</w:t>
             </w:r>
@@ -2872,8 +2599,8 @@
             <w:r>
               <w:rPr>
                 <w:rFonts w:ascii="Times New Roman" w:hAnsi="Times New Roman"/>
-                <w:color w:val="333333"/>
-                <w:sz w:val="20"/>
+                <w:color w:val="000000"/>
+                <w:sz w:val="22"/>
               </w:rPr>
               <w:t>$130,000</w:t>
             </w:r>
@@ -2891,8 +2618,8 @@
             <w:r>
               <w:rPr>
                 <w:rFonts w:ascii="Times New Roman" w:hAnsi="Times New Roman"/>
-                <w:color w:val="333333"/>
-                <w:sz w:val="20"/>
+                <w:color w:val="000000"/>
+                <w:sz w:val="22"/>
               </w:rPr>
               <w:t>$230,000</w:t>
             </w:r>
@@ -2903,15 +2630,14 @@
         <w:tc>
           <w:tcPr>
             <w:tcW w:type="dxa" w:w="2340"/>
-            <w:shd w:fill="E6F4FA" w:val="clear"/>
           </w:tcPr>
           <w:p>
             <w:r/>
             <w:r>
               <w:rPr>
                 <w:rFonts w:ascii="Times New Roman" w:hAnsi="Times New Roman"/>
-                <w:color w:val="333333"/>
-                <w:sz w:val="20"/>
+                <w:color w:val="000000"/>
+                <w:sz w:val="22"/>
               </w:rPr>
               <w:t>Sponsorship &amp; Partnerships</w:t>
             </w:r>
@@ -2920,7 +2646,6 @@
         <w:tc>
           <w:tcPr>
             <w:tcW w:type="dxa" w:w="2340"/>
-            <w:shd w:fill="E6F4FA" w:val="clear"/>
           </w:tcPr>
           <w:p>
             <w:pPr>
@@ -2930,8 +2655,8 @@
             <w:r>
               <w:rPr>
                 <w:rFonts w:ascii="Times New Roman" w:hAnsi="Times New Roman"/>
-                <w:color w:val="333333"/>
-                <w:sz w:val="20"/>
+                <w:color w:val="000000"/>
+                <w:sz w:val="22"/>
               </w:rPr>
               <w:t>$40,000</w:t>
             </w:r>
@@ -2940,7 +2665,6 @@
         <w:tc>
           <w:tcPr>
             <w:tcW w:type="dxa" w:w="2340"/>
-            <w:shd w:fill="E6F4FA" w:val="clear"/>
           </w:tcPr>
           <w:p>
             <w:pPr>
@@ -2950,8 +2674,8 @@
             <w:r>
               <w:rPr>
                 <w:rFonts w:ascii="Times New Roman" w:hAnsi="Times New Roman"/>
-                <w:color w:val="333333"/>
-                <w:sz w:val="20"/>
+                <w:color w:val="000000"/>
+                <w:sz w:val="22"/>
               </w:rPr>
               <w:t>$80,000</w:t>
             </w:r>
@@ -2960,7 +2684,6 @@
         <w:tc>
           <w:tcPr>
             <w:tcW w:type="dxa" w:w="2340"/>
-            <w:shd w:fill="E6F4FA" w:val="clear"/>
           </w:tcPr>
           <w:p>
             <w:pPr>
@@ -2970,10 +2693,89 @@
             <w:r>
               <w:rPr>
                 <w:rFonts w:ascii="Times New Roman" w:hAnsi="Times New Roman"/>
-                <w:color w:val="333333"/>
-                <w:sz w:val="20"/>
+                <w:color w:val="000000"/>
+                <w:sz w:val="22"/>
               </w:rPr>
               <w:t>$120,000</w:t>
+            </w:r>
+          </w:p>
+        </w:tc>
+      </w:tr>
+      <w:tr>
+        <w:tc>
+          <w:tcPr>
+            <w:tcW w:type="dxa" w:w="2340"/>
+          </w:tcPr>
+          <w:p>
+            <w:r/>
+            <w:r>
+              <w:rPr>
+                <w:rFonts w:ascii="Times New Roman" w:hAnsi="Times New Roman"/>
+                <w:b/>
+                <w:color w:val="000000"/>
+                <w:sz w:val="22"/>
+              </w:rPr>
+              <w:t>Total Revenue</w:t>
+            </w:r>
+          </w:p>
+        </w:tc>
+        <w:tc>
+          <w:tcPr>
+            <w:tcW w:type="dxa" w:w="2340"/>
+          </w:tcPr>
+          <w:p>
+            <w:pPr>
+              <w:jc w:val="right"/>
+            </w:pPr>
+            <w:r/>
+            <w:r>
+              <w:rPr>
+                <w:rFonts w:ascii="Times New Roman" w:hAnsi="Times New Roman"/>
+                <w:b/>
+                <w:color w:val="000000"/>
+                <w:sz w:val="22"/>
+              </w:rPr>
+              <w:t>$320,000</w:t>
+            </w:r>
+          </w:p>
+        </w:tc>
+        <w:tc>
+          <w:tcPr>
+            <w:tcW w:type="dxa" w:w="2340"/>
+          </w:tcPr>
+          <w:p>
+            <w:pPr>
+              <w:jc w:val="right"/>
+            </w:pPr>
+            <w:r/>
+            <w:r>
+              <w:rPr>
+                <w:rFonts w:ascii="Times New Roman" w:hAnsi="Times New Roman"/>
+                <w:b/>
+                <w:color w:val="000000"/>
+                <w:sz w:val="22"/>
+              </w:rPr>
+              <w:t>$780,000</w:t>
+            </w:r>
+          </w:p>
+        </w:tc>
+        <w:tc>
+          <w:tcPr>
+            <w:tcW w:type="dxa" w:w="2340"/>
+          </w:tcPr>
+          <w:p>
+            <w:pPr>
+              <w:jc w:val="right"/>
+            </w:pPr>
+            <w:r/>
+            <w:r>
+              <w:rPr>
+                <w:rFonts w:ascii="Times New Roman" w:hAnsi="Times New Roman"/>
+                <w:b/>
+                <w:color w:val="000000"/>
+                <w:sz w:val="22"/>
+              </w:rPr>
+              <w:t>$1,450,000</w:t>
             </w:r>
           </w:p>
         </w:tc>
@@ -2981,45 +2783,42 @@
     </w:tbl>
     <w:p>
       <w:pPr>
-        <w:spacing w:after="80" w:before="0"/>
+        <w:spacing w:after="0" w:before="0" w:line="480" w:lineRule="exact"/>
         <w:jc w:val="left"/>
       </w:pPr>
       <w:r>
         <w:rPr>
           <w:rFonts w:ascii="Times New Roman" w:hAnsi="Times New Roman"/>
-          <w:b w:val="0"/>
-          <w:color w:val="333333"/>
-          <w:sz w:val="12"/>
+          <w:color w:val="000000"/>
+          <w:sz w:val="24"/>
         </w:rPr>
       </w:r>
     </w:p>
     <w:p>
       <w:pPr>
-        <w:spacing w:after="120" w:before="0"/>
+        <w:spacing w:after="0" w:before="0" w:line="480" w:lineRule="exact"/>
         <w:ind w:firstLine="720"/>
         <w:jc w:val="left"/>
       </w:pPr>
       <w:r>
         <w:rPr>
           <w:rFonts w:ascii="Times New Roman" w:hAnsi="Times New Roman"/>
-          <w:b w:val="0"/>
-          <w:color w:val="333333"/>
+          <w:color w:val="000000"/>
           <w:sz w:val="24"/>
         </w:rPr>
-        <w:t>Year 1 loses money. I expected that. You can't open three academies and build an app without burning through cash. But revenue ramps up quick. Somewhere around month 18, I break even. By Year 3, I're pulling in $1.45 million against about $1 million in costs. That's solid margin, and it gets better as the app scales because digital users don't require more facilities or proportionally more coaches.</w:t>
+        <w:t>Year 1 loses money. I expected that. You can't open three academies and build an app without burning through cash. But revenue ramps up quick. Somewhere around month 18, I break even. By Year 3, I'm pulling in $1.45 million against about $1 million in costs. That's solid margin, and it gets better as the app scales because digital users don't require more facilities or proportionally more coaches.</w:t>
       </w:r>
     </w:p>
     <w:p>
       <w:pPr>
-        <w:spacing w:after="40" w:before="0"/>
+        <w:spacing w:after="0" w:before="0" w:line="480" w:lineRule="exact"/>
         <w:jc w:val="left"/>
       </w:pPr>
       <w:r>
         <w:rPr>
           <w:rFonts w:ascii="Times New Roman" w:hAnsi="Times New Roman"/>
-          <w:b w:val="0"/>
-          <w:color w:val="333333"/>
-          <w:sz w:val="8"/>
+          <w:color w:val="000000"/>
+          <w:sz w:val="24"/>
         </w:rPr>
       </w:r>
     </w:p>
@@ -3030,7 +2829,7 @@
       <w:r>
         <w:drawing>
           <wp:inline xmlns:a="http://schemas.openxmlformats.org/drawingml/2006/main" xmlns:pic="http://schemas.openxmlformats.org/drawingml/2006/picture">
-            <wp:extent cx="5669280" cy="2137154"/>
+            <wp:extent cx="5029200" cy="1895863"/>
             <wp:docPr id="1" name="Picture 1"/>
             <wp:cNvGraphicFramePr>
               <a:graphicFrameLocks noChangeAspect="1"/>
@@ -3051,7 +2850,7 @@
                   <pic:spPr>
                     <a:xfrm>
                       <a:off x="0" y="0"/>
-                      <a:ext cx="5669280" cy="2137154"/>
+                      <a:ext cx="5029200" cy="1895863"/>
                     </a:xfrm>
                     <a:prstGeom prst="rect"/>
                   </pic:spPr>
@@ -3069,30 +2868,29 @@
     </w:p>
     <w:p>
       <w:pPr>
-        <w:spacing w:after="160" w:before="360"/>
-        <w:jc w:val="left"/>
+        <w:spacing w:after="0" w:before="240" w:line="480" w:lineRule="exact"/>
+        <w:jc w:val="center"/>
       </w:pPr>
       <w:r>
         <w:rPr>
           <w:rFonts w:ascii="Times New Roman" w:hAnsi="Times New Roman"/>
           <w:b/>
-          <w:color w:val="E86C00"/>
-          <w:sz w:val="32"/>
+          <w:color w:val="000000"/>
+          <w:sz w:val="24"/>
         </w:rPr>
         <w:t>Strategic Partnerships</w:t>
       </w:r>
     </w:p>
     <w:p>
       <w:pPr>
-        <w:spacing w:after="120" w:before="0"/>
+        <w:spacing w:after="0" w:before="0" w:line="480" w:lineRule="exact"/>
         <w:ind w:firstLine="720"/>
         <w:jc w:val="left"/>
       </w:pPr>
       <w:r>
         <w:rPr>
           <w:rFonts w:ascii="Times New Roman" w:hAnsi="Times New Roman"/>
-          <w:b w:val="0"/>
-          <w:color w:val="333333"/>
+          <w:color w:val="000000"/>
           <w:sz w:val="24"/>
         </w:rPr>
         <w:t>Trying to do everything myself would be slow, expensive, and kind of dumb when there are organizations out there that already have what I need. The smarter move is to partner up, trade value, and get to market faster. Five partnerships matter most.</w:t>
@@ -3100,30 +2898,29 @@
     </w:p>
     <w:p>
       <w:pPr>
-        <w:spacing w:after="120" w:before="240"/>
+        <w:spacing w:after="0" w:before="240" w:line="480" w:lineRule="exact"/>
         <w:jc w:val="left"/>
       </w:pPr>
       <w:r>
         <w:rPr>
           <w:rFonts w:ascii="Times New Roman" w:hAnsi="Times New Roman"/>
           <w:b/>
-          <w:color w:val="333333"/>
-          <w:sz w:val="26"/>
+          <w:color w:val="000000"/>
+          <w:sz w:val="24"/>
         </w:rPr>
         <w:t>NBA India</w:t>
       </w:r>
     </w:p>
     <w:p>
       <w:pPr>
-        <w:spacing w:after="120" w:before="0"/>
+        <w:spacing w:after="0" w:before="0" w:line="480" w:lineRule="exact"/>
         <w:ind w:firstLine="720"/>
         <w:jc w:val="left"/>
       </w:pPr>
       <w:r>
         <w:rPr>
           <w:rFonts w:ascii="Times New Roman" w:hAnsi="Times New Roman"/>
-          <w:b w:val="0"/>
-          <w:color w:val="333333"/>
+          <w:color w:val="000000"/>
           <w:sz w:val="24"/>
         </w:rPr>
         <w:t>This is the big one. The NBA's already spending money in India through the Academy, Jr. NBA programs, and broadcast deals. Getting recognized as an official NBA-affiliated training center would give me their coaching resources, their credibility, and access to their scouting pipeline. For a kid training at HoopRise, that means a real ladder: perform well, get noticed, maybe get a shot at the Academy or catch a scout's eye. No other training program in India can dangle that kind of carrot.</w:t>
@@ -3131,92 +2928,89 @@
     </w:p>
     <w:p>
       <w:pPr>
-        <w:spacing w:after="120" w:before="240"/>
+        <w:spacing w:after="0" w:before="240" w:line="480" w:lineRule="exact"/>
         <w:jc w:val="left"/>
       </w:pPr>
       <w:r>
         <w:rPr>
           <w:rFonts w:ascii="Times New Roman" w:hAnsi="Times New Roman"/>
           <w:b/>
-          <w:color w:val="333333"/>
-          <w:sz w:val="26"/>
+          <w:color w:val="000000"/>
+          <w:sz w:val="24"/>
         </w:rPr>
         <w:t>Nike India / Adidas India</w:t>
       </w:r>
     </w:p>
     <w:p>
       <w:pPr>
-        <w:spacing w:after="120" w:before="0"/>
+        <w:spacing w:after="0" w:before="0" w:line="480" w:lineRule="exact"/>
         <w:ind w:firstLine="720"/>
         <w:jc w:val="left"/>
       </w:pPr>
       <w:r>
         <w:rPr>
           <w:rFonts w:ascii="Times New Roman" w:hAnsi="Times New Roman"/>
-          <w:b w:val="0"/>
-          <w:color w:val="333333"/>
+          <w:color w:val="000000"/>
           <w:sz w:val="24"/>
         </w:rPr>
-        <w:t>Sportswear partnership gives me better prices on gear, co-branded marketing, and possibly scholarship funding. Nike's my first pick because of their basketball roots, but Adidas works too. For the brand, they get their products on the next generation of Indian basketball players in a market that's only going to get bigger. They spend millions trying to build that kind of ground-level brand loyalty through other channels. I're offering it built in.</w:t>
+        <w:t>Sportswear partnership gives me better prices on gear, co-branded marketing, and possibly scholarship funding. Nike's my first pick because of their basketball roots, but Adidas works too. For the brand, they get their products on the next generation of Indian basketball players in a market that's only going to get bigger. They spend millions trying to build that kind of ground-level brand loyalty through other channels. I'm offering it built in.</w:t>
       </w:r>
     </w:p>
     <w:p>
       <w:pPr>
-        <w:spacing w:after="120" w:before="240"/>
+        <w:spacing w:after="0" w:before="240" w:line="480" w:lineRule="exact"/>
         <w:jc w:val="left"/>
       </w:pPr>
       <w:r>
         <w:rPr>
           <w:rFonts w:ascii="Times New Roman" w:hAnsi="Times New Roman"/>
           <w:b/>
-          <w:color w:val="333333"/>
-          <w:sz w:val="26"/>
+          <w:color w:val="000000"/>
+          <w:sz w:val="24"/>
         </w:rPr>
         <w:t>Basketball Federation of India (BFI)</w:t>
       </w:r>
     </w:p>
     <w:p>
       <w:pPr>
-        <w:spacing w:after="120" w:before="0"/>
+        <w:spacing w:after="0" w:before="0" w:line="480" w:lineRule="exact"/>
         <w:ind w:firstLine="720"/>
         <w:jc w:val="left"/>
       </w:pPr>
       <w:r>
         <w:rPr>
           <w:rFonts w:ascii="Times New Roman" w:hAnsi="Times New Roman"/>
-          <w:b w:val="0"/>
-          <w:color w:val="333333"/>
+          <w:color w:val="000000"/>
           <w:sz w:val="24"/>
         </w:rPr>
-        <w:t>BFI accreditation gives me institutional credibility you can't buy. My players become eligible for state and national team selection. I get into BFI tournaments and coaching certification programs. For the BFI, I're doing the grassroots scouting and development they don't have the infrastructure to do themselves. Both sides get something they need.</w:t>
+        <w:t>BFI accreditation gives me institutional credibility you can't buy. My players become eligible for state and national team selection. I get into BFI tournaments and coaching certification programs. For the BFI, I'm doing the grassroots scouting and development they don't have the infrastructure to do themselves. Both sides get something they need.</w:t>
       </w:r>
     </w:p>
     <w:p>
       <w:pPr>
-        <w:spacing w:after="120" w:before="240"/>
+        <w:spacing w:after="0" w:before="240" w:line="480" w:lineRule="exact"/>
         <w:jc w:val="left"/>
       </w:pPr>
       <w:r>
         <w:rPr>
           <w:rFonts w:ascii="Times New Roman" w:hAnsi="Times New Roman"/>
           <w:b/>
-          <w:color w:val="333333"/>
-          <w:sz w:val="26"/>
+          <w:color w:val="000000"/>
+          <w:sz w:val="24"/>
         </w:rPr>
         <w:t>Indian School and University Networks</w:t>
       </w:r>
     </w:p>
     <w:p>
       <w:pPr>
-        <w:spacing w:after="120" w:before="0"/>
+        <w:spacing w:after="0" w:before="0" w:line="480" w:lineRule="exact"/>
         <w:ind w:firstLine="720"/>
         <w:jc w:val="left"/>
       </w:pPr>
       <w:r>
         <w:rPr>
           <w:rFonts w:ascii="Times New Roman" w:hAnsi="Times New Roman"/>
-          <w:b w:val="0"/>
-          <w:color w:val="333333"/>
+          <w:color w:val="000000"/>
           <w:sz w:val="24"/>
         </w:rPr>
         <w:t>Delhi Public School, Amity International, Ryan International. These school networks have campuses everywhere. Partnering with them means after-school programs on their facilities, discounted enrollment for their students, and inter-school tournaments I sponsor. Universities like Christ (Bangalore), Shiv Nadar (Delhi), and NMIMS (Mumbai) give me access to the 18-22 age bracket and potential internship pipelines for sports management students. It puts me right where my customers spend most of their day.</w:t>
@@ -3224,30 +3018,29 @@
     </w:p>
     <w:p>
       <w:pPr>
-        <w:spacing w:after="120" w:before="240"/>
+        <w:spacing w:after="0" w:before="240" w:line="480" w:lineRule="exact"/>
         <w:jc w:val="left"/>
       </w:pPr>
       <w:r>
         <w:rPr>
           <w:rFonts w:ascii="Times New Roman" w:hAnsi="Times New Roman"/>
           <w:b/>
-          <w:color w:val="333333"/>
-          <w:sz w:val="26"/>
+          <w:color w:val="000000"/>
+          <w:sz w:val="24"/>
         </w:rPr>
         <w:t>Technology Partners</w:t>
       </w:r>
     </w:p>
     <w:p>
       <w:pPr>
-        <w:spacing w:after="120" w:before="0"/>
+        <w:spacing w:after="0" w:before="0" w:line="480" w:lineRule="exact"/>
         <w:ind w:firstLine="720"/>
         <w:jc w:val="left"/>
       </w:pPr>
       <w:r>
         <w:rPr>
           <w:rFonts w:ascii="Times New Roman" w:hAnsi="Times New Roman"/>
-          <w:b w:val="0"/>
-          <w:color w:val="333333"/>
+          <w:color w:val="000000"/>
           <w:sz w:val="24"/>
         </w:rPr>
         <w:t>Good apps are expensive to build. Great apps even more so. Partnering with Indian IT companies like Infosys or Wipro for development, using AWS India's startup credits for hosting, and integrating tools from sports tech companies like ShotTracker keeps my costs manageable without sacrificing quality. When you're a startup trying to compete against polished international apps, you need the tech to be good. These partnerships make that possible without blowing through my budget.</w:t>
@@ -3260,28 +3053,28 @@
     </w:p>
     <w:p>
       <w:pPr>
-        <w:spacing w:after="160" w:before="360"/>
-        <w:jc w:val="left"/>
+        <w:spacing w:after="0" w:before="240" w:line="480" w:lineRule="exact"/>
+        <w:jc w:val="center"/>
       </w:pPr>
       <w:r>
         <w:rPr>
           <w:rFonts w:ascii="Times New Roman" w:hAnsi="Times New Roman"/>
           <w:b/>
-          <w:color w:val="E86C00"/>
-          <w:sz w:val="32"/>
+          <w:color w:val="000000"/>
+          <w:sz w:val="24"/>
         </w:rPr>
         <w:t>References</w:t>
       </w:r>
     </w:p>
     <w:p>
       <w:pPr>
-        <w:spacing w:after="160"/>
+        <w:spacing w:after="0" w:before="0" w:line="480" w:lineRule="exact"/>
         <w:ind w:left="720" w:hanging="720"/>
       </w:pPr>
       <w:r>
         <w:rPr>
           <w:rFonts w:ascii="Times New Roman" w:hAnsi="Times New Roman"/>
-          <w:color w:val="333333"/>
+          <w:color w:val="000000"/>
           <w:sz w:val="24"/>
         </w:rPr>
         <w:t>Deloitte. (2024). India's digital sports consumption: Trends and opportunities in a mobile-first market. Deloitte Touche Tohmatsu India LLP.</w:t>
@@ -3289,13 +3082,13 @@
     </w:p>
     <w:p>
       <w:pPr>
-        <w:spacing w:after="160"/>
+        <w:spacing w:after="0" w:before="0" w:line="480" w:lineRule="exact"/>
         <w:ind w:left="720" w:hanging="720"/>
       </w:pPr>
       <w:r>
         <w:rPr>
           <w:rFonts w:ascii="Times New Roman" w:hAnsi="Times New Roman"/>
-          <w:color w:val="333333"/>
+          <w:color w:val="000000"/>
           <w:sz w:val="24"/>
         </w:rPr>
         <w:t>KPMG. (2023). The business of sports: A comprehensive analysis of India's evolving sports industry landscape. KPMG India.</w:t>
@@ -3303,13 +3096,13 @@
     </w:p>
     <w:p>
       <w:pPr>
-        <w:spacing w:after="160"/>
+        <w:spacing w:after="0" w:before="0" w:line="480" w:lineRule="exact"/>
         <w:ind w:left="720" w:hanging="720"/>
       </w:pPr>
       <w:r>
         <w:rPr>
           <w:rFonts w:ascii="Times New Roman" w:hAnsi="Times New Roman"/>
-          <w:color w:val="333333"/>
+          <w:color w:val="000000"/>
           <w:sz w:val="24"/>
         </w:rPr>
         <w:t>National Basketball Association. (2024). NBA global outreach report: Expanding basketball culture in emerging markets. NBA Communications.</w:t>
@@ -3317,13 +3110,13 @@
     </w:p>
     <w:p>
       <w:pPr>
-        <w:spacing w:after="160"/>
+        <w:spacing w:after="0" w:before="0" w:line="480" w:lineRule="exact"/>
         <w:ind w:left="720" w:hanging="720"/>
       </w:pPr>
       <w:r>
         <w:rPr>
           <w:rFonts w:ascii="Times New Roman" w:hAnsi="Times New Roman"/>
-          <w:color w:val="333333"/>
+          <w:color w:val="000000"/>
           <w:sz w:val="24"/>
         </w:rPr>
         <w:t>Sports Authority of India. (2023). Khelo India annual report 2022-2023: Building a sporting nation through grassroots development. Ministry of Youth Affairs and Sports, Government of India.</w:t>
@@ -3331,13 +3124,13 @@
     </w:p>
     <w:p>
       <w:pPr>
-        <w:spacing w:after="160"/>
+        <w:spacing w:after="0" w:before="0" w:line="480" w:lineRule="exact"/>
         <w:ind w:left="720" w:hanging="720"/>
       </w:pPr>
       <w:r>
         <w:rPr>
           <w:rFonts w:ascii="Times New Roman" w:hAnsi="Times New Roman"/>
-          <w:color w:val="333333"/>
+          <w:color w:val="000000"/>
           <w:sz w:val="24"/>
         </w:rPr>
         <w:t>United Nations Department of Economic and Social Affairs. (2024). World population prospects 2024: India demographic profile summary. United Nations Publications.</w:t>
@@ -3718,7 +3511,7 @@
     <w:rsid w:val="00FC693F"/>
     <w:rPr>
       <w:rFonts w:ascii="Times New Roman" w:hAnsi="Times New Roman"/>
-      <w:color w:val="333333"/>
+      <w:color w:val="000000"/>
       <w:sz w:val="24"/>
     </w:rPr>
   </w:style>

</xml_diff>

<commit_message>
Format as 8-10 page paper with 1-page market research summary
Condensed market research to fit 1 page. Removed page breaks between
business plan sections so content flows continuously to hit 8-10 pages.
Kept cover page, tables, chart, and references on their own pages.

Co-Authored-By: Claude Sonnet 4.6 <noreply@anthropic.com>
Claude-Session: https://claude.ai/code/session_01W8zt99ZeTwqXi4zM9Nmp2S
</commit_message>
<xml_diff>
--- a/International_Sport_Business_Plan.docx
+++ b/International_Sport_Business_Plan.docx
@@ -148,17 +148,17 @@
     </w:p>
     <w:p>
       <w:pPr>
-        <w:spacing w:after="0" w:before="240" w:line="480" w:lineRule="exact"/>
+        <w:spacing w:after="0" w:before="0" w:line="480" w:lineRule="exact"/>
+        <w:ind w:firstLine="720"/>
         <w:jc w:val="left"/>
       </w:pPr>
       <w:r>
         <w:rPr>
           <w:rFonts w:ascii="Times New Roman" w:hAnsi="Times New Roman"/>
-          <w:b/>
           <w:color w:val="000000"/>
           <w:sz w:val="24"/>
         </w:rPr>
-        <w:t>Key Demographics and Market Size</w:t>
+        <w:t>India stands out as the strongest target market for a basketball training venture. With 1.44 billion people and roughly 65% of the population under age 35, it's one of the youngest countries on earth (United Nations, 2024). The sports industry sits at about $2.7 billion and is projected to reach $10 billion by 2030 (KPMG, 2023). The NBA already counts over 300 million fans in India, making it their second-largest market outside the U.S., yet there's almost no structured training infrastructure to serve that demand.</w:t>
       </w:r>
     </w:p>
     <w:p>
@@ -173,7 +173,7 @@
           <w:color w:val="000000"/>
           <w:sz w:val="24"/>
         </w:rPr>
-        <w:t>I looked at a bunch of different countries before settling on India. Southeast Asia came up, so did parts of Africa and a few spots in Eastern Europe. But once I actually sat down with the data on India, it wasn't even close. 1.44 billion people live there. Around 65% of them are under 35, and the median age is 28.4 (United Nations, 2024). That's not just a big market. That's an absurdly young country full of people at the exact age where they'd pick up a new sport if someone gave them the chance.</w:t>
+        <w:t>Consumer behavior backs this up. Cheap mobile data at $0.17 per GB has put smartphones in nearly every hand, and young Indians are consuming NBA highlights, fitness content, and sports media constantly (Deloitte, 2024). India's middle class has grown past 400 million, and these families are increasingly open to investing in their kids' athletic development alongside academics.</w:t>
       </w:r>
     </w:p>
     <w:p>
@@ -188,97 +188,7 @@
           <w:color w:val="000000"/>
           <w:sz w:val="24"/>
         </w:rPr>
-        <w:t>India's sports industry is worth about $2.7 billion today. Analysts think it'll hit $10 billion by 2030 (KPMG, 2023). And here's the number that really got me going: the NBA says it already has over 300 million fans in India. That makes India their second-largest market outside the States. 300 million people who care about basketball, and almost nowhere for them to actually learn how to play it properly. That disconnect is the whole reason HoopRise exists.</w:t>
-      </w:r>
-    </w:p>
-    <w:p>
-      <w:pPr>
-        <w:spacing w:after="0" w:before="240" w:line="480" w:lineRule="exact"/>
-        <w:jc w:val="left"/>
-      </w:pPr>
-      <w:r>
-        <w:rPr>
-          <w:rFonts w:ascii="Times New Roman" w:hAnsi="Times New Roman"/>
-          <w:b/>
-          <w:color w:val="000000"/>
-          <w:sz w:val="24"/>
-        </w:rPr>
-        <w:t>Consumer Behavior Trends</w:t>
-      </w:r>
-    </w:p>
-    <w:p>
-      <w:pPr>
-        <w:spacing w:after="0" w:before="0" w:line="480" w:lineRule="exact"/>
-        <w:ind w:firstLine="720"/>
-        <w:jc w:val="left"/>
-      </w:pPr>
-      <w:r>
-        <w:rPr>
-          <w:rFonts w:ascii="Times New Roman" w:hAnsi="Times New Roman"/>
-          <w:color w:val="000000"/>
-          <w:sz w:val="24"/>
-        </w:rPr>
-        <w:t>Young Indians today aren't like their parents. They're on Instagram at midnight watching Steph Curry highlights. They care about fitness. A lot of this traces back to how insanely cheap mobile data got in India, like $0.17 per GB cheap (Deloitte, 2024). Everyone has a smartphone now, and that means everyone's consuming sports content all the time.</w:t>
-      </w:r>
-    </w:p>
-    <w:p>
-      <w:pPr>
-        <w:spacing w:after="0" w:before="0" w:line="480" w:lineRule="exact"/>
-        <w:ind w:firstLine="720"/>
-        <w:jc w:val="left"/>
-      </w:pPr>
-      <w:r>
-        <w:rPr>
-          <w:rFonts w:ascii="Times New Roman" w:hAnsi="Times New Roman"/>
-          <w:color w:val="000000"/>
-          <w:sz w:val="24"/>
-        </w:rPr>
-        <w:t>On the parent side, India's middle class has blown up to over 400 million people. These families want their kids doing more than just sitting in tutoring classes after school. They're open to sports in a way that previous generations just weren't. And if anyone doubts whether Indians will get behind a well-packaged sport product, just look at what the IPL did for cricket. It printed money and built a cultural obsession at the same time. There's no reason basketball can't follow a similar path.</w:t>
-      </w:r>
-    </w:p>
-    <w:p>
-      <w:pPr>
-        <w:spacing w:after="0" w:before="240" w:line="480" w:lineRule="exact"/>
-        <w:jc w:val="left"/>
-      </w:pPr>
-      <w:r>
-        <w:rPr>
-          <w:rFonts w:ascii="Times New Roman" w:hAnsi="Times New Roman"/>
-          <w:b/>
-          <w:color w:val="000000"/>
-          <w:sz w:val="24"/>
-        </w:rPr>
-        <w:t>Opportunities and Challenges</w:t>
-      </w:r>
-    </w:p>
-    <w:p>
-      <w:pPr>
-        <w:spacing w:after="0" w:before="0" w:line="480" w:lineRule="exact"/>
-        <w:ind w:firstLine="720"/>
-        <w:jc w:val="left"/>
-      </w:pPr>
-      <w:r>
-        <w:rPr>
-          <w:rFonts w:ascii="Times New Roman" w:hAnsi="Times New Roman"/>
-          <w:color w:val="000000"/>
-          <w:sz w:val="24"/>
-        </w:rPr>
-        <w:t>The timing's good. The government's Khelo India program has dumped over $350 million into sports development. The NBA opened an academy in India in 2017, which means smart people with deep pockets already see what I see. And with 35% of the population living in cities now, there are concentrated areas of demand that a physical academy can actually serve.</w:t>
-      </w:r>
-    </w:p>
-    <w:p>
-      <w:pPr>
-        <w:spacing w:after="0" w:before="0" w:line="480" w:lineRule="exact"/>
-        <w:ind w:firstLine="720"/>
-        <w:jc w:val="left"/>
-      </w:pPr>
-      <w:r>
-        <w:rPr>
-          <w:rFonts w:ascii="Times New Roman" w:hAnsi="Times New Roman"/>
-          <w:color w:val="000000"/>
-          <w:sz w:val="24"/>
-        </w:rPr>
-        <w:t>That said, I'd be lying if I pretended there weren't real obstacles. Cricket isn't just popular in India. It's basically a religion. Basketball is fighting for attention against something that deeply embedded. Good indoor courts are tough to find outside the biggest metros, and even middle-class Indian families are pretty price-conscious, so the training can't cost a fortune. India also has 28 states with different regulations and cultural norms, so you can't just copy-paste one strategy across the whole country. I've factored all of that into the plan, but it'd be dishonest to pretend those challenges don't exist.</w:t>
+        <w:t>The opportunities are strong. The government's Khelo India program has invested over $350 million in grassroots sports, and the NBA opened its own academy in India in 2017. Urbanization is concentrating demand in major metros. The challenges are real too: cricket dominates the cultural landscape, quality indoor facilities are scarce, families are price-sensitive, and India's 28 states each have different regulations and norms. But the gap between basketball interest and basketball infrastructure creates a clear opening for a well-positioned training company.</w:t>
       </w:r>
     </w:p>
     <w:p>
@@ -344,11 +254,6 @@
           <w:sz w:val="24"/>
         </w:rPr>
         <w:t>The app is where things get exciting from a business standpoint. AI skill assessments, drill videos in multiple Indian languages, stat tracking, virtual coaching. If you're a kid in, say, Jaipur or Indore right now and you want real basketball coaching? Good luck. There's basically nothing. That's the gap I'm filling. The app makes quality training available to anyone with a phone, while the physical academies give the full experience to players in my three launch cities. Nobody else in India is doing both.</w:t>
-      </w:r>
-    </w:p>
-    <w:p>
-      <w:r>
-        <w:br w:type="page"/>
       </w:r>
     </w:p>
     <w:p>
@@ -1004,11 +909,6 @@
       </w:r>
     </w:p>
     <w:p>
-      <w:r>
-        <w:br w:type="page"/>
-      </w:r>
-    </w:p>
-    <w:p>
       <w:pPr>
         <w:spacing w:after="0" w:before="240" w:line="480" w:lineRule="exact"/>
         <w:jc w:val="center"/>
@@ -1219,11 +1119,6 @@
       </w:r>
     </w:p>
     <w:p>
-      <w:r>
-        <w:br w:type="page"/>
-      </w:r>
-    </w:p>
-    <w:p>
       <w:pPr>
         <w:spacing w:after="0" w:before="240" w:line="480" w:lineRule="exact"/>
         <w:jc w:val="center"/>
@@ -1374,11 +1269,6 @@
       </w:r>
     </w:p>
     <w:p>
-      <w:r>
-        <w:br w:type="page"/>
-      </w:r>
-    </w:p>
-    <w:p>
       <w:pPr>
         <w:spacing w:after="0" w:before="240" w:line="480" w:lineRule="exact"/>
         <w:jc w:val="center"/>
@@ -1526,11 +1416,6 @@
           <w:sz w:val="24"/>
         </w:rPr>
         <w:t>Online ads can only do so much. People need to experience the product. So I'm doing 3-on-3 street tournaments. Basketball camps during school breaks. Watch parties for the NBA Finals and All-Star Weekend. And once a year, a big event called the "HoopRise Rising Stars Challenge" that gets press, drives social media buzz, and gives the brand a signature moment. Long term, I want HoopRise to feel like the center of basketball culture in India. Not just a training academy, but the place where the basketball community actually gathers.</w:t>
-      </w:r>
-    </w:p>
-    <w:p>
-      <w:r>
-        <w:br w:type="page"/>
       </w:r>
     </w:p>
     <w:p>
@@ -2862,11 +2747,6 @@
       </w:r>
     </w:p>
     <w:p>
-      <w:r>
-        <w:br w:type="page"/>
-      </w:r>
-    </w:p>
-    <w:p>
       <w:pPr>
         <w:spacing w:after="0" w:before="240" w:line="480" w:lineRule="exact"/>
         <w:jc w:val="center"/>
@@ -3044,11 +2924,6 @@
           <w:sz w:val="24"/>
         </w:rPr>
         <w:t>Good apps are expensive to build. Great apps even more so. Partnering with Indian IT companies like Infosys or Wipro for development, using AWS India's startup credits for hosting, and integrating tools from sports tech companies like ShotTracker keeps my costs manageable without sacrificing quality. When you're a startup trying to compete against polished international apps, you need the tech to be good. These partnerships make that possible without blowing through my budget.</w:t>
-      </w:r>
-    </w:p>
-    <w:p>
-      <w:r>
-        <w:br w:type="page"/>
       </w:r>
     </w:p>
     <w:p>

</xml_diff>